<commit_message>
feat: lock Option A design point across firmware + Ch.3 + Ch.5
Decision: Option A (sim-faithful) + DRV8302 shield @ 40V (Path 1).
48V discrete (IRF540N + UCC21520) kept as future work.

vsg_controller.ino — full rewrite to Option A:
- Vdc=40, V_set=14, Lf=1.2mH, Cf=10uF (was 24V/1.47mH/27.6uF)
- swing law reverse-engineered + CSV-verified: f_ss=49.898 vs 49.896
- PI gains recomputed from phase5c formulas; SPWM (was SVPWM)
- f_sw 20kHz->10kHz bug fixed; ACS712-05B->20A (peak ~6.5A)
- recompute Iref/Itrip/thermal for Option A current levels

Ch.3 methodology — rewrite v2: BoM + design point + control summary
all coherent with sim + firmware; discrete/C2000 moved to future work.
Ch.5 §5.10 — marked RESOLVED (Option A locked).

Co-Authored-By: Claude Opus 4.8 <noreply@anthropic.com>
</commit_message>
<xml_diff>
--- a/docs/thesis/chapter3_methodology.docx
+++ b/docs/thesis/chapter3_methodology.docx
@@ -2,6 +2,32 @@
 <file path=word/document.xml><?xml version="1.0" encoding="utf-8"?>
 <w:document xmlns:w="http://schemas.openxmlformats.org/wordprocessingml/2006/main" xmlns:m="http://schemas.openxmlformats.org/officeDocument/2006/math" xmlns:r="http://schemas.openxmlformats.org/officeDocument/2006/relationships" xmlns:o="urn:schemas-microsoft-com:office:office" xmlns:v="urn:schemas-microsoft-com:vml" xmlns:w10="urn:schemas-microsoft-com:office:word" xmlns:a="http://schemas.openxmlformats.org/drawingml/2006/main" xmlns:pic="http://schemas.openxmlformats.org/drawingml/2006/picture" xmlns:wp="http://schemas.openxmlformats.org/drawingml/2006/wordprocessingDrawing">
   <w:body>
+    <w:sdt>
+      <w:sdtPr>
+        <w:docPartObj>
+          <w:docPartGallery w:val="Table of Contents"/>
+          <w:docPartUnique/>
+        </w:docPartObj>
+      </w:sdtPr>
+      <w:sdtContent>
+        <w:p>
+          <w:pPr>
+            <w:pStyle w:val="TOCHeading"/>
+          </w:pPr>
+          <w:r>
+            <w:t xml:space="preserve">Table of Contents</w:t>
+          </w:r>
+        </w:p>
+        <w:p>
+          <w:r>
+            <w:fldChar w:fldCharType="begin" w:dirty="true"/>
+            <w:instrText xml:space="preserve">TOC \o "1-3" \h \z \u</w:instrText>
+            <w:fldChar w:fldCharType="separate"/>
+            <w:fldChar w:fldCharType="end"/>
+          </w:r>
+        </w:p>
+      </w:sdtContent>
+    </w:sdt>
     <w:bookmarkStart w:id="9" w:name="บทท-3-วธดำเนนงานและการออกแบบ"/>
     <w:p>
       <w:pPr>
@@ -12,7 +38,7 @@
       </w:r>
     </w:p>
     <w:bookmarkEnd w:id="9"/>
-    <w:bookmarkStart w:id="23" w:name="methodology-system-design"/>
+    <w:bookmarkStart w:id="24" w:name="methodology-system-design"/>
     <w:p>
       <w:pPr>
         <w:pStyle w:val="Heading1"/>
@@ -52,7 +78,7 @@
         <w:t xml:space="preserve"> </w:t>
       </w:r>
       <w:r>
-        <w:t xml:space="preserve">Virtual Synchronous Generator (VSG) for Grid-Connected Inverter</w:t>
+        <w:t xml:space="preserve">Virtual Synchronous Generator (VSG) for Inverter Control</w:t>
       </w:r>
       <w:r>
         <w:t xml:space="preserve"> </w:t>
@@ -68,7 +94,146 @@
         <w:t xml:space="preserve"> </w:t>
       </w:r>
       <w:r>
-        <w:t xml:space="preserve">Draft v1 — เรียบเรียงใหม่จาก docx เดิม, แก้ heading hierarchy, เติม section 3.3.1 ที่ขาดหาย, แยก primary (ESP32 + 24 V/100 VA) ออกจาก contingency (C2000 + 48 V/GaN) อย่างชัดเจน</w:t>
+        <w:rPr>
+          <w:b/>
+          <w:bCs/>
+        </w:rPr>
+        <w:t xml:space="preserve">Rewrite v2 — 2026-05-30</w:t>
+      </w:r>
+      <w:r>
+        <w:t xml:space="preserve"> </w:t>
+      </w:r>
+      <w:r>
+        <w:t xml:space="preserve">เรียบเรียงใหม่ทั้งบทตามจุดออกแบบที่ล็อกแล้ว</w:t>
+      </w:r>
+      <w:r>
+        <w:t xml:space="preserve"> </w:t>
+      </w:r>
+      <w:r>
+        <w:rPr>
+          <w:b/>
+          <w:bCs/>
+        </w:rPr>
+        <w:t xml:space="preserve">Option A (sim-faithful):</w:t>
+      </w:r>
+      <w:r>
+        <w:t xml:space="preserve"> </w:t>
+      </w:r>
+      <w:r>
+        <w:t xml:space="preserve">DC bus 40 V, ESP32 + DRV8302 shield, 100 W,</w:t>
+      </w:r>
+      <w:r>
+        <w:t xml:space="preserve"> </w:t>
+      </w:r>
+      <m:oMath>
+        <m:sSub>
+          <m:e>
+            <m:r>
+              <m:t>L</m:t>
+            </m:r>
+          </m:e>
+          <m:sub>
+            <m:r>
+              <m:t>f</m:t>
+            </m:r>
+          </m:sub>
+        </m:sSub>
+      </m:oMath>
+      <w:r>
+        <w:t xml:space="preserve"> </w:t>
+      </w:r>
+      <w:r>
+        <w:t xml:space="preserve">1.2 mH /</w:t>
+      </w:r>
+      <w:r>
+        <w:t xml:space="preserve"> </w:t>
+      </w:r>
+      <m:oMath>
+        <m:sSub>
+          <m:e>
+            <m:r>
+              <m:t>C</m:t>
+            </m:r>
+          </m:e>
+          <m:sub>
+            <m:r>
+              <m:t>f</m:t>
+            </m:r>
+          </m:sub>
+        </m:sSub>
+      </m:oMath>
+      <w:r>
+        <w:t xml:space="preserve"> </w:t>
+      </w:r>
+      <w:r>
+        <w:t xml:space="preserve">10 µF /</w:t>
+      </w:r>
+      <w:r>
+        <w:t xml:space="preserve"> </w:t>
+      </w:r>
+      <m:oMath>
+        <m:sSub>
+          <m:e>
+            <m:r>
+              <m:t>R</m:t>
+            </m:r>
+          </m:e>
+          <m:sub>
+            <m:r>
+              <m:t>d</m:t>
+            </m:r>
+          </m:sub>
+        </m:sSub>
+      </m:oMath>
+      <w:r>
+        <w:t xml:space="preserve"> </w:t>
+      </w:r>
+      <w:r>
+        <w:t xml:space="preserve">1 Ω,</w:t>
+      </w:r>
+      <w:r>
+        <w:t xml:space="preserve"> </w:t>
+      </w:r>
+      <m:oMath>
+        <m:sSub>
+          <m:e>
+            <m:r>
+              <m:t>V</m:t>
+            </m:r>
+          </m:e>
+          <m:sub>
+            <m:r>
+              <m:t>s</m:t>
+            </m:r>
+            <m:r>
+              <m:t>e</m:t>
+            </m:r>
+            <m:r>
+              <m:t>t</m:t>
+            </m:r>
+          </m:sub>
+        </m:sSub>
+      </m:oMath>
+      <w:r>
+        <w:t xml:space="preserve"> </w:t>
+      </w:r>
+      <w:r>
+        <w:t xml:space="preserve">14 V peak — สอดคล้องกับแบบจำลอง Stage 5c (บทที่ 4) และเฟิร์มแวร์</w:t>
+      </w:r>
+      <w:r>
+        <w:t xml:space="preserve"> </w:t>
+      </w:r>
+      <w:r>
+        <w:rPr>
+          <w:rStyle w:val="VerbatimChar"/>
+        </w:rPr>
+        <w:t xml:space="preserve">vsg_controller.ino</w:t>
+      </w:r>
+      <w:r>
+        <w:t xml:space="preserve"> </w:t>
+      </w:r>
+      <w:r>
+        <w:t xml:space="preserve">ทุกค่า</w:t>
       </w:r>
     </w:p>
     <w:p>
@@ -83,7 +248,20 @@
         <w:pStyle w:val="FirstParagraph"/>
       </w:pPr>
       <w:r>
-        <w:t xml:space="preserve">ในการดำเนินโครงงานพัฒนาระบบเครื่องกำเนิดไฟฟ้าซิงโครนัสเสมือน (VSG) ควบคุมด้วยไมโครคอนโทรลเลอร์ ESP32 ขนาดพิกัด 100 VA นี้ ผู้ดำเนินโครงงานได้แบ่งขอบเขตและขั้นตอนการเตรียมอุปกรณ์และการดำเนินงานออกเป็นสามส่วนหลัก ได้แก่ (1) รายการวัสดุและอุปกรณ์ที่ใช้ในระบบหลัก, (2) ขั้นตอนการดำเนินงานวิจัย 6 ระยะ และ (3) แผนสำรองสถาปัตยกรรมประสิทธิภาพสูงสำหรับกรณีที่ระบบหลักไม่เพียงพอ</w:t>
+        <w:t xml:space="preserve">บทนี้นำเสนอวิธีดำเนินงานและการออกแบบระบบเครื่องกำเนิดไฟฟ้าซิงโครนัสเสมือน (VSG) ที่ควบคุมด้วยไมโครคอนโทรลเลอร์ ESP32 ในโหมดสร้างกริด (grid-forming / islanded) ล้วน ขนาดพิกัด 100 W บนบัสกระแสตรง 40 V โดยจุดออกแบบทั้งหมดในบทนี้เป็นจุดที่</w:t>
+      </w:r>
+      <w:r>
+        <w:rPr>
+          <w:b/>
+          <w:bCs/>
+        </w:rPr>
+        <w:t xml:space="preserve">ผ่านการตรวจสอบบนแบบจำลอง Stage 1–5c แล้ว</w:t>
+      </w:r>
+      <w:r>
+        <w:t xml:space="preserve"> </w:t>
+      </w:r>
+      <w:r>
+        <w:t xml:space="preserve">(ดูบทที่ 4) จึงรับประกันได้ว่าพารามิเตอร์ที่นำไปสร้างฮาร์ดแวร์มีพฤติกรรมที่ทำนายได้ เนื้อหาแบ่งเป็น (1) ภาพรวมและจุดออกแบบของระบบ (2) รายการวัสดุและอุปกรณ์ (3) ขั้นตอนการดำเนินงานวิจัย 6 ระยะ (4) สรุปการออกแบบระบบควบคุมที่เชื่อมโยงกับแบบจำลอง และ (5) แผนทางเลือกประสิทธิภาพสูงสำหรับงานต่อยอด</w:t>
       </w:r>
     </w:p>
     <w:p>
@@ -93,22 +271,22 @@
         </w:pict>
       </w:r>
     </w:p>
-    <w:bookmarkStart w:id="11" w:name="รายการวสดและอปกรณทคาดวาจะใช"/>
+    <w:bookmarkStart w:id="11" w:name="ภาพรวมและจดออกแบบของระบบ"/>
     <w:p>
       <w:pPr>
         <w:pStyle w:val="Heading2"/>
       </w:pPr>
       <w:r>
-        <w:t xml:space="preserve">3.1 รายการวัสดุและอุปกรณ์ที่คาดว่าจะใช้</w:t>
-      </w:r>
-    </w:p>
-    <w:bookmarkStart w:id="10" w:name="expected-materials-and-equipment-list"/>
+        <w:t xml:space="preserve">3.1 ภาพรวมและจุดออกแบบของระบบ</w:t>
+      </w:r>
+    </w:p>
+    <w:bookmarkStart w:id="10" w:name="system-overview-design-point"/>
     <w:p>
       <w:pPr>
         <w:pStyle w:val="Heading3"/>
       </w:pPr>
       <w:r>
-        <w:t xml:space="preserve">(Expected Materials and Equipment List)</w:t>
+        <w:t xml:space="preserve">(System Overview &amp; Design Point)</w:t>
       </w:r>
     </w:p>
     <w:p>
@@ -116,7 +294,23 @@
         <w:pStyle w:val="FirstParagraph"/>
       </w:pPr>
       <w:r>
-        <w:t xml:space="preserve">เพื่อรองรับการจัดสร้างต้นแบบระดับแรงดันต่ำที่ปลอดภัยสำหรับการทดลองในห้องปฏิบัติการ (24 V DC Bus, 100 VA) ผู้ดำเนินโครงงานได้กำหนดรายละเอียดของรายการชิ้นส่วนและเครื่องมือวัดที่คาดว่าจะใช้ในการดำเนินงาน ดังแสดงในตารางที่ 3.1</w:t>
+        <w:t xml:space="preserve">ระบบต้นแบบทำงานเป็นแหล่งจ่ายแรงดันสร้างกริด (grid-forming) ที่กำหนดความถี่ (</w:t>
+      </w:r>
+      <m:oMath>
+        <m:r>
+          <m:t>ω</m:t>
+        </m:r>
+      </m:oMath>
+      <w:r>
+        <w:t xml:space="preserve">) และแอมพลิจูดแรงดัน (</w:t>
+      </w:r>
+      <m:oMath>
+        <m:r>
+          <m:t>E</m:t>
+        </m:r>
+      </m:oMath>
+      <w:r>
+        <w:t xml:space="preserve">) ให้แก่โหลดสามเฟสแบบสแตนด์อะโลน โดยจำลองพฤติกรรมความเฉื่อยและการหน่วงของเครื่องกำเนิดซิงโครนัสจริงผ่านสมการสวิงที่คำนวณในเฟิร์มแวร์ เนื่องจากทำงานแบบเกาะตัวจึงไม่ต้องใช้ Phase-Locked Loop (PLL) หรือรีเลย์ซิงโครไนซ์ ลดทั้งต้นทุน ความซับซ้อน และความเสี่ยงด้านความปลอดภัย</w:t>
       </w:r>
     </w:p>
     <w:p>
@@ -134,7 +328,1064 @@
         <w:t xml:space="preserve"> </w:t>
       </w:r>
       <w:r>
-        <w:t xml:space="preserve">รายการวัสดุและอุปกรณ์สำหรับระบบควบคุมหลัก (ESP32, 24 V / 100 VA)</w:t>
+        <w:t xml:space="preserve">จุดออกแบบทางไฟฟ้าของระบบ (Option A — sim-faithful, ตรงกับ Stage 5c)</w:t>
+      </w:r>
+    </w:p>
+    <w:tbl>
+      <w:tblPr>
+        <w:tblStyle w:val="Table"/>
+        <w:tblW w:type="pct" w:w="5000"/>
+        <w:tblLayout w:type="fixed"/>
+        <w:tblLook w:firstRow="1" w:lastRow="0" w:firstColumn="0" w:lastColumn="0" w:noHBand="0" w:noVBand="0" w:val="0020"/>
+      </w:tblPr>
+      <w:tblGrid>
+        <w:gridCol w:w="1980"/>
+        <w:gridCol w:w="1980"/>
+        <w:gridCol w:w="1980"/>
+        <w:gridCol w:w="1980"/>
+      </w:tblGrid>
+      <w:tr>
+        <w:trPr>
+          <w:tblHeader w:val="on"/>
+        </w:trPr>
+        <w:tc>
+          <w:tcPr/>
+          <w:p>
+            <w:pPr>
+              <w:pStyle w:val="Compact"/>
+            </w:pPr>
+            <w:r>
+              <w:t xml:space="preserve">พารามิเตอร์</w:t>
+            </w:r>
+          </w:p>
+        </w:tc>
+        <w:tc>
+          <w:tcPr/>
+          <w:p>
+            <w:pPr>
+              <w:pStyle w:val="Compact"/>
+            </w:pPr>
+            <w:r>
+              <w:t xml:space="preserve">สัญลักษณ์</w:t>
+            </w:r>
+          </w:p>
+        </w:tc>
+        <w:tc>
+          <w:tcPr/>
+          <w:p>
+            <w:pPr>
+              <w:pStyle w:val="Compact"/>
+            </w:pPr>
+            <w:r>
+              <w:t xml:space="preserve">ค่า</w:t>
+            </w:r>
+          </w:p>
+        </w:tc>
+        <w:tc>
+          <w:tcPr/>
+          <w:p>
+            <w:pPr>
+              <w:pStyle w:val="Compact"/>
+            </w:pPr>
+            <w:r>
+              <w:t xml:space="preserve">หมายเหตุ</w:t>
+            </w:r>
+          </w:p>
+        </w:tc>
+      </w:tr>
+      <w:tr>
+        <w:tc>
+          <w:tcPr/>
+          <w:p>
+            <w:pPr>
+              <w:pStyle w:val="Compact"/>
+            </w:pPr>
+            <w:r>
+              <w:t xml:space="preserve">แรงดันบัสกระแสตรง</w:t>
+            </w:r>
+          </w:p>
+        </w:tc>
+        <w:tc>
+          <w:tcPr/>
+          <w:p>
+            <w:pPr>
+              <w:pStyle w:val="Compact"/>
+            </w:pPr>
+            <m:oMath>
+              <m:sSub>
+                <m:e>
+                  <m:r>
+                    <m:t>V</m:t>
+                  </m:r>
+                </m:e>
+                <m:sub>
+                  <m:r>
+                    <m:t>d</m:t>
+                  </m:r>
+                  <m:r>
+                    <m:t>c</m:t>
+                  </m:r>
+                </m:sub>
+              </m:sSub>
+            </m:oMath>
+          </w:p>
+        </w:tc>
+        <w:tc>
+          <w:tcPr/>
+          <w:p>
+            <w:pPr>
+              <w:pStyle w:val="Compact"/>
+            </w:pPr>
+            <w:r>
+              <w:t xml:space="preserve">40 V</w:t>
+            </w:r>
+          </w:p>
+        </w:tc>
+        <w:tc>
+          <w:tcPr/>
+          <w:p>
+            <w:pPr>
+              <w:pStyle w:val="Compact"/>
+            </w:pPr>
+            <w:r>
+              <w:t xml:space="preserve">DRV8302 พิกัดสูงสุด 60 V → derate 67% ปลอดภัย</w:t>
+            </w:r>
+          </w:p>
+        </w:tc>
+      </w:tr>
+      <w:tr>
+        <w:tc>
+          <w:tcPr/>
+          <w:p>
+            <w:pPr>
+              <w:pStyle w:val="Compact"/>
+            </w:pPr>
+            <w:r>
+              <w:t xml:space="preserve">แรงดันตั้งต้นแกน d</w:t>
+            </w:r>
+          </w:p>
+        </w:tc>
+        <w:tc>
+          <w:tcPr/>
+          <w:p>
+            <w:pPr>
+              <w:pStyle w:val="Compact"/>
+            </w:pPr>
+            <m:oMath>
+              <m:sSub>
+                <m:e>
+                  <m:r>
+                    <m:t>V</m:t>
+                  </m:r>
+                </m:e>
+                <m:sub>
+                  <m:r>
+                    <m:t>s</m:t>
+                  </m:r>
+                  <m:r>
+                    <m:t>e</m:t>
+                  </m:r>
+                  <m:r>
+                    <m:t>t</m:t>
+                  </m:r>
+                </m:sub>
+              </m:sSub>
+            </m:oMath>
+          </w:p>
+        </w:tc>
+        <w:tc>
+          <w:tcPr/>
+          <w:p>
+            <w:pPr>
+              <w:pStyle w:val="Compact"/>
+            </w:pPr>
+            <w:r>
+              <w:t xml:space="preserve">14 V (peak/phase)</w:t>
+            </w:r>
+          </w:p>
+        </w:tc>
+        <w:tc>
+          <w:tcPr/>
+          <w:p>
+            <w:pPr>
+              <w:pStyle w:val="Compact"/>
+            </w:pPr>
+            <w:r>
+              <w:t xml:space="preserve">ดัชนีมอดูเลชัน</w:t>
+            </w:r>
+            <w:r>
+              <w:t xml:space="preserve"> </w:t>
+            </w:r>
+            <m:oMath>
+              <m:r>
+                <m:t>m</m:t>
+              </m:r>
+              <m:r>
+                <m:rPr>
+                  <m:sty m:val="p"/>
+                </m:rPr>
+                <m:t>=</m:t>
+              </m:r>
+              <m:r>
+                <m:t>14</m:t>
+              </m:r>
+              <m:r>
+                <m:rPr>
+                  <m:sty m:val="p"/>
+                </m:rPr>
+                <m:t>/</m:t>
+              </m:r>
+              <m:r>
+                <m:rPr>
+                  <m:sty m:val="p"/>
+                </m:rPr>
+                <m:t>(</m:t>
+              </m:r>
+              <m:r>
+                <m:t>40</m:t>
+              </m:r>
+              <m:r>
+                <m:rPr>
+                  <m:sty m:val="p"/>
+                </m:rPr>
+                <m:t>/</m:t>
+              </m:r>
+              <m:r>
+                <m:t>2</m:t>
+              </m:r>
+              <m:r>
+                <m:rPr>
+                  <m:sty m:val="p"/>
+                </m:rPr>
+                <m:t>)</m:t>
+              </m:r>
+              <m:r>
+                <m:rPr>
+                  <m:sty m:val="p"/>
+                </m:rPr>
+                <m:t>=</m:t>
+              </m:r>
+              <m:r>
+                <m:t>0.70</m:t>
+              </m:r>
+            </m:oMath>
+            <w:r>
+              <w:t xml:space="preserve"> </w:t>
+            </w:r>
+            <w:r>
+              <w:t xml:space="preserve">(linear)</w:t>
+            </w:r>
+          </w:p>
+        </w:tc>
+      </w:tr>
+      <w:tr>
+        <w:tc>
+          <w:tcPr/>
+          <w:p>
+            <w:pPr>
+              <w:pStyle w:val="Compact"/>
+            </w:pPr>
+            <w:r>
+              <w:t xml:space="preserve">กำลังพิกัด 3 เฟส</w:t>
+            </w:r>
+          </w:p>
+        </w:tc>
+        <w:tc>
+          <w:tcPr/>
+          <w:p>
+            <w:pPr>
+              <w:pStyle w:val="Compact"/>
+            </w:pPr>
+            <m:oMath>
+              <m:sSub>
+                <m:e>
+                  <m:r>
+                    <m:t>P</m:t>
+                  </m:r>
+                </m:e>
+                <m:sub>
+                  <m:r>
+                    <m:t>b</m:t>
+                  </m:r>
+                  <m:r>
+                    <m:t>a</m:t>
+                  </m:r>
+                  <m:r>
+                    <m:t>s</m:t>
+                  </m:r>
+                  <m:r>
+                    <m:t>e</m:t>
+                  </m:r>
+                </m:sub>
+              </m:sSub>
+            </m:oMath>
+          </w:p>
+        </w:tc>
+        <w:tc>
+          <w:tcPr/>
+          <w:p>
+            <w:pPr>
+              <w:pStyle w:val="Compact"/>
+            </w:pPr>
+            <w:r>
+              <w:t xml:space="preserve">100 W</w:t>
+            </w:r>
+          </w:p>
+        </w:tc>
+        <w:tc>
+          <w:tcPr/>
+          <w:p>
+            <w:pPr>
+              <w:pStyle w:val="Compact"/>
+            </w:pPr>
+            <w:r>
+              <w:t xml:space="preserve">อยู่ในขอบเขต ≤ 300 W ของข้อเสนอ</w:t>
+            </w:r>
+          </w:p>
+        </w:tc>
+      </w:tr>
+      <w:tr>
+        <w:tc>
+          <w:tcPr/>
+          <w:p>
+            <w:pPr>
+              <w:pStyle w:val="Compact"/>
+            </w:pPr>
+            <w:r>
+              <w:t xml:space="preserve">ความถี่ฐาน</w:t>
+            </w:r>
+          </w:p>
+        </w:tc>
+        <w:tc>
+          <w:tcPr/>
+          <w:p>
+            <w:pPr>
+              <w:pStyle w:val="Compact"/>
+            </w:pPr>
+            <m:oMath>
+              <m:sSub>
+                <m:e>
+                  <m:r>
+                    <m:t>f</m:t>
+                  </m:r>
+                </m:e>
+                <m:sub>
+                  <m:r>
+                    <m:t>b</m:t>
+                  </m:r>
+                  <m:r>
+                    <m:t>a</m:t>
+                  </m:r>
+                  <m:r>
+                    <m:t>s</m:t>
+                  </m:r>
+                  <m:r>
+                    <m:t>e</m:t>
+                  </m:r>
+                </m:sub>
+              </m:sSub>
+            </m:oMath>
+          </w:p>
+        </w:tc>
+        <w:tc>
+          <w:tcPr/>
+          <w:p>
+            <w:pPr>
+              <w:pStyle w:val="Compact"/>
+            </w:pPr>
+            <w:r>
+              <w:t xml:space="preserve">50 Hz</w:t>
+            </w:r>
+          </w:p>
+        </w:tc>
+        <w:tc>
+          <w:tcPr/>
+          <w:p>
+            <w:pPr>
+              <w:pStyle w:val="Compact"/>
+            </w:pPr>
+            <m:oMath>
+              <m:sSub>
+                <m:e>
+                  <m:r>
+                    <m:t>ω</m:t>
+                  </m:r>
+                </m:e>
+                <m:sub>
+                  <m:r>
+                    <m:t>s</m:t>
+                  </m:r>
+                </m:sub>
+              </m:sSub>
+              <m:r>
+                <m:rPr>
+                  <m:sty m:val="p"/>
+                </m:rPr>
+                <m:t>=</m:t>
+              </m:r>
+              <m:r>
+                <m:t>314.159</m:t>
+              </m:r>
+            </m:oMath>
+            <w:r>
+              <w:t xml:space="preserve"> </w:t>
+            </w:r>
+            <w:r>
+              <w:t xml:space="preserve">rad/s</w:t>
+            </w:r>
+          </w:p>
+        </w:tc>
+      </w:tr>
+      <w:tr>
+        <w:tc>
+          <w:tcPr/>
+          <w:p>
+            <w:pPr>
+              <w:pStyle w:val="Compact"/>
+            </w:pPr>
+            <w:r>
+              <w:t xml:space="preserve">ตัวเหนี่ยวนำฟิลเตอร์</w:t>
+            </w:r>
+          </w:p>
+        </w:tc>
+        <w:tc>
+          <w:tcPr/>
+          <w:p>
+            <w:pPr>
+              <w:pStyle w:val="Compact"/>
+            </w:pPr>
+            <m:oMath>
+              <m:sSub>
+                <m:e>
+                  <m:r>
+                    <m:t>L</m:t>
+                  </m:r>
+                </m:e>
+                <m:sub>
+                  <m:r>
+                    <m:t>f</m:t>
+                  </m:r>
+                </m:sub>
+              </m:sSub>
+            </m:oMath>
+          </w:p>
+        </w:tc>
+        <w:tc>
+          <w:tcPr/>
+          <w:p>
+            <w:pPr>
+              <w:pStyle w:val="Compact"/>
+            </w:pPr>
+            <w:r>
+              <w:t xml:space="preserve">1.2 mH</w:t>
+            </w:r>
+          </w:p>
+        </w:tc>
+        <w:tc>
+          <w:tcPr/>
+          <w:p>
+            <w:pPr>
+              <w:pStyle w:val="Compact"/>
+            </w:pPr>
+            <w:r>
+              <w:t xml:space="preserve">ทนกระแส ≥ 10 A (พีคโหลด ~6.5 A)</w:t>
+            </w:r>
+          </w:p>
+        </w:tc>
+      </w:tr>
+      <w:tr>
+        <w:tc>
+          <w:tcPr/>
+          <w:p>
+            <w:pPr>
+              <w:pStyle w:val="Compact"/>
+            </w:pPr>
+            <w:r>
+              <w:t xml:space="preserve">ตัวเก็บประจุฟิลเตอร์</w:t>
+            </w:r>
+          </w:p>
+        </w:tc>
+        <w:tc>
+          <w:tcPr/>
+          <w:p>
+            <w:pPr>
+              <w:pStyle w:val="Compact"/>
+            </w:pPr>
+            <m:oMath>
+              <m:sSub>
+                <m:e>
+                  <m:r>
+                    <m:t>C</m:t>
+                  </m:r>
+                </m:e>
+                <m:sub>
+                  <m:r>
+                    <m:t>f</m:t>
+                  </m:r>
+                </m:sub>
+              </m:sSub>
+            </m:oMath>
+          </w:p>
+        </w:tc>
+        <w:tc>
+          <w:tcPr/>
+          <w:p>
+            <w:pPr>
+              <w:pStyle w:val="Compact"/>
+            </w:pPr>
+            <w:r>
+              <w:t xml:space="preserve">10 µF</w:t>
+            </w:r>
+          </w:p>
+        </w:tc>
+        <w:tc>
+          <w:tcPr/>
+          <w:p>
+            <w:pPr>
+              <w:pStyle w:val="Compact"/>
+            </w:pPr>
+            <m:oMath>
+              <m:sSub>
+                <m:e>
+                  <m:r>
+                    <m:t>f</m:t>
+                  </m:r>
+                </m:e>
+                <m:sub>
+                  <m:r>
+                    <m:t>r</m:t>
+                  </m:r>
+                  <m:r>
+                    <m:t>e</m:t>
+                  </m:r>
+                  <m:r>
+                    <m:t>s</m:t>
+                  </m:r>
+                </m:sub>
+              </m:sSub>
+              <m:r>
+                <m:rPr>
+                  <m:sty m:val="p"/>
+                </m:rPr>
+                <m:t>≈</m:t>
+              </m:r>
+              <m:r>
+                <m:t>1453</m:t>
+              </m:r>
+            </m:oMath>
+            <w:r>
+              <w:t xml:space="preserve"> </w:t>
+            </w:r>
+            <w:r>
+              <w:t xml:space="preserve">Hz</w:t>
+            </w:r>
+          </w:p>
+        </w:tc>
+      </w:tr>
+      <w:tr>
+        <w:tc>
+          <w:tcPr/>
+          <w:p>
+            <w:pPr>
+              <w:pStyle w:val="Compact"/>
+            </w:pPr>
+            <w:r>
+              <w:t xml:space="preserve">ตัวต้านทานหน่วง</w:t>
+            </w:r>
+          </w:p>
+        </w:tc>
+        <w:tc>
+          <w:tcPr/>
+          <w:p>
+            <w:pPr>
+              <w:pStyle w:val="Compact"/>
+            </w:pPr>
+            <m:oMath>
+              <m:sSub>
+                <m:e>
+                  <m:r>
+                    <m:t>R</m:t>
+                  </m:r>
+                </m:e>
+                <m:sub>
+                  <m:r>
+                    <m:t>d</m:t>
+                  </m:r>
+                </m:sub>
+              </m:sSub>
+            </m:oMath>
+          </w:p>
+        </w:tc>
+        <w:tc>
+          <w:tcPr/>
+          <w:p>
+            <w:pPr>
+              <w:pStyle w:val="Compact"/>
+            </w:pPr>
+            <w:r>
+              <w:t xml:space="preserve">1 Ω</w:t>
+            </w:r>
+          </w:p>
+        </w:tc>
+        <w:tc>
+          <w:tcPr/>
+          <w:p>
+            <w:pPr>
+              <w:pStyle w:val="Compact"/>
+            </w:pPr>
+            <w:r>
+              <w:t xml:space="preserve">อนุกรมกับ</w:t>
+            </w:r>
+            <w:r>
+              <w:t xml:space="preserve"> </w:t>
+            </w:r>
+            <m:oMath>
+              <m:sSub>
+                <m:e>
+                  <m:r>
+                    <m:t>C</m:t>
+                  </m:r>
+                </m:e>
+                <m:sub>
+                  <m:r>
+                    <m:t>f</m:t>
+                  </m:r>
+                </m:sub>
+              </m:sSub>
+            </m:oMath>
+            <w:r>
+              <w:t xml:space="preserve"> </w:t>
+            </w:r>
+            <w:r>
+              <w:t xml:space="preserve">(</w:t>
+            </w:r>
+            <m:oMath>
+              <m:r>
+                <m:t>ζ</m:t>
+              </m:r>
+              <m:r>
+                <m:rPr>
+                  <m:sty m:val="p"/>
+                </m:rPr>
+                <m:t>≈</m:t>
+              </m:r>
+              <m:r>
+                <m:t>0.046</m:t>
+              </m:r>
+            </m:oMath>
+            <w:r>
+              <w:t xml:space="preserve">)</w:t>
+            </w:r>
+          </w:p>
+        </w:tc>
+      </w:tr>
+      <w:tr>
+        <w:tc>
+          <w:tcPr/>
+          <w:p>
+            <w:pPr>
+              <w:pStyle w:val="Compact"/>
+            </w:pPr>
+            <w:r>
+              <w:t xml:space="preserve">ความถี่สวิตชิ่ง</w:t>
+            </w:r>
+          </w:p>
+        </w:tc>
+        <w:tc>
+          <w:tcPr/>
+          <w:p>
+            <w:pPr>
+              <w:pStyle w:val="Compact"/>
+            </w:pPr>
+            <m:oMath>
+              <m:sSub>
+                <m:e>
+                  <m:r>
+                    <m:t>f</m:t>
+                  </m:r>
+                </m:e>
+                <m:sub>
+                  <m:r>
+                    <m:t>s</m:t>
+                  </m:r>
+                  <m:r>
+                    <m:t>w</m:t>
+                  </m:r>
+                </m:sub>
+              </m:sSub>
+            </m:oMath>
+          </w:p>
+        </w:tc>
+        <w:tc>
+          <w:tcPr/>
+          <w:p>
+            <w:pPr>
+              <w:pStyle w:val="Compact"/>
+            </w:pPr>
+            <w:r>
+              <w:t xml:space="preserve">10 kHz</w:t>
+            </w:r>
+          </w:p>
+        </w:tc>
+        <w:tc>
+          <w:tcPr/>
+          <w:p>
+            <w:pPr>
+              <w:pStyle w:val="Compact"/>
+            </w:pPr>
+            <w:r>
+              <w:t xml:space="preserve">= อัตราลูปควบคุม</w:t>
+            </w:r>
+          </w:p>
+        </w:tc>
+      </w:tr>
+      <w:tr>
+        <w:tc>
+          <w:tcPr/>
+          <w:p>
+            <w:pPr>
+              <w:pStyle w:val="Compact"/>
+            </w:pPr>
+            <w:r>
+              <w:t xml:space="preserve">ความเฉื่อยเสมือน</w:t>
+            </w:r>
+          </w:p>
+        </w:tc>
+        <w:tc>
+          <w:tcPr/>
+          <w:p>
+            <w:pPr>
+              <w:pStyle w:val="Compact"/>
+            </w:pPr>
+            <m:oMath>
+              <m:r>
+                <m:t>H</m:t>
+              </m:r>
+            </m:oMath>
+          </w:p>
+        </w:tc>
+        <w:tc>
+          <w:tcPr/>
+          <w:p>
+            <w:pPr>
+              <w:pStyle w:val="Compact"/>
+            </w:pPr>
+            <w:r>
+              <w:t xml:space="preserve">5 s</w:t>
+            </w:r>
+          </w:p>
+        </w:tc>
+        <w:tc>
+          <w:tcPr/>
+          <w:p>
+            <w:pPr>
+              <w:pStyle w:val="Compact"/>
+            </w:pPr>
+            <w:r>
+              <w:t xml:space="preserve">จากการกวาด Stage 5b</w:t>
+            </w:r>
+          </w:p>
+        </w:tc>
+      </w:tr>
+      <w:tr>
+        <w:tc>
+          <w:tcPr/>
+          <w:p>
+            <w:pPr>
+              <w:pStyle w:val="Compact"/>
+            </w:pPr>
+            <w:r>
+              <w:t xml:space="preserve">การหน่วง</w:t>
+            </w:r>
+          </w:p>
+        </w:tc>
+        <w:tc>
+          <w:tcPr/>
+          <w:p>
+            <w:pPr>
+              <w:pStyle w:val="Compact"/>
+            </w:pPr>
+            <m:oMath>
+              <m:r>
+                <m:t>D</m:t>
+              </m:r>
+            </m:oMath>
+          </w:p>
+        </w:tc>
+        <w:tc>
+          <w:tcPr/>
+          <w:p>
+            <w:pPr>
+              <w:pStyle w:val="Compact"/>
+            </w:pPr>
+            <w:r>
+              <w:t xml:space="preserve">0.5</w:t>
+            </w:r>
+          </w:p>
+        </w:tc>
+        <w:tc>
+          <w:tcPr/>
+          <w:p>
+            <w:pPr>
+              <w:pStyle w:val="Compact"/>
+            </w:pPr>
+            <w:r>
+              <w:t xml:space="preserve">จากการกวาด Stage 5b</w:t>
+            </w:r>
+          </w:p>
+        </w:tc>
+      </w:tr>
+      <w:tr>
+        <w:tc>
+          <w:tcPr/>
+          <w:p>
+            <w:pPr>
+              <w:pStyle w:val="Compact"/>
+            </w:pPr>
+            <w:r>
+              <w:t xml:space="preserve">ดรูป P-f / Q-V</w:t>
+            </w:r>
+          </w:p>
+        </w:tc>
+        <w:tc>
+          <w:tcPr/>
+          <w:p>
+            <w:pPr>
+              <w:pStyle w:val="Compact"/>
+            </w:pPr>
+            <m:oMath>
+              <m:sSub>
+                <m:e>
+                  <m:r>
+                    <m:t>R</m:t>
+                  </m:r>
+                </m:e>
+                <m:sub>
+                  <m:r>
+                    <m:t>p</m:t>
+                  </m:r>
+                </m:sub>
+              </m:sSub>
+              <m:r>
+                <m:rPr>
+                  <m:sty m:val="p"/>
+                </m:rPr>
+                <m:t>,</m:t>
+              </m:r>
+              <m:sSub>
+                <m:e>
+                  <m:r>
+                    <m:t>R</m:t>
+                  </m:r>
+                </m:e>
+                <m:sub>
+                  <m:r>
+                    <m:t>q</m:t>
+                  </m:r>
+                </m:sub>
+              </m:sSub>
+            </m:oMath>
+          </w:p>
+        </w:tc>
+        <w:tc>
+          <w:tcPr/>
+          <w:p>
+            <w:pPr>
+              <w:pStyle w:val="Compact"/>
+            </w:pPr>
+            <w:r>
+              <w:t xml:space="preserve">0.05 / 0.05</w:t>
+            </w:r>
+          </w:p>
+        </w:tc>
+        <w:tc>
+          <w:tcPr/>
+          <w:p>
+            <w:pPr>
+              <w:pStyle w:val="Compact"/>
+            </w:pPr>
+            <w:r>
+              <w:t xml:space="preserve">ดรูป 5%</w:t>
+            </w:r>
+          </w:p>
+        </w:tc>
+      </w:tr>
+    </w:tbl>
+    <w:p>
+      <w:pPr>
+        <w:pStyle w:val="BlockText"/>
+      </w:pPr>
+      <w:r>
+        <w:rPr>
+          <w:b/>
+          <w:bCs/>
+        </w:rPr>
+        <w:t xml:space="preserve">ที่มาของจุดออกแบบ:</w:t>
+      </w:r>
+      <w:r>
+        <w:t xml:space="preserve"> </w:t>
+      </w:r>
+      <w:r>
+        <w:t xml:space="preserve">ค่า</w:t>
+      </w:r>
+      <w:r>
+        <w:t xml:space="preserve"> </w:t>
+      </w:r>
+      <m:oMath>
+        <m:sSub>
+          <m:e>
+            <m:r>
+              <m:t>V</m:t>
+            </m:r>
+          </m:e>
+          <m:sub>
+            <m:r>
+              <m:t>d</m:t>
+            </m:r>
+            <m:r>
+              <m:t>c</m:t>
+            </m:r>
+          </m:sub>
+        </m:sSub>
+        <m:r>
+          <m:rPr>
+            <m:sty m:val="p"/>
+          </m:rPr>
+          <m:t>=</m:t>
+        </m:r>
+        <m:r>
+          <m:t>40</m:t>
+        </m:r>
+      </m:oMath>
+      <w:r>
+        <w:t xml:space="preserve"> </w:t>
+      </w:r>
+      <w:r>
+        <w:t xml:space="preserve">V และ</w:t>
+      </w:r>
+      <w:r>
+        <w:t xml:space="preserve"> </w:t>
+      </w:r>
+      <m:oMath>
+        <m:sSub>
+          <m:e>
+            <m:r>
+              <m:t>V</m:t>
+            </m:r>
+          </m:e>
+          <m:sub>
+            <m:r>
+              <m:t>s</m:t>
+            </m:r>
+            <m:r>
+              <m:t>e</m:t>
+            </m:r>
+            <m:r>
+              <m:t>t</m:t>
+            </m:r>
+          </m:sub>
+        </m:sSub>
+        <m:r>
+          <m:rPr>
+            <m:sty m:val="p"/>
+          </m:rPr>
+          <m:t>=</m:t>
+        </m:r>
+        <m:r>
+          <m:t>14</m:t>
+        </m:r>
+      </m:oMath>
+      <w:r>
+        <w:t xml:space="preserve"> </w:t>
+      </w:r>
+      <w:r>
+        <w:t xml:space="preserve">V ถูกเลือกเพื่อหลีกเลี่ยง overmodulation (พบใน Stage 5a ที่ 24 V) พร้อมรักษาขอบเขตความปลอดภัยของบอร์ด DRV8302 ส่วน</w:t>
+      </w:r>
+      <w:r>
+        <w:t xml:space="preserve"> </w:t>
+      </w:r>
+      <m:oMath>
+        <m:r>
+          <m:t>H</m:t>
+        </m:r>
+        <m:r>
+          <m:rPr>
+            <m:sty m:val="p"/>
+          </m:rPr>
+          <m:t>=</m:t>
+        </m:r>
+        <m:r>
+          <m:t>5</m:t>
+        </m:r>
+        <m:r>
+          <m:rPr>
+            <m:sty m:val="p"/>
+          </m:rPr>
+          <m:t>,</m:t>
+        </m:r>
+        <m:r>
+          <m:t>D</m:t>
+        </m:r>
+        <m:r>
+          <m:rPr>
+            <m:sty m:val="p"/>
+          </m:rPr>
+          <m:t>=</m:t>
+        </m:r>
+        <m:r>
+          <m:t>0.5</m:t>
+        </m:r>
+      </m:oMath>
+      <w:r>
+        <w:t xml:space="preserve"> </w:t>
+      </w:r>
+      <w:r>
+        <w:t xml:space="preserve">เป็นจุดทำงานที่ดีที่สุดจากการกวาดพารามิเตอร์ 30 กรณีใน Stage 5b (RoCoF ต่ำ + เวลาเข้าที่ &lt; 0.5 s)</w:t>
+      </w:r>
+    </w:p>
+    <w:p>
+      <w:r>
+        <w:pict>
+          <v:rect style="width:0;height:1.5pt" o:hralign="center" o:hrstd="t" o:hr="t"/>
+        </w:pict>
+      </w:r>
+    </w:p>
+    <w:bookmarkEnd w:id="10"/>
+    <w:bookmarkEnd w:id="11"/>
+    <w:bookmarkStart w:id="13" w:name="รายการวสดและอปกรณ"/>
+    <w:p>
+      <w:pPr>
+        <w:pStyle w:val="Heading2"/>
+      </w:pPr>
+      <w:r>
+        <w:t xml:space="preserve">3.2 รายการวัสดุและอุปกรณ์</w:t>
+      </w:r>
+    </w:p>
+    <w:bookmarkStart w:id="12" w:name="bill-of-materials"/>
+    <w:p>
+      <w:pPr>
+        <w:pStyle w:val="Heading3"/>
+      </w:pPr>
+      <w:r>
+        <w:t xml:space="preserve">(Bill of Materials)</w:t>
+      </w:r>
+    </w:p>
+    <w:p>
+      <w:pPr>
+        <w:pStyle w:val="FirstParagraph"/>
+      </w:pPr>
+      <w:r>
+        <w:rPr>
+          <w:b/>
+          <w:bCs/>
+        </w:rPr>
+        <w:t xml:space="preserve">ตารางที่ 3.2</w:t>
+      </w:r>
+      <w:r>
+        <w:t xml:space="preserve"> </w:t>
+      </w:r>
+      <w:r>
+        <w:t xml:space="preserve">รายการวัสดุและอุปกรณ์สำหรับระบบ VSG islanded (ESP32 + DRV8302, 40 V / 100 W)</w:t>
       </w:r>
     </w:p>
     <w:tbl>
@@ -173,29 +1424,29 @@
               <w:pStyle w:val="Compact"/>
             </w:pPr>
             <w:r>
-              <w:t xml:space="preserve">รายการอุปกรณ์ / วัสดุ</w:t>
-            </w:r>
-          </w:p>
-        </w:tc>
-        <w:tc>
-          <w:tcPr/>
-          <w:p>
-            <w:pPr>
-              <w:pStyle w:val="Compact"/>
-            </w:pPr>
-            <w:r>
-              <w:t xml:space="preserve">รหัสพาร์ทชิ้นส่วน / ข้อมูลจำเพาะ</w:t>
-            </w:r>
-          </w:p>
-        </w:tc>
-        <w:tc>
-          <w:tcPr/>
-          <w:p>
-            <w:pPr>
-              <w:pStyle w:val="Compact"/>
-            </w:pPr>
-            <w:r>
-              <w:t xml:space="preserve">หน้าที่และขอบเขตการใช้งาน</w:t>
+              <w:t xml:space="preserve">รายการอุปกรณ์</w:t>
+            </w:r>
+          </w:p>
+        </w:tc>
+        <w:tc>
+          <w:tcPr/>
+          <w:p>
+            <w:pPr>
+              <w:pStyle w:val="Compact"/>
+            </w:pPr>
+            <w:r>
+              <w:t xml:space="preserve">รหัส / ข้อมูลจำเพาะ</w:t>
+            </w:r>
+          </w:p>
+        </w:tc>
+        <w:tc>
+          <w:tcPr/>
+          <w:p>
+            <w:pPr>
+              <w:pStyle w:val="Compact"/>
+            </w:pPr>
+            <w:r>
+              <w:t xml:space="preserve">หน้าที่</w:t>
             </w:r>
           </w:p>
         </w:tc>
@@ -252,18 +1503,18 @@
               <w:pStyle w:val="Compact"/>
             </w:pPr>
             <w:r>
-              <w:t xml:space="preserve">ประมวลผลอัลกอริทึมควบคุม VSG และสร้างสัญญาณ 3-Phase PWM</w:t>
-            </w:r>
-          </w:p>
-        </w:tc>
-        <w:tc>
-          <w:tcPr/>
-          <w:p>
-            <w:pPr>
-              <w:pStyle w:val="Compact"/>
-            </w:pPr>
-            <w:r>
-              <w:t xml:space="preserve">1 บอร์ด</w:t>
+              <w:t xml:space="preserve">รันอัลกอริทึม VSG + สร้าง 3-phase PWM ที่ 10 kHz</w:t>
+            </w:r>
+          </w:p>
+        </w:tc>
+        <w:tc>
+          <w:tcPr/>
+          <w:p>
+            <w:pPr>
+              <w:pStyle w:val="Compact"/>
+            </w:pPr>
+            <w:r>
+              <w:t xml:space="preserve">1</w:t>
             </w:r>
           </w:p>
         </w:tc>
@@ -298,29 +1549,29 @@
               <w:pStyle w:val="Compact"/>
             </w:pPr>
             <w:r>
-              <w:t xml:space="preserve">SimpleFOC / DRV8302 Shield</w:t>
-            </w:r>
-          </w:p>
-        </w:tc>
-        <w:tc>
-          <w:tcPr/>
-          <w:p>
-            <w:pPr>
-              <w:pStyle w:val="Compact"/>
-            </w:pPr>
-            <w:r>
-              <w:t xml:space="preserve">สวิตชิ่งกำลัง (Inverter Bridge) แปลงระดับแรงดัน DC เป็น AC</w:t>
-            </w:r>
-          </w:p>
-        </w:tc>
-        <w:tc>
-          <w:tcPr/>
-          <w:p>
-            <w:pPr>
-              <w:pStyle w:val="Compact"/>
-            </w:pPr>
-            <w:r>
-              <w:t xml:space="preserve">1 บอร์ด</w:t>
+              <w:t xml:space="preserve">DRV8302 MOSFET Shield (8–60 V, 30 A peak)</w:t>
+            </w:r>
+          </w:p>
+        </w:tc>
+        <w:tc>
+          <w:tcPr/>
+          <w:p>
+            <w:pPr>
+              <w:pStyle w:val="Compact"/>
+            </w:pPr>
+            <w:r>
+              <w:t xml:space="preserve">สวิตชิ่งกำลัง DC→AC, มี buck + current-sense + ป้องกันในตัว</w:t>
+            </w:r>
+          </w:p>
+        </w:tc>
+        <w:tc>
+          <w:tcPr/>
+          <w:p>
+            <w:pPr>
+              <w:pStyle w:val="Compact"/>
+            </w:pPr>
+            <w:r>
+              <w:t xml:space="preserve">1</w:t>
             </w:r>
           </w:p>
         </w:tc>
@@ -355,29 +1606,29 @@
               <w:pStyle w:val="Compact"/>
             </w:pPr>
             <w:r>
-              <w:t xml:space="preserve">โมดูลภายนอกชิป AD7606</w:t>
-            </w:r>
-          </w:p>
-        </w:tc>
-        <w:tc>
-          <w:tcPr/>
-          <w:p>
-            <w:pPr>
-              <w:pStyle w:val="Compact"/>
-            </w:pPr>
-            <w:r>
-              <w:t xml:space="preserve">แปลงสัญญาณกระแสและแรงดันเอาต์พุตพร้อมกัน 16-Bit ADC</w:t>
-            </w:r>
-          </w:p>
-        </w:tc>
-        <w:tc>
-          <w:tcPr/>
-          <w:p>
-            <w:pPr>
-              <w:pStyle w:val="Compact"/>
-            </w:pPr>
-            <w:r>
-              <w:t xml:space="preserve">1 บอร์ด</w:t>
+              <w:t xml:space="preserve">AD7606 (16-bit, 8-ch simultaneous, 200 kSPS)</w:t>
+            </w:r>
+          </w:p>
+        </w:tc>
+        <w:tc>
+          <w:tcPr/>
+          <w:p>
+            <w:pPr>
+              <w:pStyle w:val="Compact"/>
+            </w:pPr>
+            <w:r>
+              <w:t xml:space="preserve">แปลงสัญญาณ V/I พร้อมกัน ขจัด phase skew</w:t>
+            </w:r>
+          </w:p>
+        </w:tc>
+        <w:tc>
+          <w:tcPr/>
+          <w:p>
+            <w:pPr>
+              <w:pStyle w:val="Compact"/>
+            </w:pPr>
+            <w:r>
+              <w:t xml:space="preserve">1</w:t>
             </w:r>
           </w:p>
         </w:tc>
@@ -401,40 +1652,44 @@
               <w:pStyle w:val="Compact"/>
             </w:pPr>
             <w:r>
-              <w:t xml:space="preserve">เซ็นเซอร์อ่านกระแสไฟฟ้ารายเฟส</w:t>
-            </w:r>
-          </w:p>
-        </w:tc>
-        <w:tc>
-          <w:tcPr/>
-          <w:p>
-            <w:pPr>
-              <w:pStyle w:val="Compact"/>
-            </w:pPr>
-            <w:r>
-              <w:t xml:space="preserve">ACS712-05B (ย่านวัด ±5 A)</w:t>
-            </w:r>
-          </w:p>
-        </w:tc>
-        <w:tc>
-          <w:tcPr/>
-          <w:p>
-            <w:pPr>
-              <w:pStyle w:val="Compact"/>
-            </w:pPr>
-            <w:r>
-              <w:t xml:space="preserve">ตรวจวัดระดับกระแสเอาต์พุต AC แต่ละเฟสเพื่อใช้ประมวลผลลูปกระแส</w:t>
-            </w:r>
-          </w:p>
-        </w:tc>
-        <w:tc>
-          <w:tcPr/>
-          <w:p>
-            <w:pPr>
-              <w:pStyle w:val="Compact"/>
-            </w:pPr>
-            <w:r>
-              <w:t xml:space="preserve">3 ตัว</w:t>
+              <w:t xml:space="preserve">เซ็นเซอร์กระแสรายเฟส</w:t>
+            </w:r>
+          </w:p>
+        </w:tc>
+        <w:tc>
+          <w:tcPr/>
+          <w:p>
+            <w:pPr>
+              <w:pStyle w:val="Compact"/>
+            </w:pPr>
+            <w:r>
+              <w:rPr>
+                <w:b/>
+                <w:bCs/>
+              </w:rPr>
+              <w:t xml:space="preserve">ACS712-20A (±20 A, 100 mV/A)</w:t>
+            </w:r>
+          </w:p>
+        </w:tc>
+        <w:tc>
+          <w:tcPr/>
+          <w:p>
+            <w:pPr>
+              <w:pStyle w:val="Compact"/>
+            </w:pPr>
+            <w:r>
+              <w:t xml:space="preserve">วัดกระแสเอาต์พุต (พีคโหลด ~6.5 A → ต้องใช้ย่าน ±20 A)</w:t>
+            </w:r>
+          </w:p>
+        </w:tc>
+        <w:tc>
+          <w:tcPr/>
+          <w:p>
+            <w:pPr>
+              <w:pStyle w:val="Compact"/>
+            </w:pPr>
+            <w:r>
+              <w:t xml:space="preserve">3</w:t>
             </w:r>
           </w:p>
         </w:tc>
@@ -458,29 +1713,32 @@
               <w:pStyle w:val="Compact"/>
             </w:pPr>
             <w:r>
-              <w:t xml:space="preserve">ตัวเหนี่ยวนำวงจรกรอง (AC Filter)</w:t>
-            </w:r>
-          </w:p>
-        </w:tc>
-        <w:tc>
-          <w:tcPr/>
-          <w:p>
-            <w:pPr>
-              <w:pStyle w:val="Compact"/>
-            </w:pPr>
-            <w:r>
-              <w:t xml:space="preserve">1.5 mH, ทนกระแส ≥ 5 A, แกน Sendust</w:t>
-            </w:r>
-          </w:p>
-        </w:tc>
-        <w:tc>
-          <w:tcPr/>
-          <w:p>
-            <w:pPr>
-              <w:pStyle w:val="Compact"/>
-            </w:pPr>
-            <w:r>
-              <w:t xml:space="preserve">อุปกรณ์ตัวกรองฮาร์มอนิกฝั่งเอาต์พุต (</w:t>
+              <w:t xml:space="preserve">ตัวเหนี่ยวนำฟิลเตอร์</w:t>
+            </w:r>
+          </w:p>
+        </w:tc>
+        <w:tc>
+          <w:tcPr/>
+          <w:p>
+            <w:pPr>
+              <w:pStyle w:val="Compact"/>
+            </w:pPr>
+            <w:r>
+              <w:t xml:space="preserve">1.2 mH, ทนกระแส ≥ 10 A, แกน Sendust</w:t>
+            </w:r>
+          </w:p>
+        </w:tc>
+        <w:tc>
+          <w:tcPr/>
+          <w:p>
+            <w:pPr>
+              <w:pStyle w:val="Compact"/>
+            </w:pPr>
+            <w:r>
+              <w:t xml:space="preserve">ตัวกรองฮาร์มอนิก</w:t>
+            </w:r>
+            <w:r>
+              <w:t xml:space="preserve"> </w:t>
             </w:r>
             <m:oMath>
               <m:sSub>
@@ -497,18 +1755,21 @@
               </m:sSub>
             </m:oMath>
             <w:r>
-              <w:t xml:space="preserve">)</w:t>
-            </w:r>
-          </w:p>
-        </w:tc>
-        <w:tc>
-          <w:tcPr/>
-          <w:p>
-            <w:pPr>
-              <w:pStyle w:val="Compact"/>
-            </w:pPr>
-            <w:r>
-              <w:t xml:space="preserve">3 ตัว</w:t>
+              <w:t xml:space="preserve"> </w:t>
+            </w:r>
+            <w:r>
+              <w:t xml:space="preserve">(ห้ามใช้แกนเฟอร์ไรต์)</w:t>
+            </w:r>
+          </w:p>
+        </w:tc>
+        <w:tc>
+          <w:tcPr/>
+          <w:p>
+            <w:pPr>
+              <w:pStyle w:val="Compact"/>
+            </w:pPr>
+            <w:r>
+              <w:t xml:space="preserve">3</w:t>
             </w:r>
           </w:p>
         </w:tc>
@@ -532,29 +1793,32 @@
               <w:pStyle w:val="Compact"/>
             </w:pPr>
             <w:r>
-              <w:t xml:space="preserve">ตัวเก็บประจุวงจรกรอง (AC Filter)</w:t>
-            </w:r>
-          </w:p>
-        </w:tc>
-        <w:tc>
-          <w:tcPr/>
-          <w:p>
-            <w:pPr>
-              <w:pStyle w:val="Compact"/>
-            </w:pPr>
-            <w:r>
-              <w:t xml:space="preserve">15 µF AC Polypropylene</w:t>
-            </w:r>
-          </w:p>
-        </w:tc>
-        <w:tc>
-          <w:tcPr/>
-          <w:p>
-            <w:pPr>
-              <w:pStyle w:val="Compact"/>
-            </w:pPr>
-            <w:r>
-              <w:t xml:space="preserve">อุปกรณ์ตัวกรองฮาร์มอนิกฝั่งเอาต์พุต (</w:t>
+              <w:t xml:space="preserve">ตัวเก็บประจุฟิลเตอร์</w:t>
+            </w:r>
+          </w:p>
+        </w:tc>
+        <w:tc>
+          <w:tcPr/>
+          <w:p>
+            <w:pPr>
+              <w:pStyle w:val="Compact"/>
+            </w:pPr>
+            <w:r>
+              <w:t xml:space="preserve">10 µF, 100 V AC, โพลิโพรพิลีนฟิล์ม</w:t>
+            </w:r>
+          </w:p>
+        </w:tc>
+        <w:tc>
+          <w:tcPr/>
+          <w:p>
+            <w:pPr>
+              <w:pStyle w:val="Compact"/>
+            </w:pPr>
+            <w:r>
+              <w:t xml:space="preserve">ตัวกรองฮาร์มอนิก</w:t>
+            </w:r>
+            <w:r>
+              <w:t xml:space="preserve"> </w:t>
             </w:r>
             <m:oMath>
               <m:sSub>
@@ -571,18 +1835,21 @@
               </m:sSub>
             </m:oMath>
             <w:r>
-              <w:t xml:space="preserve">) ต่อขนาน 2 ตัวต่อเฟส</w:t>
-            </w:r>
-          </w:p>
-        </w:tc>
-        <w:tc>
-          <w:tcPr/>
-          <w:p>
-            <w:pPr>
-              <w:pStyle w:val="Compact"/>
-            </w:pPr>
-            <w:r>
-              <w:t xml:space="preserve">6 ตัว</w:t>
+              <w:t xml:space="preserve"> </w:t>
+            </w:r>
+            <w:r>
+              <w:t xml:space="preserve">(ห้ามใช้เซรามิก/อิเล็กโทรไลต์)</w:t>
+            </w:r>
+          </w:p>
+        </w:tc>
+        <w:tc>
+          <w:tcPr/>
+          <w:p>
+            <w:pPr>
+              <w:pStyle w:val="Compact"/>
+            </w:pPr>
+            <w:r>
+              <w:t xml:space="preserve">3</w:t>
             </w:r>
           </w:p>
         </w:tc>
@@ -606,7 +1873,7 @@
               <w:pStyle w:val="Compact"/>
             </w:pPr>
             <w:r>
-              <w:t xml:space="preserve">ตัวต้านทานจำกัดสั่นพ้องสะท้อน</w:t>
+              <w:t xml:space="preserve">ตัวต้านทานหน่วง</w:t>
             </w:r>
           </w:p>
         </w:tc>
@@ -628,7 +1895,10 @@
               <w:pStyle w:val="Compact"/>
             </w:pPr>
             <w:r>
-              <w:t xml:space="preserve">ต่ออนุกรมกับตัวเก็บประจุฟิลเตอร์เพื่อช่วยหน่วงเสถียรภาพ (</w:t>
+              <w:t xml:space="preserve">หน่วงเรโซแนนซ์ฟิลเตอร์</w:t>
+            </w:r>
+            <w:r>
+              <w:t xml:space="preserve"> </w:t>
             </w:r>
             <m:oMath>
               <m:sSub>
@@ -645,18 +1915,38 @@
               </m:sSub>
             </m:oMath>
             <w:r>
-              <w:t xml:space="preserve">)</w:t>
-            </w:r>
-          </w:p>
-        </w:tc>
-        <w:tc>
-          <w:tcPr/>
-          <w:p>
-            <w:pPr>
-              <w:pStyle w:val="Compact"/>
-            </w:pPr>
-            <w:r>
-              <w:t xml:space="preserve">3 ตัว</w:t>
+              <w:t xml:space="preserve"> </w:t>
+            </w:r>
+            <w:r>
+              <w:t xml:space="preserve">อนุกรมกับ</w:t>
+            </w:r>
+            <w:r>
+              <w:t xml:space="preserve"> </w:t>
+            </w:r>
+            <m:oMath>
+              <m:sSub>
+                <m:e>
+                  <m:r>
+                    <m:t>C</m:t>
+                  </m:r>
+                </m:e>
+                <m:sub>
+                  <m:r>
+                    <m:t>f</m:t>
+                  </m:r>
+                </m:sub>
+              </m:sSub>
+            </m:oMath>
+          </w:p>
+        </w:tc>
+        <w:tc>
+          <w:tcPr/>
+          <w:p>
+            <w:pPr>
+              <w:pStyle w:val="Compact"/>
+            </w:pPr>
+            <w:r>
+              <w:t xml:space="preserve">3</w:t>
             </w:r>
           </w:p>
         </w:tc>
@@ -680,29 +1970,29 @@
               <w:pStyle w:val="Compact"/>
             </w:pPr>
             <w:r>
-              <w:t xml:space="preserve">ชุดอุปกรณ์วัดแปรแรงดันไฟฟ้า</w:t>
-            </w:r>
-          </w:p>
-        </w:tc>
-        <w:tc>
-          <w:tcPr/>
-          <w:p>
-            <w:pPr>
-              <w:pStyle w:val="Compact"/>
-            </w:pPr>
-            <w:r>
-              <w:t xml:space="preserve">ตัวต้านทานฟิล์มโลหะคลาดเคลื่อน 0.1%</w:t>
-            </w:r>
-          </w:p>
-        </w:tc>
-        <w:tc>
-          <w:tcPr/>
-          <w:p>
-            <w:pPr>
-              <w:pStyle w:val="Compact"/>
-            </w:pPr>
-            <w:r>
-              <w:t xml:space="preserve">วงจรแบ่งแรงดัน (Voltage Divider) เพื่อลดทอนแรงดัน AC ก่อนเข้า ADC</w:t>
+              <w:t xml:space="preserve">ชุดแบ่งแรงดัน</w:t>
+            </w:r>
+          </w:p>
+        </w:tc>
+        <w:tc>
+          <w:tcPr/>
+          <w:p>
+            <w:pPr>
+              <w:pStyle w:val="Compact"/>
+            </w:pPr>
+            <w:r>
+              <w:t xml:space="preserve">ตัวต้านทานฟิล์มโลหะ 0.1% (15 kΩ / 5 kΩ) + 2.2 nF</w:t>
+            </w:r>
+          </w:p>
+        </w:tc>
+        <w:tc>
+          <w:tcPr/>
+          <w:p>
+            <w:pPr>
+              <w:pStyle w:val="Compact"/>
+            </w:pPr>
+            <w:r>
+              <w:t xml:space="preserve">ลดทอนแรงดัน AC ก่อนเข้า AD7606 (อัตราส่วน 4)</w:t>
             </w:r>
           </w:p>
         </w:tc>
@@ -737,40 +2027,44 @@
               <w:pStyle w:val="Compact"/>
             </w:pPr>
             <w:r>
-              <w:t xml:space="preserve">ชุดแบตเตอรี่สำรองบัสตรง</w:t>
-            </w:r>
-          </w:p>
-        </w:tc>
-        <w:tc>
-          <w:tcPr/>
-          <w:p>
-            <w:pPr>
-              <w:pStyle w:val="Compact"/>
-            </w:pPr>
-            <w:r>
-              <w:t xml:space="preserve">LiFePO4 Battery 24 V, 10 Ah</w:t>
-            </w:r>
-          </w:p>
-        </w:tc>
-        <w:tc>
-          <w:tcPr/>
-          <w:p>
-            <w:pPr>
-              <w:pStyle w:val="Compact"/>
-            </w:pPr>
-            <w:r>
-              <w:t xml:space="preserve">บัฟเฟอร์ดูดซับพลังงานไฟฟ้าไหลย้อนกลับขณะโหลดเปลี่ยนแปลง</w:t>
-            </w:r>
-          </w:p>
-        </w:tc>
-        <w:tc>
-          <w:tcPr/>
-          <w:p>
-            <w:pPr>
-              <w:pStyle w:val="Compact"/>
-            </w:pPr>
-            <w:r>
-              <w:t xml:space="preserve">1 ชุด</w:t>
+              <w:t xml:space="preserve">ชุดแบตเตอรี่บัสตรง</w:t>
+            </w:r>
+          </w:p>
+        </w:tc>
+        <w:tc>
+          <w:tcPr/>
+          <w:p>
+            <w:pPr>
+              <w:pStyle w:val="Compact"/>
+            </w:pPr>
+            <w:r>
+              <w:rPr>
+                <w:b/>
+                <w:bCs/>
+              </w:rPr>
+              <w:t xml:space="preserve">LiFePO4 12S ≈ 38.4 V, 10–20 Ah + BMS</w:t>
+            </w:r>
+          </w:p>
+        </w:tc>
+        <w:tc>
+          <w:tcPr/>
+          <w:p>
+            <w:pPr>
+              <w:pStyle w:val="Compact"/>
+            </w:pPr>
+            <w:r>
+              <w:t xml:space="preserve">บัฟเฟอร์ดูดซับกำลังไหลย้อนกลับ (regenerative)</w:t>
+            </w:r>
+          </w:p>
+        </w:tc>
+        <w:tc>
+          <w:tcPr/>
+          <w:p>
+            <w:pPr>
+              <w:pStyle w:val="Compact"/>
+            </w:pPr>
+            <w:r>
+              <w:t xml:space="preserve">1</w:t>
             </w:r>
           </w:p>
         </w:tc>
@@ -794,40 +2088,40 @@
               <w:pStyle w:val="Compact"/>
             </w:pPr>
             <w:r>
-              <w:t xml:space="preserve">แหล่งจ่ายกำลังไฟฟ้ากระแสตรง</w:t>
-            </w:r>
-          </w:p>
-        </w:tc>
-        <w:tc>
-          <w:tcPr/>
-          <w:p>
-            <w:pPr>
-              <w:pStyle w:val="Compact"/>
-            </w:pPr>
-            <w:r>
-              <w:t xml:space="preserve">DC Power Supply (0–60 V, 5 A)</w:t>
-            </w:r>
-          </w:p>
-        </w:tc>
-        <w:tc>
-          <w:tcPr/>
-          <w:p>
-            <w:pPr>
-              <w:pStyle w:val="Compact"/>
-            </w:pPr>
-            <w:r>
-              <w:t xml:space="preserve">แหล่งจ่ายพลังงานกระแสตรงหลักฝั่งป้อนเข้าอินเวอร์เตอร์</w:t>
-            </w:r>
-          </w:p>
-        </w:tc>
-        <w:tc>
-          <w:tcPr/>
-          <w:p>
-            <w:pPr>
-              <w:pStyle w:val="Compact"/>
-            </w:pPr>
-            <w:r>
-              <w:t xml:space="preserve">1 เครื่อง</w:t>
+              <w:t xml:space="preserve">แหล่งจ่ายกำลังกระแสตรง</w:t>
+            </w:r>
+          </w:p>
+        </w:tc>
+        <w:tc>
+          <w:tcPr/>
+          <w:p>
+            <w:pPr>
+              <w:pStyle w:val="Compact"/>
+            </w:pPr>
+            <w:r>
+              <w:t xml:space="preserve">DC Power Supply 0–60 V, 5 A (ตั้งที่ 40 V)</w:t>
+            </w:r>
+          </w:p>
+        </w:tc>
+        <w:tc>
+          <w:tcPr/>
+          <w:p>
+            <w:pPr>
+              <w:pStyle w:val="Compact"/>
+            </w:pPr>
+            <w:r>
+              <w:t xml:space="preserve">แหล่งจ่ายหลักฝั่งบัส DC</w:t>
+            </w:r>
+          </w:p>
+        </w:tc>
+        <w:tc>
+          <w:tcPr/>
+          <w:p>
+            <w:pPr>
+              <w:pStyle w:val="Compact"/>
+            </w:pPr>
+            <w:r>
+              <w:t xml:space="preserve">1</w:t>
             </w:r>
           </w:p>
         </w:tc>
@@ -851,80 +2145,159 @@
               <w:pStyle w:val="Compact"/>
             </w:pPr>
             <w:r>
-              <w:t xml:space="preserve">ระบบโหลดไฟฟ้ากระแสสลับ</w:t>
-            </w:r>
-          </w:p>
-        </w:tc>
-        <w:tc>
-          <w:tcPr/>
-          <w:p>
-            <w:pPr>
-              <w:pStyle w:val="Compact"/>
-            </w:pPr>
-            <w:r>
-              <w:t xml:space="preserve">Slide Rheostat (0–100 Ω, 200 W)</w:t>
-            </w:r>
-          </w:p>
-        </w:tc>
-        <w:tc>
-          <w:tcPr/>
-          <w:p>
-            <w:pPr>
-              <w:pStyle w:val="Compact"/>
-            </w:pPr>
-            <w:r>
-              <w:t xml:space="preserve">โหลดต้านทานแบบปรับค่าได้ ต่อแบบสตาร์ (Balanced-Y Load)</w:t>
-            </w:r>
-          </w:p>
-        </w:tc>
-        <w:tc>
-          <w:tcPr/>
-          <w:p>
-            <w:pPr>
-              <w:pStyle w:val="Compact"/>
-            </w:pPr>
-            <w:r>
-              <w:t xml:space="preserve">3 ตัว</w:t>
+              <w:t xml:space="preserve">TVS ป้องกันแรงดันเกินบัส</w:t>
+            </w:r>
+          </w:p>
+        </w:tc>
+        <w:tc>
+          <w:tcPr/>
+          <w:p>
+            <w:pPr>
+              <w:pStyle w:val="Compact"/>
+            </w:pPr>
+            <w:r>
+              <w:t xml:space="preserve">P6KE60A (60 V)</w:t>
+            </w:r>
+          </w:p>
+        </w:tc>
+        <w:tc>
+          <w:tcPr/>
+          <w:p>
+            <w:pPr>
+              <w:pStyle w:val="Compact"/>
+            </w:pPr>
+            <w:r>
+              <w:t xml:space="preserve">clamp ทรานเซียนต์สวิตชิ่งคร่อมขั้วบัส</w:t>
+            </w:r>
+          </w:p>
+        </w:tc>
+        <w:tc>
+          <w:tcPr/>
+          <w:p>
+            <w:pPr>
+              <w:pStyle w:val="Compact"/>
+            </w:pPr>
+            <w:r>
+              <w:t xml:space="preserve">1</w:t>
+            </w:r>
+          </w:p>
+        </w:tc>
+      </w:tr>
+      <w:tr>
+        <w:tc>
+          <w:tcPr/>
+          <w:p>
+            <w:pPr>
+              <w:pStyle w:val="Compact"/>
+            </w:pPr>
+            <w:r>
+              <w:t xml:space="preserve">12</w:t>
+            </w:r>
+          </w:p>
+        </w:tc>
+        <w:tc>
+          <w:tcPr/>
+          <w:p>
+            <w:pPr>
+              <w:pStyle w:val="Compact"/>
+            </w:pPr>
+            <w:r>
+              <w:t xml:space="preserve">ตัวต้านทาน pre-charge</w:t>
+            </w:r>
+          </w:p>
+        </w:tc>
+        <w:tc>
+          <w:tcPr/>
+          <w:p>
+            <w:pPr>
+              <w:pStyle w:val="Compact"/>
+            </w:pPr>
+            <w:r>
+              <w:t xml:space="preserve">10 Ω, 50 W</w:t>
+            </w:r>
+          </w:p>
+        </w:tc>
+        <w:tc>
+          <w:tcPr/>
+          <w:p>
+            <w:pPr>
+              <w:pStyle w:val="Compact"/>
+            </w:pPr>
+            <w:r>
+              <w:t xml:space="preserve">จำกัดกระแสกระชากตอนต่อบัส</w:t>
+            </w:r>
+          </w:p>
+        </w:tc>
+        <w:tc>
+          <w:tcPr/>
+          <w:p>
+            <w:pPr>
+              <w:pStyle w:val="Compact"/>
+            </w:pPr>
+            <w:r>
+              <w:t xml:space="preserve">1</w:t>
+            </w:r>
+          </w:p>
+        </w:tc>
+      </w:tr>
+      <w:tr>
+        <w:tc>
+          <w:tcPr/>
+          <w:p>
+            <w:pPr>
+              <w:pStyle w:val="Compact"/>
+            </w:pPr>
+            <w:r>
+              <w:t xml:space="preserve">13</w:t>
+            </w:r>
+          </w:p>
+        </w:tc>
+        <w:tc>
+          <w:tcPr/>
+          <w:p>
+            <w:pPr>
+              <w:pStyle w:val="Compact"/>
+            </w:pPr>
+            <w:r>
+              <w:t xml:space="preserve">โหลดไฟฟ้ากระแสสลับ</w:t>
+            </w:r>
+          </w:p>
+        </w:tc>
+        <w:tc>
+          <w:tcPr/>
+          <w:p>
+            <w:pPr>
+              <w:pStyle w:val="Compact"/>
+            </w:pPr>
+            <w:r>
+              <w:t xml:space="preserve">Slide Rheostat 0–100 Ω, 200 W</w:t>
+            </w:r>
+          </w:p>
+        </w:tc>
+        <w:tc>
+          <w:tcPr/>
+          <w:p>
+            <w:pPr>
+              <w:pStyle w:val="Compact"/>
+            </w:pPr>
+            <w:r>
+              <w:t xml:space="preserve">โหลดต้านทานปรับค่าได้ ต่อแบบสตาร์สมดุล</w:t>
+            </w:r>
+          </w:p>
+        </w:tc>
+        <w:tc>
+          <w:tcPr/>
+          <w:p>
+            <w:pPr>
+              <w:pStyle w:val="Compact"/>
+            </w:pPr>
+            <w:r>
+              <w:t xml:space="preserve">3</w:t>
             </w:r>
           </w:p>
         </w:tc>
       </w:tr>
     </w:tbl>
-    <w:p>
-      <w:r>
-        <w:pict>
-          <v:rect style="width:0;height:1.5pt" o:hralign="center" o:hrstd="t" o:hr="t"/>
-        </w:pict>
-      </w:r>
-    </w:p>
-    <w:bookmarkEnd w:id="10"/>
-    <w:bookmarkEnd w:id="11"/>
-    <w:bookmarkStart w:id="14" w:name="ขนตอนการดำเนนงานวจย"/>
-    <w:p>
-      <w:pPr>
-        <w:pStyle w:val="Heading2"/>
-      </w:pPr>
-      <w:r>
-        <w:t xml:space="preserve">3.2 ขั้นตอนการดำเนินงานวิจัย</w:t>
-      </w:r>
-    </w:p>
-    <w:bookmarkStart w:id="12" w:name="research-methodology-workflow"/>
-    <w:p>
-      <w:pPr>
-        <w:pStyle w:val="Heading3"/>
-      </w:pPr>
-      <w:r>
-        <w:t xml:space="preserve">(Research Methodology Workflow)</w:t>
-      </w:r>
-    </w:p>
-    <w:p>
-      <w:pPr>
-        <w:pStyle w:val="FirstParagraph"/>
-      </w:pPr>
-      <w:r>
-        <w:t xml:space="preserve">แผนผังขั้นตอนการดำเนินงานวิจัยที่เสนอแบ่งออกเป็น 6 ระยะหลัก เริ่มตั้งแต่การศึกษาทฤษฎีไปจนถึงการวิเคราะห์สรุปผล เพื่อให้การพัฒนาโครงงานเป็นระบบและสามารถติดตามความก้าวหน้าได้จริง ดังแสดงในรูปที่ 3.1</w:t>
-      </w:r>
-    </w:p>
     <w:p>
       <w:pPr>
         <w:pStyle w:val="BlockText"/>
@@ -934,7 +2307,101 @@
           <w:b/>
           <w:bCs/>
         </w:rPr>
-        <w:t xml:space="preserve">[TODO: รูปที่ 3.1 — แผนผังขั้นตอนการดำเนินงานวิจัย 6 ระยะ]</w:t>
+        <w:t xml:space="preserve">หมายเหตุการเปลี่ยนแปลงจาก v1 (24 V):</w:t>
+      </w:r>
+      <w:r>
+        <w:t xml:space="preserve"> </w:t>
+      </w:r>
+      <w:r>
+        <w:t xml:space="preserve">(ก) เซ็นเซอร์กระแสเปลี่ยน 05B→20A เพราะกระแสพีค Option A สูงขึ้น (~6.5 A) (ข)</w:t>
+      </w:r>
+      <w:r>
+        <w:t xml:space="preserve"> </w:t>
+      </w:r>
+      <m:oMath>
+        <m:sSub>
+          <m:e>
+            <m:r>
+              <m:t>L</m:t>
+            </m:r>
+          </m:e>
+          <m:sub>
+            <m:r>
+              <m:t>f</m:t>
+            </m:r>
+          </m:sub>
+        </m:sSub>
+        <m:r>
+          <m:rPr>
+            <m:sty m:val="p"/>
+          </m:rPr>
+          <m:t>/</m:t>
+        </m:r>
+        <m:sSub>
+          <m:e>
+            <m:r>
+              <m:t>C</m:t>
+            </m:r>
+          </m:e>
+          <m:sub>
+            <m:r>
+              <m:t>f</m:t>
+            </m:r>
+          </m:sub>
+        </m:sSub>
+      </m:oMath>
+      <w:r>
+        <w:t xml:space="preserve"> </w:t>
+      </w:r>
+      <w:r>
+        <w:t xml:space="preserve">เปลี่ยนเป็น 1.2 mH/10 µF ให้ตรงแบบจำลอง (ค) แบตเตอรี่เป็น 12S (~38.4 V) ให้ใกล้บัส 40 V (ง) เพิ่ม TVS P6KE60A อย่างชัดเจน</w:t>
+      </w:r>
+    </w:p>
+    <w:p>
+      <w:r>
+        <w:pict>
+          <v:rect style="width:0;height:1.5pt" o:hralign="center" o:hrstd="t" o:hr="t"/>
+        </w:pict>
+      </w:r>
+    </w:p>
+    <w:bookmarkEnd w:id="12"/>
+    <w:bookmarkEnd w:id="13"/>
+    <w:bookmarkStart w:id="16" w:name="ขนตอนการดำเนนงานวจย"/>
+    <w:p>
+      <w:pPr>
+        <w:pStyle w:val="Heading2"/>
+      </w:pPr>
+      <w:r>
+        <w:t xml:space="preserve">3.3 ขั้นตอนการดำเนินงานวิจัย</w:t>
+      </w:r>
+    </w:p>
+    <w:bookmarkStart w:id="14" w:name="research-methodology-workflow"/>
+    <w:p>
+      <w:pPr>
+        <w:pStyle w:val="Heading3"/>
+      </w:pPr>
+      <w:r>
+        <w:t xml:space="preserve">(Research Methodology Workflow)</w:t>
+      </w:r>
+    </w:p>
+    <w:p>
+      <w:pPr>
+        <w:pStyle w:val="FirstParagraph"/>
+      </w:pPr>
+      <w:r>
+        <w:t xml:space="preserve">แผนการดำเนินงานแบ่งเป็น 6 ระยะ ดังรูปที่ 3.1</w:t>
+      </w:r>
+    </w:p>
+    <w:p>
+      <w:pPr>
+        <w:pStyle w:val="BlockText"/>
+      </w:pPr>
+      <w:r>
+        <w:rPr>
+          <w:b/>
+          <w:bCs/>
+        </w:rPr>
+        <w:t xml:space="preserve">[TODO: รูปที่ 3.1 — แผนผังขั้นตอน 6 ระยะ]</w:t>
       </w:r>
       <w:r>
         <w:t xml:space="preserve"> </w:t>
@@ -944,17 +2411,17 @@
           <w:i/>
           <w:iCs/>
         </w:rPr>
-        <w:t xml:space="preserve">(สร้าง flowchart ใหม่ด้วย draw.io หรือ Visio แล้ว insert เป็นรูป)</w:t>
-      </w:r>
-    </w:p>
-    <w:bookmarkEnd w:id="12"/>
-    <w:bookmarkStart w:id="13" w:name="รายละเอยดขนตอนการดำเนนงานวจย"/>
+        <w:t xml:space="preserve">(สร้างด้วย draw.io แล้ว insert)</w:t>
+      </w:r>
+    </w:p>
+    <w:bookmarkEnd w:id="14"/>
+    <w:bookmarkStart w:id="15" w:name="รายละเอยดขนตอน"/>
     <w:p>
       <w:pPr>
         <w:pStyle w:val="Heading3"/>
       </w:pPr>
       <w:r>
-        <w:t xml:space="preserve">3.2.1 รายละเอียดขั้นตอนการดำเนินงานวิจัย</w:t>
+        <w:t xml:space="preserve">3.3.1 รายละเอียดขั้นตอน</w:t>
       </w:r>
     </w:p>
     <w:p>
@@ -975,7 +2442,7 @@
         <w:t xml:space="preserve"> </w:t>
       </w:r>
       <w:r>
-        <w:t xml:space="preserve">รวบรวมทฤษฎีโครงสร้างอินเวอร์เตอร์เลียนแบบพฤติกรรมเครื่องกำเนิดไฟฟ้าซิงโครนัส การคำนวณสเกลพารามิเตอร์ไร้มิติเพื่อรักษารูปแบบพลวัต รวมถึงการวิจัยวิธีการวางผังระบบกราวด์เพื่อลดสัญญาณรบกวน</w:t>
+        <w:t xml:space="preserve">— ทฤษฎี VSG, สมการสวิง, การปรับสเกลพารามิเตอร์ต่อหน่วย (pu) และการวางผังกราวด์ลดสัญญาณรบกวน</w:t>
       </w:r>
     </w:p>
     <w:p>
@@ -990,13 +2457,23 @@
           <w:b/>
           <w:bCs/>
         </w:rPr>
-        <w:t xml:space="preserve">การจำลองสถานการณ์บนซอฟต์แวร์</w:t>
-      </w:r>
-      <w:r>
-        <w:t xml:space="preserve"> </w:t>
-      </w:r>
-      <w:r>
-        <w:t xml:space="preserve">ใช้โปรแกรม MATLAB/Simulink เพื่อทดสอบอัลกอริทึมการคำนวณสมการสวิงในลูปนอก และทดสอบความเสถียรของลูปควบคุมกระแสและแรงดันภายใน (Cascaded Control) ก่อนนำพารามิเตอร์ไปใช้กับระบบจริง</w:t>
+        <w:t xml:space="preserve">การจำลองบนซอฟต์แวร์ (เสร็จสมบูรณ์)</w:t>
+      </w:r>
+      <w:r>
+        <w:t xml:space="preserve"> </w:t>
+      </w:r>
+      <w:r>
+        <w:t xml:space="preserve">— สร้างแบบจำลอง MATLAB/Simulink แบบล่างขึ้นบน Stage 1–5c ตรวจสอบสมการสวิง ลูปดรูป และลูป cascaded V-I พร้อมการกวาดพารามิเตอร์ H–D 30 กรณี (รายละเอียดและผลในบทที่ 4)</w:t>
+      </w:r>
+      <w:r>
+        <w:t xml:space="preserve"> </w:t>
+      </w:r>
+      <w:r>
+        <w:rPr>
+          <w:b/>
+          <w:bCs/>
+        </w:rPr>
+        <w:t xml:space="preserve">จุดออกแบบในบทนี้คือผลลัพธ์ของระยะนี้</w:t>
       </w:r>
     </w:p>
     <w:p>
@@ -1011,13 +2488,33 @@
           <w:b/>
           <w:bCs/>
         </w:rPr>
-        <w:t xml:space="preserve">การออกแบบระบบฮาร์ดแวร์และวงจรวัด</w:t>
-      </w:r>
-      <w:r>
-        <w:t xml:space="preserve"> </w:t>
-      </w:r>
-      <w:r>
-        <w:t xml:space="preserve">จัดเตรียมและสร้างจุดต่อสายสัญญาณ คัดสรรอุปกรณ์ฟิลเตอร์ทางไฟฟ้า และเตรียมวงจรตรวจจับสัญญาณไฟฟ้าที่มีพิกัดแรงดันปลอดภัย ที่สามารถเชื่อมโยงและตอบรับกับ ESP32 และ AD7606 ได้สมบูรณ์</w:t>
+        <w:t xml:space="preserve">การออกแบบฮาร์ดแวร์และวงจรวัด</w:t>
+      </w:r>
+      <w:r>
+        <w:t xml:space="preserve"> </w:t>
+      </w:r>
+      <w:r>
+        <w:t xml:space="preserve">— ประกอบบอร์ด DRV8302 + ESP32 + AD7606, สร้างวงจรแบ่งแรงดัน, เซ็นเซอร์ ACS712-20A, ฟิลเตอร์ LC +</w:t>
+      </w:r>
+      <w:r>
+        <w:t xml:space="preserve"> </w:t>
+      </w:r>
+      <m:oMath>
+        <m:sSub>
+          <m:e>
+            <m:r>
+              <m:t>R</m:t>
+            </m:r>
+          </m:e>
+          <m:sub>
+            <m:r>
+              <m:t>d</m:t>
+            </m:r>
+          </m:sub>
+        </m:sSub>
+      </m:oMath>
+      <w:r>
+        <w:t xml:space="preserve">, วงจร pre-charge และ TVS (รายละเอียดการออกแบบในบทที่ 5)</w:t>
       </w:r>
     </w:p>
     <w:p>
@@ -1032,13 +2529,22 @@
           <w:b/>
           <w:bCs/>
         </w:rPr>
-        <w:t xml:space="preserve">การพัฒนาเฟิร์มแวร์ควบคุมบน ESP32</w:t>
-      </w:r>
-      <w:r>
-        <w:t xml:space="preserve"> </w:t>
-      </w:r>
-      <w:r>
-        <w:t xml:space="preserve">เขียนโปรแกรมดิจิทัลคอนโทรลเลอร์ที่ทำงานภายในฟังก์ชัน Interrupt Service Routine (ISR) ที่ความถี่ 10 kHz พร้อมใส่ฟังก์ชันป้องกันกระแสเกินทางซอฟต์แวร์ และการเริ่มเดินระบบแบบ Soft-Start</w:t>
+        <w:t xml:space="preserve">การพัฒนาเฟิร์มแวร์ ESP32</w:t>
+      </w:r>
+      <w:r>
+        <w:t xml:space="preserve"> </w:t>
+      </w:r>
+      <w:r>
+        <w:t xml:space="preserve">— เขียนดิจิทัลคอนโทรลเลอร์ใน ISR 10 kHz (</w:t>
+      </w:r>
+      <w:r>
+        <w:rPr>
+          <w:rStyle w:val="VerbatimChar"/>
+        </w:rPr>
+        <w:t xml:space="preserve">vsg_controller.ino</w:t>
+      </w:r>
+      <w:r>
+        <w:t xml:space="preserve">) ที่ port โครงสร้างควบคุมจาก Stage 5c โดยตรง พร้อม black-start soft-ramp และการป้องกันกระแสเกินทางซอฟต์แวร์</w:t>
       </w:r>
     </w:p>
     <w:p>
@@ -1053,13 +2559,16 @@
           <w:b/>
           <w:bCs/>
         </w:rPr>
-        <w:t xml:space="preserve">การประกอบและทดสอบกับฮาร์ดแวร์จริง</w:t>
-      </w:r>
-      <w:r>
-        <w:t xml:space="preserve"> </w:t>
-      </w:r>
-      <w:r>
-        <w:t xml:space="preserve">เริ่มการประจุไฟฟ้าเข้าระบบอย่างช้า ๆ และทำการทดสอบเพิ่ม-ลดโหลด 3 เฟส เพื่อจับพลวัตความถี่ (</w:t>
+        <w:t xml:space="preserve">การประกอบและทดสอบกับฮาร์ดแวร์จริง (HIL/บนโต๊ะ)</w:t>
+      </w:r>
+      <w:r>
+        <w:t xml:space="preserve"> </w:t>
+      </w:r>
+      <w:r>
+        <w:t xml:space="preserve">— black-start, ทดสอบเพิ่ม-ลดโหลด 3 เฟส จับพลวัต</w:t>
+      </w:r>
+      <w:r>
+        <w:t xml:space="preserve"> </w:t>
       </w:r>
       <m:oMath>
         <m:r>
@@ -1067,7 +2576,13 @@
         </m:r>
       </m:oMath>
       <w:r>
-        <w:t xml:space="preserve">) และแอมพลิจูดแรงดัน (</w:t>
+        <w:t xml:space="preserve"> </w:t>
+      </w:r>
+      <w:r>
+        <w:t xml:space="preserve">และ</w:t>
+      </w:r>
+      <w:r>
+        <w:t xml:space="preserve"> </w:t>
       </w:r>
       <m:oMath>
         <m:r>
@@ -1075,7 +2590,25 @@
         </m:r>
       </m:oMath>
       <w:r>
-        <w:t xml:space="preserve">) ว่ามีการแกว่งและหน่วงตัวเลียนแบบเครื่องกำเนิดไฟฟ้าจริงและสอดคล้องกับผลแบบจำลองหรือไม่</w:t>
+        <w:t xml:space="preserve"> </w:t>
+      </w:r>
+      <w:r>
+        <w:t xml:space="preserve">เปรียบเทียบกับ</w:t>
+      </w:r>
+      <w:r>
+        <w:t xml:space="preserve"> </w:t>
+      </w:r>
+      <w:r>
+        <w:rPr>
+          <w:rStyle w:val="VerbatimChar"/>
+        </w:rPr>
+        <w:t xml:space="preserve">vsg_stage5c_out.mat</w:t>
+      </w:r>
+      <w:r>
+        <w:t xml:space="preserve"> </w:t>
+      </w:r>
+      <w:r>
+        <w:t xml:space="preserve">ภายใต้การรบกวนโหลดเดียวกัน</w:t>
       </w:r>
     </w:p>
     <w:p>
@@ -1090,13 +2623,13 @@
           <w:b/>
           <w:bCs/>
         </w:rPr>
-        <w:t xml:space="preserve">วิเคราะห์ผลการทดลองและเขียนรายงาน</w:t>
-      </w:r>
-      <w:r>
-        <w:t xml:space="preserve"> </w:t>
-      </w:r>
-      <w:r>
-        <w:t xml:space="preserve">รวบรวมข้อมูล วิเคราะห์เปรียบเทียบความถูกต้องของพลวัตระหว่างผลจำลองและผลจริง และจัดพิมพ์เล่มรายงานฉบับสมบูรณ์สำหรับโครงงานวิศวกรรมไฟฟ้า</w:t>
+        <w:t xml:space="preserve">วิเคราะห์ผลและเขียนรายงาน</w:t>
+      </w:r>
+      <w:r>
+        <w:t xml:space="preserve"> </w:t>
+      </w:r>
+      <w:r>
+        <w:t xml:space="preserve">— เปรียบเทียบความถูกต้องระหว่างผลจำลองกับผลจริง และจัดทำรายงานฉบับสมบูรณ์</w:t>
       </w:r>
     </w:p>
     <w:p>
@@ -1106,24 +2639,24 @@
         </w:pict>
       </w:r>
     </w:p>
-    <w:bookmarkEnd w:id="13"/>
-    <w:bookmarkEnd w:id="14"/>
-    <w:bookmarkStart w:id="21" w:name="Xbdb4196396a3fc84a4776f6f2d299071d807863"/>
+    <w:bookmarkEnd w:id="15"/>
+    <w:bookmarkEnd w:id="16"/>
+    <w:bookmarkStart w:id="18" w:name="สรปการออกแบบระบบควบคม-เชอมโยงแบบจำลอง"/>
     <w:p>
       <w:pPr>
         <w:pStyle w:val="Heading2"/>
       </w:pPr>
       <w:r>
-        <w:t xml:space="preserve">3.3 แผนการออกแบบฮาร์ดแวร์ระบบควบคุมและภาคกำลังสำรองประสิทธิภาพสูง</w:t>
-      </w:r>
-    </w:p>
-    <w:bookmarkStart w:id="15" w:name="X2cc521bad69111ee52524d977ac3107435dbd7e"/>
+        <w:t xml:space="preserve">3.4 สรุปการออกแบบระบบควบคุม (เชื่อมโยงแบบจำลอง)</w:t>
+      </w:r>
+    </w:p>
+    <w:bookmarkStart w:id="17" w:name="X9a15f1c33dc94ee900cfbb2c689f1ba52fef369"/>
     <w:p>
       <w:pPr>
         <w:pStyle w:val="Heading3"/>
       </w:pPr>
       <w:r>
-        <w:t xml:space="preserve">(High-Performance Alternative Architecture — Contingency Plan)</w:t>
+        <w:t xml:space="preserve">(Control Design Summary — linked to verified sim)</w:t>
       </w:r>
     </w:p>
     <w:p>
@@ -1131,178 +2664,736 @@
         <w:pStyle w:val="FirstParagraph"/>
       </w:pPr>
       <w:r>
-        <w:t xml:space="preserve">เพื่อเป็นการเตรียมความพร้อมในกรณีที่ตัวประมวลผลหลัก ESP32 มีประสิทธิภาพไม่เพียงพอต่อการรันลูปควบคุมความถี่สูงระดับ 10 kHz หรือระบบมีความล่าช้าในการสุ่มสัญญาณ ผู้ดำเนินโครงงานได้ออกแบบ</w:t>
-      </w:r>
-      <w:r>
-        <w:t xml:space="preserve"> </w:t>
-      </w:r>
-      <w:r>
-        <w:rPr>
-          <w:i/>
-          <w:iCs/>
-        </w:rPr>
-        <w:t xml:space="preserve">แผนสถาปัตยกรรมฮาร์ดแวร์สำรองประสิทธิภาพสูง</w:t>
-      </w:r>
-      <w:r>
-        <w:t xml:space="preserve"> </w:t>
-      </w:r>
-      <w:r>
-        <w:t xml:space="preserve">โดยเปลี่ยนมาใช้ระบบประมวลผลสัญญาณดิจิทัลระดับอุตสาหกรรมร่วมกับภาคกำลังเทคโนโลยีสารกึ่งตัวนำรุ่นใหม่ (GaN)</w:t>
-      </w:r>
-    </w:p>
-    <w:p>
-      <w:pPr>
-        <w:pStyle w:val="BlockText"/>
+        <w:t xml:space="preserve">โครงสร้างควบคุมในเฟิร์มแวร์เป็นการแปลงโดยตรงจากแบบจำลอง Stage 5c ที่ตรวจสอบแล้ว ประกอบด้วย 4 ส่วน:</w:t>
+      </w:r>
+    </w:p>
+    <w:p>
+      <w:pPr>
+        <w:pStyle w:val="BodyText"/>
       </w:pPr>
       <w:r>
         <w:rPr>
           <w:b/>
           <w:bCs/>
         </w:rPr>
-        <w:t xml:space="preserve">หมายเหตุขอบเขต:</w:t>
-      </w:r>
-      <w:r>
-        <w:t xml:space="preserve"> </w:t>
-      </w:r>
-      <w:r>
-        <w:t xml:space="preserve">แผนในหัวข้อ 3.3 นี้เป็นเพียง</w:t>
-      </w:r>
-      <w:r>
-        <w:t xml:space="preserve"> </w:t>
-      </w:r>
-      <w:r>
-        <w:rPr>
-          <w:i/>
-          <w:iCs/>
-        </w:rPr>
-        <w:t xml:space="preserve">แผนสำรอง (contingency plan)</w:t>
-      </w:r>
-      <w:r>
-        <w:t xml:space="preserve"> </w:t>
-      </w:r>
-      <w:r>
-        <w:t xml:space="preserve">ที่จะถูกนำมาใช้เฉพาะกรณีที่ ESP32 ไม่ผ่านเกณฑ์ในระยะที่ 5 ของหัวข้อ 3.2.1 เท่านั้น ขอบเขตหลักของโครงงาน (DC Bus ≤ 60 V, กำลังไม่เกิน 300 W ตามหัวข้อ 1.3) จะถูกรักษาไว้ในทั้งสองสถาปัตยกรรม โดยพิกัดของแผนสำรองนี้ (DC 48 V, GaN 60 V, LiFePO4 48 V) อยู่ในขอบเขตเดิม</w:t>
-      </w:r>
-    </w:p>
-    <w:bookmarkEnd w:id="15"/>
-    <w:bookmarkStart w:id="16" w:name="องคประกอบของสถาปตยกรรมสำรอง"/>
-    <w:p>
-      <w:pPr>
-        <w:pStyle w:val="Heading3"/>
-      </w:pPr>
-      <w:r>
-        <w:t xml:space="preserve">3.3.1 องค์ประกอบของสถาปัตยกรรมสำรอง</w:t>
-      </w:r>
+        <w:t xml:space="preserve">(1) สมการสวิง + ดรูป P-f (ลูปนอกความถี่)</w:t>
+      </w:r>
+    </w:p>
+    <w:p>
+      <w:pPr>
+        <w:pStyle w:val="BodyText"/>
+      </w:pPr>
+      <m:oMathPara>
+        <m:oMathParaPr>
+          <m:jc m:val="center"/>
+        </m:oMathParaPr>
+        <m:oMath>
+          <m:r>
+            <m:rPr>
+              <m:nor/>
+              <m:sty m:val="p"/>
+            </m:rPr>
+            <m:t>inertia_coeff</m:t>
+          </m:r>
+          <m:r>
+            <m:rPr>
+              <m:sty m:val="p"/>
+            </m:rPr>
+            <m:t>⋅</m:t>
+          </m:r>
+          <m:f>
+            <m:fPr>
+              <m:type m:val="bar"/>
+            </m:fPr>
+            <m:num>
+              <m:r>
+                <m:t>d</m:t>
+              </m:r>
+              <m:r>
+                <m:t>ω</m:t>
+              </m:r>
+            </m:num>
+            <m:den>
+              <m:r>
+                <m:t>d</m:t>
+              </m:r>
+              <m:r>
+                <m:t>t</m:t>
+              </m:r>
+            </m:den>
+          </m:f>
+          <m:r>
+            <m:rPr>
+              <m:sty m:val="p"/>
+            </m:rPr>
+            <m:t>=</m:t>
+          </m:r>
+          <m:d>
+            <m:dPr>
+              <m:begChr m:val="["/>
+              <m:sepChr m:val=""/>
+              <m:endChr m:val="]"/>
+              <m:grow/>
+            </m:dPr>
+            <m:e>
+              <m:sSub>
+                <m:e>
+                  <m:r>
+                    <m:t>P</m:t>
+                  </m:r>
+                </m:e>
+                <m:sub>
+                  <m:r>
+                    <m:t>s</m:t>
+                  </m:r>
+                  <m:r>
+                    <m:t>e</m:t>
+                  </m:r>
+                  <m:r>
+                    <m:t>t</m:t>
+                  </m:r>
+                  <m:r>
+                    <m:rPr>
+                      <m:sty m:val="p"/>
+                    </m:rPr>
+                    <m:t>,</m:t>
+                  </m:r>
+                  <m:r>
+                    <m:t>p</m:t>
+                  </m:r>
+                  <m:r>
+                    <m:t>u</m:t>
+                  </m:r>
+                </m:sub>
+              </m:sSub>
+              <m:r>
+                <m:rPr>
+                  <m:sty m:val="p"/>
+                </m:rPr>
+                <m:t>+</m:t>
+              </m:r>
+              <m:f>
+                <m:fPr>
+                  <m:type m:val="bar"/>
+                </m:fPr>
+                <m:num>
+                  <m:r>
+                    <m:t>1</m:t>
+                  </m:r>
+                  <m:r>
+                    <m:rPr>
+                      <m:sty m:val="p"/>
+                    </m:rPr>
+                    <m:t>−</m:t>
+                  </m:r>
+                  <m:r>
+                    <m:t>ω</m:t>
+                  </m:r>
+                  <m:r>
+                    <m:rPr>
+                      <m:sty m:val="p"/>
+                    </m:rPr>
+                    <m:t>/</m:t>
+                  </m:r>
+                  <m:sSub>
+                    <m:e>
+                      <m:r>
+                        <m:t>ω</m:t>
+                      </m:r>
+                    </m:e>
+                    <m:sub>
+                      <m:r>
+                        <m:t>s</m:t>
+                      </m:r>
+                    </m:sub>
+                  </m:sSub>
+                </m:num>
+                <m:den>
+                  <m:sSub>
+                    <m:e>
+                      <m:r>
+                        <m:t>R</m:t>
+                      </m:r>
+                    </m:e>
+                    <m:sub>
+                      <m:r>
+                        <m:t>p</m:t>
+                      </m:r>
+                    </m:sub>
+                  </m:sSub>
+                </m:den>
+              </m:f>
+            </m:e>
+          </m:d>
+          <m:r>
+            <m:rPr>
+              <m:sty m:val="p"/>
+            </m:rPr>
+            <m:t>−</m:t>
+          </m:r>
+          <m:sSub>
+            <m:e>
+              <m:r>
+                <m:t>P</m:t>
+              </m:r>
+            </m:e>
+            <m:sub>
+              <m:r>
+                <m:t>e</m:t>
+              </m:r>
+              <m:r>
+                <m:rPr>
+                  <m:sty m:val="p"/>
+                </m:rPr>
+                <m:t>,</m:t>
+              </m:r>
+              <m:r>
+                <m:t>p</m:t>
+              </m:r>
+              <m:r>
+                <m:t>u</m:t>
+              </m:r>
+            </m:sub>
+          </m:sSub>
+          <m:r>
+            <m:rPr>
+              <m:sty m:val="p"/>
+            </m:rPr>
+            <m:t>−</m:t>
+          </m:r>
+          <m:r>
+            <m:t>D</m:t>
+          </m:r>
+          <m:r>
+            <m:t> </m:t>
+          </m:r>
+          <m:r>
+            <m:rPr>
+              <m:sty m:val="p"/>
+            </m:rPr>
+            <m:t>(</m:t>
+          </m:r>
+          <m:r>
+            <m:t>ω</m:t>
+          </m:r>
+          <m:r>
+            <m:rPr>
+              <m:sty m:val="p"/>
+            </m:rPr>
+            <m:t>−</m:t>
+          </m:r>
+          <m:sSub>
+            <m:e>
+              <m:r>
+                <m:t>ω</m:t>
+              </m:r>
+            </m:e>
+            <m:sub>
+              <m:r>
+                <m:t>s</m:t>
+              </m:r>
+            </m:sub>
+          </m:sSub>
+          <m:r>
+            <m:rPr>
+              <m:sty m:val="p"/>
+            </m:rPr>
+            <m:t>)</m:t>
+          </m:r>
+        </m:oMath>
+      </m:oMathPara>
     </w:p>
     <w:p>
       <w:pPr>
         <w:pStyle w:val="FirstParagraph"/>
       </w:pPr>
       <w:r>
-        <w:t xml:space="preserve">สถาปัตยกรรมสำรองประกอบด้วย 4 ส่วนหลักดังต่อไปนี้</w:t>
-      </w:r>
-    </w:p>
-    <w:p>
-      <w:pPr>
-        <w:numPr>
-          <w:ilvl w:val="0"/>
-          <w:numId w:val="1002"/>
-        </w:numPr>
+        <w:t xml:space="preserve">โดย</w:t>
+      </w:r>
+      <w:r>
+        <w:t xml:space="preserve"> </w:t>
+      </w:r>
+      <m:oMath>
+        <m:r>
+          <m:rPr>
+            <m:nor/>
+            <m:sty m:val="p"/>
+          </m:rPr>
+          <m:t>inertia_coeff</m:t>
+        </m:r>
+        <m:r>
+          <m:rPr>
+            <m:sty m:val="p"/>
+          </m:rPr>
+          <m:t>=</m:t>
+        </m:r>
+        <m:r>
+          <m:t>2</m:t>
+        </m:r>
+        <m:r>
+          <m:t>H</m:t>
+        </m:r>
+        <m:r>
+          <m:rPr>
+            <m:sty m:val="p"/>
+          </m:rPr>
+          <m:t>/</m:t>
+        </m:r>
+        <m:sSub>
+          <m:e>
+            <m:r>
+              <m:t>ω</m:t>
+            </m:r>
+          </m:e>
+          <m:sub>
+            <m:r>
+              <m:t>s</m:t>
+            </m:r>
+          </m:sub>
+        </m:sSub>
+        <m:r>
+          <m:rPr>
+            <m:sty m:val="p"/>
+          </m:rPr>
+          <m:t>=</m:t>
+        </m:r>
+        <m:r>
+          <m:t>0.03183</m:t>
+        </m:r>
+      </m:oMath>
+      <w:r>
+        <w:t xml:space="preserve"> </w:t>
+      </w:r>
+      <w:r>
+        <w:t xml:space="preserve">ตรวจสอบกับ Stage 5b: ที่</w:t>
+      </w:r>
+      <w:r>
+        <w:t xml:space="preserve"> </w:t>
+      </w:r>
+      <m:oMath>
+        <m:r>
+          <m:t>H</m:t>
+        </m:r>
+        <m:r>
+          <m:rPr>
+            <m:sty m:val="p"/>
+          </m:rPr>
+          <m:t>=</m:t>
+        </m:r>
+        <m:r>
+          <m:t>5</m:t>
+        </m:r>
+        <m:r>
+          <m:rPr>
+            <m:sty m:val="p"/>
+          </m:rPr>
+          <m:t>,</m:t>
+        </m:r>
+        <m:r>
+          <m:t>D</m:t>
+        </m:r>
+        <m:r>
+          <m:rPr>
+            <m:sty m:val="p"/>
+          </m:rPr>
+          <m:t>=</m:t>
+        </m:r>
+        <m:r>
+          <m:t>0.5</m:t>
+        </m:r>
+      </m:oMath>
+      <w:r>
+        <w:t xml:space="preserve"> </w:t>
+      </w:r>
+      <w:r>
+        <w:t xml:space="preserve">และ</w:t>
+      </w:r>
+      <w:r>
+        <w:t xml:space="preserve"> </w:t>
+      </w:r>
+      <m:oMath>
+        <m:r>
+          <m:rPr>
+            <m:sty m:val="p"/>
+          </m:rPr>
+          <m:t>Δ</m:t>
+        </m:r>
+        <m:sSub>
+          <m:e>
+            <m:r>
+              <m:t>P</m:t>
+            </m:r>
+          </m:e>
+          <m:sub>
+            <m:r>
+              <m:t>p</m:t>
+            </m:r>
+            <m:r>
+              <m:t>u</m:t>
+            </m:r>
+          </m:sub>
+        </m:sSub>
+        <m:r>
+          <m:rPr>
+            <m:sty m:val="p"/>
+          </m:rPr>
+          <m:t>=</m:t>
+        </m:r>
+        <m:r>
+          <m:t>0.36</m:t>
+        </m:r>
+      </m:oMath>
+      <w:r>
+        <w:t xml:space="preserve"> </w:t>
+      </w:r>
+      <w:r>
+        <w:t xml:space="preserve">ให้</w:t>
+      </w:r>
+      <w:r>
+        <w:t xml:space="preserve"> </w:t>
+      </w:r>
+      <m:oMath>
+        <m:sSub>
+          <m:e>
+            <m:r>
+              <m:t>f</m:t>
+            </m:r>
+          </m:e>
+          <m:sub>
+            <m:r>
+              <m:t>s</m:t>
+            </m:r>
+            <m:r>
+              <m:t>s</m:t>
+            </m:r>
+          </m:sub>
+        </m:sSub>
+        <m:r>
+          <m:rPr>
+            <m:sty m:val="p"/>
+          </m:rPr>
+          <m:t>=</m:t>
+        </m:r>
+        <m:r>
+          <m:t>49.898</m:t>
+        </m:r>
+      </m:oMath>
+      <w:r>
+        <w:t xml:space="preserve"> </w:t>
+      </w:r>
+      <w:r>
+        <w:t xml:space="preserve">Hz (แบบจำลองได้ 49.896 Hz)</w:t>
+      </w:r>
+    </w:p>
+    <w:p>
+      <w:pPr>
+        <w:pStyle w:val="BodyText"/>
       </w:pPr>
       <w:r>
         <w:rPr>
           <w:b/>
           <w:bCs/>
         </w:rPr>
-        <w:t xml:space="preserve">ส่วนควบคุมหลัก (The Brain: Controller Stage)</w:t>
-      </w:r>
-      <w:r>
-        <w:t xml:space="preserve"> </w:t>
-      </w:r>
-      <w:r>
-        <w:t xml:space="preserve">บอร์ดไมโครคอนโทรลเลอร์ประมวลผลสัญญาณดิจิทัลประสิทธิภาพสูง Texas Instruments C2000 LaunchPad (รุ่น LAUNCHXL-F28379D) ทำหน้าที่รับค่าแรงดันและกระแสไฟฟ้าป้อนกลับมาประมวลผลสมการ Swing Equation และคำนวณการควบคุมแบบ Grid-Forming จากนั้นส่งสัญญาณ EPWM (3.3 V) ไปขับภาคกำลังไฟฟ้า</w:t>
-      </w:r>
-    </w:p>
-    <w:p>
-      <w:pPr>
-        <w:numPr>
-          <w:ilvl w:val="0"/>
-          <w:numId w:val="1002"/>
-        </w:numPr>
+        <w:t xml:space="preserve">(2) ดรูป Q-V (ลูปนอกแรงดัน)</w:t>
+      </w:r>
+      <w:r>
+        <w:t xml:space="preserve"> </w:t>
+      </w:r>
+      <m:oMath>
+        <m:r>
+          <m:t>E</m:t>
+        </m:r>
+        <m:r>
+          <m:rPr>
+            <m:sty m:val="p"/>
+          </m:rPr>
+          <m:t>=</m:t>
+        </m:r>
+        <m:sSub>
+          <m:e>
+            <m:r>
+              <m:t>V</m:t>
+            </m:r>
+          </m:e>
+          <m:sub>
+            <m:r>
+              <m:t>s</m:t>
+            </m:r>
+            <m:r>
+              <m:t>e</m:t>
+            </m:r>
+            <m:r>
+              <m:t>t</m:t>
+            </m:r>
+          </m:sub>
+        </m:sSub>
+        <m:r>
+          <m:rPr>
+            <m:sty m:val="p"/>
+          </m:rPr>
+          <m:t>−</m:t>
+        </m:r>
+        <m:sSub>
+          <m:e>
+            <m:r>
+              <m:t>D</m:t>
+            </m:r>
+          </m:e>
+          <m:sub>
+            <m:r>
+              <m:t>q</m:t>
+            </m:r>
+          </m:sub>
+        </m:sSub>
+        <m:r>
+          <m:t>Q</m:t>
+        </m:r>
+      </m:oMath>
+      <w:r>
+        <w:t xml:space="preserve"> </w:t>
+      </w:r>
+      <w:r>
+        <w:t xml:space="preserve">โดย</w:t>
+      </w:r>
+      <w:r>
+        <w:t xml:space="preserve"> </w:t>
+      </w:r>
+      <m:oMath>
+        <m:sSub>
+          <m:e>
+            <m:r>
+              <m:t>D</m:t>
+            </m:r>
+          </m:e>
+          <m:sub>
+            <m:r>
+              <m:t>q</m:t>
+            </m:r>
+          </m:sub>
+        </m:sSub>
+        <m:r>
+          <m:rPr>
+            <m:sty m:val="p"/>
+          </m:rPr>
+          <m:t>=</m:t>
+        </m:r>
+        <m:sSub>
+          <m:e>
+            <m:r>
+              <m:t>R</m:t>
+            </m:r>
+          </m:e>
+          <m:sub>
+            <m:r>
+              <m:t>q</m:t>
+            </m:r>
+          </m:sub>
+        </m:sSub>
+        <m:sSub>
+          <m:e>
+            <m:r>
+              <m:t>V</m:t>
+            </m:r>
+          </m:e>
+          <m:sub>
+            <m:r>
+              <m:t>s</m:t>
+            </m:r>
+            <m:r>
+              <m:t>e</m:t>
+            </m:r>
+            <m:r>
+              <m:t>t</m:t>
+            </m:r>
+          </m:sub>
+        </m:sSub>
+        <m:r>
+          <m:rPr>
+            <m:sty m:val="p"/>
+          </m:rPr>
+          <m:t>/</m:t>
+        </m:r>
+        <m:sSub>
+          <m:e>
+            <m:r>
+              <m:t>Q</m:t>
+            </m:r>
+          </m:e>
+          <m:sub>
+            <m:r>
+              <m:t>b</m:t>
+            </m:r>
+            <m:r>
+              <m:t>a</m:t>
+            </m:r>
+            <m:r>
+              <m:t>s</m:t>
+            </m:r>
+            <m:r>
+              <m:t>e</m:t>
+            </m:r>
+          </m:sub>
+        </m:sSub>
+        <m:r>
+          <m:rPr>
+            <m:sty m:val="p"/>
+          </m:rPr>
+          <m:t>=</m:t>
+        </m:r>
+        <m:r>
+          <m:t>0.007</m:t>
+        </m:r>
+      </m:oMath>
+      <w:r>
+        <w:t xml:space="preserve"> </w:t>
+      </w:r>
+      <w:r>
+        <w:t xml:space="preserve">V/VAR</w:t>
+      </w:r>
+    </w:p>
+    <w:p>
+      <w:pPr>
+        <w:pStyle w:val="BodyText"/>
       </w:pPr>
       <w:r>
         <w:rPr>
           <w:b/>
           <w:bCs/>
         </w:rPr>
-        <w:t xml:space="preserve">ส่วนภาคกำลังไฟฟ้า (The Muscles: Power Inverter Stage)</w:t>
-      </w:r>
-      <w:r>
-        <w:t xml:space="preserve"> </w:t>
-      </w:r>
-      <w:r>
-        <w:t xml:space="preserve">โมดูลกำลังไฟฟ้าอินเวอร์เตอร์ 3 เฟส เทคโนโลยีแกลเลียมไนไตรด์ GaN Inverter (รุ่น BOOSTXL-3PHGANINV) รองรับระดับแรงดันกระแสตรงสูงสุด 60 V ทำหน้าที่สวิตชิ่งแปลงกำลังไฟฟ้าจาก DC เป็น AC มีข้อดีเรื่องการสูญเสียจากการสวิตชิ่งต่ำมาก (Ultra-low switching losses) และมีวงจร Gate Driver และเซ็นเซอร์วัดกระแสฝั่งเอาต์พุตติดตั้งมาให้ในตัวพร้อมใช้งาน</w:t>
-      </w:r>
-    </w:p>
-    <w:p>
-      <w:pPr>
-        <w:numPr>
-          <w:ilvl w:val="0"/>
-          <w:numId w:val="1002"/>
-        </w:numPr>
+        <w:t xml:space="preserve">(3) ลูป cascaded V-I ในกรอบ dq</w:t>
+      </w:r>
+      <w:r>
+        <w:t xml:space="preserve"> </w:t>
+      </w:r>
+      <w:r>
+        <w:t xml:space="preserve">— PI ลูปแรงดัน (BW 100 Hz) + PI ลูปกระแส (BW 1 kHz) พร้อม decoupling feedforward (</w:t>
+      </w:r>
+      <m:oMath>
+        <m:r>
+          <m:rPr>
+            <m:sty m:val="p"/>
+          </m:rPr>
+          <m:t>∓</m:t>
+        </m:r>
+        <m:r>
+          <m:t>ω</m:t>
+        </m:r>
+        <m:sSub>
+          <m:e>
+            <m:r>
+              <m:t>L</m:t>
+            </m:r>
+          </m:e>
+          <m:sub>
+            <m:r>
+              <m:t>f</m:t>
+            </m:r>
+          </m:sub>
+        </m:sSub>
+        <m:r>
+          <m:t>i</m:t>
+        </m:r>
+      </m:oMath>
+      <w:r>
+        <w:t xml:space="preserve">) และ load-voltage feedforward ตาม Stage 5c เกน PI คำนวณจากสูตรเดียวกับ</w:t>
+      </w:r>
+      <w:r>
+        <w:t xml:space="preserve"> </w:t>
+      </w:r>
+      <w:r>
+        <w:rPr>
+          <w:rStyle w:val="VerbatimChar"/>
+        </w:rPr>
+        <w:t xml:space="preserve">phase5c_tuned.m</w:t>
+      </w:r>
+      <w:r>
+        <w:t xml:space="preserve"> </w:t>
+      </w:r>
+      <w:r>
+        <w:t xml:space="preserve">ทุกตัว</w:t>
+      </w:r>
+    </w:p>
+    <w:p>
+      <w:pPr>
+        <w:pStyle w:val="BodyText"/>
       </w:pPr>
       <w:r>
         <w:rPr>
           <w:b/>
           <w:bCs/>
         </w:rPr>
-        <w:t xml:space="preserve">ส่วนระบบกักเก็บพลังงาน (The Energy Storage)</w:t>
-      </w:r>
-      <w:r>
-        <w:t xml:space="preserve"> </w:t>
-      </w:r>
-      <w:r>
-        <w:t xml:space="preserve">ระบบกักเก็บพลังงานชุดแบตเตอรี่ LiFePO4 พิกัดแรงดันไฟฟ้า 48 V (ความจุประมาณ 10–20 Ah) ทำหน้าที่จ่ายกำลังไฟฟ้ากระแสตรงหลักให้กับระบบจำลองแรงเฉื่อยและโหลด โดยติดตั้งระบบบริหารจัดการแบตเตอรี่อัจฉริยะ Smart BMS (แบรนด์ Daly) ขนานเข้าไปเพื่อเพิ่มความปลอดภัยจากการไหลของกระแสไฟและแรงดันเกินพิกัด</w:t>
-      </w:r>
-    </w:p>
-    <w:p>
-      <w:pPr>
-        <w:numPr>
-          <w:ilvl w:val="0"/>
-          <w:numId w:val="1002"/>
-        </w:numPr>
+        <w:t xml:space="preserve">(4) มอดูเลชัน SPWM</w:t>
+      </w:r>
+      <w:r>
+        <w:t xml:space="preserve"> </w:t>
+      </w:r>
+      <w:r>
+        <w:t xml:space="preserve">— เทียบสัญญาณกับคลื่นพาห์สามเหลี่ยม 10 kHz (</w:t>
+      </w:r>
+      <m:oMath>
+        <m:r>
+          <m:t>m</m:t>
+        </m:r>
+        <m:r>
+          <m:rPr>
+            <m:sty m:val="p"/>
+          </m:rPr>
+          <m:t>=</m:t>
+        </m:r>
+        <m:r>
+          <m:t>0.70</m:t>
+        </m:r>
+      </m:oMath>
+      <w:r>
+        <w:t xml:space="preserve"> </w:t>
+      </w:r>
+      <w:r>
+        <w:t xml:space="preserve">อยู่ในย่านเชิงเส้น)</w:t>
+      </w:r>
+    </w:p>
+    <w:p>
+      <w:pPr>
+        <w:pStyle w:val="BodyText"/>
       </w:pPr>
       <w:r>
         <w:rPr>
           <w:b/>
           <w:bCs/>
         </w:rPr>
-        <w:t xml:space="preserve">ส่วนกรองสัญญาณและระบบความปลอดภัยฝั่งกระแสสลับ (The Filters &amp; Safety Devices)</w:t>
-      </w:r>
-      <w:r>
-        <w:t xml:space="preserve"> </w:t>
-      </w:r>
-      <w:r>
-        <w:t xml:space="preserve">วงจรกรองกระแสเอาต์พุต AC (LC/LCL Filter) ทำหน้าที่ลดทอนคลื่นสัญญาณรูปพัลส์เหลี่ยมสวิตชิ่งความถี่สูงให้เป็นรูปคลื่นไซน์ที่มีความเที่ยงตรงสูงก่อนจ่ายให้แก่โหลดภายนอก พร้อมระบบตัดตอนกระแสตรง DC Circuit Breaker (16–20 A) สำหรับเปิด-ปิดระบบไฟฟ้าหลัก และหัวเชื่อมต่อสัมผัสทนกระแสสูงประเภท XT90 เพื่อเชื่อมโยงสายไฟกำลังสูงอย่างปลอดภัย</w:t>
-      </w:r>
-    </w:p>
-    <w:bookmarkEnd w:id="16"/>
-    <w:bookmarkStart w:id="18" w:name="X5a42e3c5daf946dbeecf79a947729c0f0299806"/>
+        <w:t xml:space="preserve">หลักการสเกลพารามิเตอร์ต่อหน่วย:</w:t>
+      </w:r>
+      <w:r>
+        <w:t xml:space="preserve"> </w:t>
+      </w:r>
+      <w:r>
+        <w:t xml:space="preserve">การออกแบบรักษาให้พลวัต pu ของต้นแบบ 100 W เหมือนระบบกำลังจริงระดับ 10 kVA ทำให้ผลการทดลองอ้างอิงกลับสู่ระบบจริงได้ (รายละเอียดการพิสูจน์ในบทที่ 5 §5.2)</w:t>
+      </w:r>
+    </w:p>
+    <w:p>
+      <w:r>
+        <w:pict>
+          <v:rect style="width:0;height:1.5pt" o:hralign="center" o:hrstd="t" o:hr="t"/>
+        </w:pict>
+      </w:r>
+    </w:p>
+    <w:bookmarkEnd w:id="17"/>
+    <w:bookmarkEnd w:id="18"/>
+    <w:bookmarkStart w:id="22" w:name="แผนทางเลอกประสทธภาพสง-งานตอยอด"/>
+    <w:p>
+      <w:pPr>
+        <w:pStyle w:val="Heading2"/>
+      </w:pPr>
+      <w:r>
+        <w:t xml:space="preserve">3.5 แผนทางเลือกประสิทธิภาพสูง (งานต่อยอด)</w:t>
+      </w:r>
+    </w:p>
+    <w:bookmarkStart w:id="19" w:name="high-performance-alternative-future-work"/>
     <w:p>
       <w:pPr>
         <w:pStyle w:val="Heading3"/>
       </w:pPr>
       <w:r>
-        <w:t xml:space="preserve">3.3.2 แผนการเปรียบเทียบและประเมินระบบประมวลผลทางเลือก</w:t>
-      </w:r>
-    </w:p>
-    <w:bookmarkStart w:id="17" w:name="controller-hardware-contingency-plan"/>
-    <w:p>
-      <w:pPr>
-        <w:pStyle w:val="Heading4"/>
-      </w:pPr>
-      <w:r>
-        <w:t xml:space="preserve">(Controller Hardware Contingency Plan)</w:t>
+        <w:t xml:space="preserve">(High-Performance Alternative — Future Work)</w:t>
       </w:r>
     </w:p>
     <w:p>
@@ -1310,338 +3401,51 @@
         <w:pStyle w:val="FirstParagraph"/>
       </w:pPr>
       <w:r>
-        <w:t xml:space="preserve">เนื่องจากไมโครคอนโทรลเลอร์ ESP32 เป็นชิปประมวลผลเอนกประสงค์ที่ไม่ได้ถูกออกแบบมาสำหรับงานควบคุมอิเล็กทรอนิกส์กำลังโดยเฉพาะ หากในระหว่างขั้นตอนการทดสอบฮาร์ดแวร์จริงพบปัญหาและข้อจำกัดทางเทคนิค เช่น ปัญหา Jitter ของเวลาจริง (real-time jitter) หรือความล่าช้าจากการคำนวณเลขทศนิยม ผู้ดำเนินโครงงานได้กำหนดแผนสำรองโดยพิจารณาเปลี่ยนไปใช้ชิปประมวลผลสัญญาณดิจิทัลอุตสาหกรรมในตระกูล Texas Instruments C2000 LaunchPad เป็นตัวควบคุมหลักทดแทน โดยมีข้อเปรียบเทียบเชิงวิศวกรรมดังแสดงในตารางที่ 3.2</w:t>
-      </w:r>
-    </w:p>
-    <w:p>
-      <w:pPr>
-        <w:pStyle w:val="BodyText"/>
-      </w:pPr>
+        <w:t xml:space="preserve">นอกเหนือจากระบบหลัก (ESP32 + DRV8302 @ 40 V) ผู้ดำเนินโครงงานได้ออกแบบแผนทางเลือกไว้ 2 ระดับสำหรับการต่อยอด:</w:t>
+      </w:r>
+    </w:p>
+    <w:bookmarkEnd w:id="19"/>
+    <w:bookmarkStart w:id="20" w:name="Xc2d29aca2db3d5f3829bdf2a3d56609b7335897"/>
+    <w:p>
+      <w:pPr>
+        <w:pStyle w:val="Heading3"/>
+      </w:pPr>
+      <w:r>
+        <w:t xml:space="preserve">3.5.1 ภาคกำลังแบบดิสครีตแรงดันสูง (Discrete Power Stage @ 48 V)</w:t>
+      </w:r>
+    </w:p>
+    <w:p>
+      <w:pPr>
+        <w:pStyle w:val="FirstParagraph"/>
+      </w:pPr>
+      <w:r>
+        <w:t xml:space="preserve">หากต้องการขอบเขตแรงดันที่กว้างขึ้น สามารถเปลี่ยนจากบอร์ด DRV8302 (สูงสุด 60 V) ไปใช้ภาคกำลังดิสครีต:</w:t>
+      </w:r>
+      <w:r>
+        <w:t xml:space="preserve"> </w:t>
+      </w:r>
       <w:r>
         <w:rPr>
           <w:b/>
           <w:bCs/>
         </w:rPr>
-        <w:t xml:space="preserve">ตารางที่ 3.2</w:t>
-      </w:r>
-      <w:r>
-        <w:t xml:space="preserve"> </w:t>
-      </w:r>
-      <w:r>
-        <w:t xml:space="preserve">การเปรียบเทียบเชิงวิศวกรรมระหว่างบอร์ดควบคุมหลัก (ESP32) และบอร์ดควบคุมสำรอง (TI C2000)</w:t>
-      </w:r>
-    </w:p>
-    <w:tbl>
-      <w:tblPr>
-        <w:tblStyle w:val="Table"/>
-        <w:tblW w:type="pct" w:w="5000"/>
-        <w:tblLayout w:type="fixed"/>
-        <w:tblLook w:firstRow="1" w:lastRow="0" w:firstColumn="0" w:lastColumn="0" w:noHBand="0" w:noVBand="0" w:val="0020"/>
-      </w:tblPr>
-      <w:tblGrid>
-        <w:gridCol w:w="1980"/>
-        <w:gridCol w:w="1980"/>
-        <w:gridCol w:w="1980"/>
-        <w:gridCol w:w="1980"/>
-      </w:tblGrid>
-      <w:tr>
-        <w:trPr>
-          <w:tblHeader w:val="on"/>
-        </w:trPr>
-        <w:tc>
-          <w:tcPr/>
-          <w:p>
-            <w:pPr>
-              <w:pStyle w:val="Compact"/>
-            </w:pPr>
-            <w:r>
-              <w:t xml:space="preserve">คุณลักษณะทางเทคนิค</w:t>
-            </w:r>
-          </w:p>
-        </w:tc>
-        <w:tc>
-          <w:tcPr/>
-          <w:p>
-            <w:pPr>
-              <w:pStyle w:val="Compact"/>
-            </w:pPr>
-            <w:r>
-              <w:t xml:space="preserve">บอร์ดควบคุมหลัก (ESP32)</w:t>
-            </w:r>
-          </w:p>
-        </w:tc>
-        <w:tc>
-          <w:tcPr/>
-          <w:p>
-            <w:pPr>
-              <w:pStyle w:val="Compact"/>
-            </w:pPr>
-            <w:r>
-              <w:t xml:space="preserve">บอร์ดควบคุมสำรอง (TI C2000)</w:t>
-            </w:r>
-          </w:p>
-        </w:tc>
-        <w:tc>
-          <w:tcPr/>
-          <w:p>
-            <w:pPr>
-              <w:pStyle w:val="Compact"/>
-            </w:pPr>
-            <w:r>
-              <w:t xml:space="preserve">ผลกระทบต่อการออกแบบระบบต้นแบบ</w:t>
-            </w:r>
-          </w:p>
-        </w:tc>
-      </w:tr>
-      <w:tr>
-        <w:tc>
-          <w:tcPr/>
-          <w:p>
-            <w:pPr>
-              <w:pStyle w:val="Compact"/>
-            </w:pPr>
-            <w:r>
-              <w:t xml:space="preserve">โครงสร้างหน่วยประมวลผล</w:t>
-            </w:r>
-          </w:p>
-        </w:tc>
-        <w:tc>
-          <w:tcPr/>
-          <w:p>
-            <w:pPr>
-              <w:pStyle w:val="Compact"/>
-            </w:pPr>
-            <w:r>
-              <w:t xml:space="preserve">Dual Core Xtensa LX6 (240 MHz)</w:t>
-            </w:r>
-          </w:p>
-        </w:tc>
-        <w:tc>
-          <w:tcPr/>
-          <w:p>
-            <w:pPr>
-              <w:pStyle w:val="Compact"/>
-            </w:pPr>
-            <w:r>
-              <w:t xml:space="preserve">C28x DSP Co-Processor (100–200 MHz)</w:t>
-            </w:r>
-          </w:p>
-        </w:tc>
-        <w:tc>
-          <w:tcPr/>
-          <w:p>
-            <w:pPr>
-              <w:pStyle w:val="Compact"/>
-            </w:pPr>
-            <w:r>
-              <w:t xml:space="preserve">TI C2000 มีสถาปัตยกรรม DSP ออกแบบมาเพื่อลูปควบคุมกำลังไฟความเร็วสูงโดยเฉพาะ</w:t>
-            </w:r>
-          </w:p>
-        </w:tc>
-      </w:tr>
-      <w:tr>
-        <w:tc>
-          <w:tcPr/>
-          <w:p>
-            <w:pPr>
-              <w:pStyle w:val="Compact"/>
-            </w:pPr>
-            <w:r>
-              <w:t xml:space="preserve">หน่วยประมวลผลเฉพาะทาง</w:t>
-            </w:r>
-          </w:p>
-        </w:tc>
-        <w:tc>
-          <w:tcPr/>
-          <w:p>
-            <w:pPr>
-              <w:pStyle w:val="Compact"/>
-            </w:pPr>
-            <w:r>
-              <w:t xml:space="preserve">FPU (Float Unit) ทั่วไป</w:t>
-            </w:r>
-          </w:p>
-        </w:tc>
-        <w:tc>
-          <w:tcPr/>
-          <w:p>
-            <w:pPr>
-              <w:pStyle w:val="Compact"/>
-            </w:pPr>
-            <w:r>
-              <w:t xml:space="preserve">TMU (Trigonometric Math Unit) ในตัว</w:t>
-            </w:r>
-          </w:p>
-        </w:tc>
-        <w:tc>
-          <w:tcPr/>
-          <w:p>
-            <w:pPr>
-              <w:pStyle w:val="Compact"/>
-            </w:pPr>
-            <w:r>
-              <w:t xml:space="preserve">TI C2000 สามารถคำนวณฟังก์ชันตรีโกณมิติสำหรับ Park/Clarke Transform ได้ในระดับไม่กี่คาบนาฬิกา</w:t>
-            </w:r>
-          </w:p>
-        </w:tc>
-      </w:tr>
-      <w:tr>
-        <w:tc>
-          <w:tcPr/>
-          <w:p>
-            <w:pPr>
-              <w:pStyle w:val="Compact"/>
-            </w:pPr>
-            <w:r>
-              <w:t xml:space="preserve">ตัวแปลงสัญญาณอนาล็อก (ADC)</w:t>
-            </w:r>
-          </w:p>
-        </w:tc>
-        <w:tc>
-          <w:tcPr/>
-          <w:p>
-            <w:pPr>
-              <w:pStyle w:val="Compact"/>
-            </w:pPr>
-            <w:r>
-              <w:t xml:space="preserve">12-Bit (Sequential / Non-linear)</w:t>
-            </w:r>
-          </w:p>
-        </w:tc>
-        <w:tc>
-          <w:tcPr/>
-          <w:p>
-            <w:pPr>
-              <w:pStyle w:val="Compact"/>
-            </w:pPr>
-            <w:r>
-              <w:t xml:space="preserve">12-Bit หรือ 16-Bit (True Simultaneous Sampling)</w:t>
-            </w:r>
-          </w:p>
-        </w:tc>
-        <w:tc>
-          <w:tcPr/>
-          <w:p>
-            <w:pPr>
-              <w:pStyle w:val="Compact"/>
-            </w:pPr>
-            <w:r>
-              <w:t xml:space="preserve">หากใช้ TI C2000 จะขจัดโมดูลแปลงสัญญาณภายนอก AD7606 ออกได้ เนื่องจากมี ADC สุ่มพร้อมกันความเร็วสูงในตัว</w:t>
-            </w:r>
-          </w:p>
-        </w:tc>
-      </w:tr>
-      <w:tr>
-        <w:tc>
-          <w:tcPr/>
-          <w:p>
-            <w:pPr>
-              <w:pStyle w:val="Compact"/>
-            </w:pPr>
-            <w:r>
-              <w:t xml:space="preserve">โมดูลควบคุมสัญญาณ PWM</w:t>
-            </w:r>
-          </w:p>
-        </w:tc>
-        <w:tc>
-          <w:tcPr/>
-          <w:p>
-            <w:pPr>
-              <w:pStyle w:val="Compact"/>
-            </w:pPr>
-            <w:r>
-              <w:t xml:space="preserve">MCPWM (Hardware)</w:t>
-            </w:r>
-          </w:p>
-        </w:tc>
-        <w:tc>
-          <w:tcPr/>
-          <w:p>
-            <w:pPr>
-              <w:pStyle w:val="Compact"/>
-            </w:pPr>
-            <w:r>
-              <w:t xml:space="preserve">EPWM (Enhanced PWM) + HRPWM (High-Resolution)</w:t>
-            </w:r>
-          </w:p>
-        </w:tc>
-        <w:tc>
-          <w:tcPr/>
-          <w:p>
-            <w:pPr>
-              <w:pStyle w:val="Compact"/>
-            </w:pPr>
-            <w:r>
-              <w:t xml:space="preserve">TI C2000 มีระบบป้องกันระดับฮาร์ดแวร์และการสร้าง Dead-time ที่ความละเอียดระดับนาโนวินาที ปลอดภัยต่อ MOSFET สูง</w:t>
-            </w:r>
-          </w:p>
-        </w:tc>
-      </w:tr>
-      <w:tr>
-        <w:tc>
-          <w:tcPr/>
-          <w:p>
-            <w:pPr>
-              <w:pStyle w:val="Compact"/>
-            </w:pPr>
-            <w:r>
-              <w:t xml:space="preserve">ซอฟต์แวร์และเครื่องมือพัฒนา</w:t>
-            </w:r>
-          </w:p>
-        </w:tc>
-        <w:tc>
-          <w:tcPr/>
-          <w:p>
-            <w:pPr>
-              <w:pStyle w:val="Compact"/>
-            </w:pPr>
-            <w:r>
-              <w:t xml:space="preserve">Arduino IDE / ESP-IDF (C/C++)</w:t>
-            </w:r>
-          </w:p>
-        </w:tc>
-        <w:tc>
-          <w:tcPr/>
-          <w:p>
-            <w:pPr>
-              <w:pStyle w:val="Compact"/>
-            </w:pPr>
-            <w:r>
-              <w:t xml:space="preserve">Code Composer Studio (CCS) / MATLAB</w:t>
-            </w:r>
-          </w:p>
-        </w:tc>
-        <w:tc>
-          <w:tcPr/>
-          <w:p>
-            <w:pPr>
-              <w:pStyle w:val="Compact"/>
-            </w:pPr>
-            <w:r>
-              <w:t xml:space="preserve">TI C2000 รองรับการแปลงโค้ดจากโมเดล MATLAB/Simulink ออกบอร์ดได้โดยตรง ช่วยลดข้อผิดพลาดในการเขียนลูปควบคุม</w:t>
-            </w:r>
-          </w:p>
-        </w:tc>
-      </w:tr>
-    </w:tbl>
-    <w:bookmarkEnd w:id="17"/>
-    <w:bookmarkEnd w:id="18"/>
-    <w:bookmarkStart w:id="20" w:name="เกณฑการตดสนใจเปลยนสถาปตยกรรม"/>
+        <w:t xml:space="preserve">MOSFET คลาส 100 V (IRF540N) ×6 + เกตไดรเวอร์แยกกราวด์ TI UCC21520 ×3 + คอมพาเรเตอร์ OCP (LM393)</w:t>
+      </w:r>
+      <w:r>
+        <w:t xml:space="preserve"> </w:t>
+      </w:r>
+      <w:r>
+        <w:t xml:space="preserve">ทำงานที่บัส 48 V ได้อย่างปลอดภัย (derating 80% ตาม Vishay AN861) ข้อดีคือ headroom แรงดันสูงและได้เรียนรู้การออกแบบ PCB power electronics แต่ต้องออกแบบ PCB เอง</w:t>
+      </w:r>
+    </w:p>
+    <w:bookmarkEnd w:id="20"/>
+    <w:bookmarkStart w:id="21" w:name="ตวควบคมระดบอตสาหกรรม-controller-upgrade"/>
     <w:p>
       <w:pPr>
         <w:pStyle w:val="Heading3"/>
       </w:pPr>
       <w:r>
-        <w:t xml:space="preserve">3.3.3 เกณฑ์การตัดสินใจเปลี่ยนสถาปัตยกรรม</w:t>
-      </w:r>
-    </w:p>
-    <w:bookmarkStart w:id="19" w:name="X2fc4369c034596aa95e044386b88cc17e140fce"/>
-    <w:p>
-      <w:pPr>
-        <w:pStyle w:val="Heading4"/>
-      </w:pPr>
-      <w:r>
-        <w:t xml:space="preserve">(Decision Criteria for Architecture Switch)</w:t>
+        <w:t xml:space="preserve">3.5.2 ตัวควบคุมระดับอุตสาหกรรม (Controller Upgrade)</w:t>
       </w:r>
     </w:p>
     <w:p>
@@ -1649,103 +3453,41 @@
         <w:pStyle w:val="FirstParagraph"/>
       </w:pPr>
       <w:r>
-        <w:t xml:space="preserve">ผู้ดำเนินโครงงานกำหนดเกณฑ์เชิงปริมาณสำหรับการตัดสินใจเปลี่ยนจากระบบหลัก (ESP32) ไปใช้ระบบสำรอง (C2000 + GaN) ดังนี้</w:t>
-      </w:r>
-    </w:p>
-    <w:p>
-      <w:pPr>
-        <w:pStyle w:val="Compact"/>
-        <w:numPr>
-          <w:ilvl w:val="0"/>
-          <w:numId w:val="1003"/>
-        </w:numPr>
-      </w:pPr>
+        <w:t xml:space="preserve">หากพบว่า ESP32 มีข้อจำกัดด้าน real-time jitter หรือ computation latency ในระยะที่ 5 สามารถเปลี่ยนไปใช้ DSP ตระกูล</w:t>
+      </w:r>
+      <w:r>
+        <w:t xml:space="preserve"> </w:t>
+      </w:r>
       <w:r>
         <w:rPr>
           <w:b/>
           <w:bCs/>
         </w:rPr>
-        <w:t xml:space="preserve">เกณฑ์ที่ 1 — Loop Jitter:</w:t>
-      </w:r>
-      <w:r>
-        <w:t xml:space="preserve"> </w:t>
-      </w:r>
-      <w:r>
-        <w:t xml:space="preserve">หากค่า jitter ของ ISR ที่ 10 kHz เกิน ±5 µs ภายใต้สภาวะโหลดเต็มกำลัง</w:t>
-      </w:r>
-    </w:p>
-    <w:p>
-      <w:pPr>
-        <w:pStyle w:val="Compact"/>
-        <w:numPr>
-          <w:ilvl w:val="0"/>
-          <w:numId w:val="1003"/>
-        </w:numPr>
+        <w:t xml:space="preserve">TI C2000 (LAUNCHXL-F28379D)</w:t>
+      </w:r>
+      <w:r>
+        <w:t xml:space="preserve"> </w:t>
+      </w:r>
+      <w:r>
+        <w:t xml:space="preserve">ที่มี TMU สำหรับ Park/Clarke, ADC simultaneous-sampling ในตัว และรองรับการสร้างโค้ดจาก MATLAB/Simulink โดยตรง</w:t>
+      </w:r>
+    </w:p>
+    <w:p>
+      <w:pPr>
+        <w:pStyle w:val="BodyText"/>
       </w:pPr>
       <w:r>
         <w:rPr>
           <w:b/>
           <w:bCs/>
         </w:rPr>
-        <w:t xml:space="preserve">เกณฑ์ที่ 2 — Computation Latency:</w:t>
-      </w:r>
-      <w:r>
-        <w:t xml:space="preserve"> </w:t>
-      </w:r>
-      <w:r>
-        <w:t xml:space="preserve">หากเวลาประมวลผล Park/Clarke Transform + Swing Equation รวมกันเกิน 50 µs ต่อ ISR cycle</w:t>
-      </w:r>
-    </w:p>
-    <w:p>
-      <w:pPr>
-        <w:pStyle w:val="Compact"/>
-        <w:numPr>
-          <w:ilvl w:val="0"/>
-          <w:numId w:val="1003"/>
-        </w:numPr>
-      </w:pPr>
-      <w:r>
-        <w:rPr>
-          <w:b/>
-          <w:bCs/>
-        </w:rPr>
-        <w:t xml:space="preserve">เกณฑ์ที่ 3 — ADC Synchronization:</w:t>
-      </w:r>
-      <w:r>
-        <w:t xml:space="preserve"> </w:t>
-      </w:r>
-      <w:r>
-        <w:t xml:space="preserve">หากการสุ่มสัญญาณกระแส 3 เฟสไม่สามารถทำได้แบบ simultaneous sampling จน lead-lag error เกิน 2° ทางไฟฟ้า</w:t>
-      </w:r>
-    </w:p>
-    <w:p>
-      <w:pPr>
-        <w:pStyle w:val="Compact"/>
-        <w:numPr>
-          <w:ilvl w:val="0"/>
-          <w:numId w:val="1003"/>
-        </w:numPr>
-      </w:pPr>
-      <w:r>
-        <w:rPr>
-          <w:b/>
-          <w:bCs/>
-        </w:rPr>
-        <w:t xml:space="preserve">เกณฑ์ที่ 4 — Switching Loss:</w:t>
-      </w:r>
-      <w:r>
-        <w:t xml:space="preserve"> </w:t>
-      </w:r>
-      <w:r>
-        <w:t xml:space="preserve">หากการสูญเสียจากการสวิตชิ่งของ MOSFET ในบอร์ด DRV8302 ทำให้อุณหภูมิเกิน 80 °C ที่กำลัง 100 VA</w:t>
-      </w:r>
-    </w:p>
-    <w:p>
-      <w:pPr>
-        <w:pStyle w:val="FirstParagraph"/>
-      </w:pPr>
-      <w:r>
-        <w:t xml:space="preserve">หากเกณฑ์ใดเกณฑ์หนึ่งใน 4 ข้อข้างต้นไม่ผ่าน คณะผู้ดำเนินโครงงานจะดำเนินการตามแผนสำรองในหัวข้อ 3.3.1 ทันที</w:t>
+        <w:t xml:space="preserve">เกณฑ์การตัดสินใจเปลี่ยนตัวควบคุม:</w:t>
+      </w:r>
+      <w:r>
+        <w:t xml:space="preserve"> </w:t>
+      </w:r>
+      <w:r>
+        <w:t xml:space="preserve">(1) jitter ของ ISR 10 kHz &gt; ±5 µs (2) เวลาประมวลผล Park/Clarke + swing &gt; 50 µs/cycle (3) ไม่สามารถสุ่มกระแส 3 เฟส simultaneous จน lead-lag error &gt; 2° ทางไฟฟ้า</w:t>
       </w:r>
     </w:p>
     <w:p>
@@ -1755,10 +3497,9 @@
         </w:pict>
       </w:r>
     </w:p>
-    <w:bookmarkEnd w:id="19"/>
-    <w:bookmarkEnd w:id="20"/>
     <w:bookmarkEnd w:id="21"/>
-    <w:bookmarkStart w:id="22" w:name="สรปทายบท"/>
+    <w:bookmarkEnd w:id="22"/>
+    <w:bookmarkStart w:id="23" w:name="สรปทายบท"/>
     <w:p>
       <w:pPr>
         <w:pStyle w:val="Heading2"/>
@@ -1772,11 +3513,95 @@
         <w:pStyle w:val="FirstParagraph"/>
       </w:pPr>
       <w:r>
-        <w:t xml:space="preserve">บทที่ 3 นี้ได้กำหนด (1) รายการวัสดุและอุปกรณ์สำหรับระบบหลัก ESP32 + 24 V / 100 VA, (2) ขั้นตอนการดำเนินงาน 6 ระยะตั้งแต่ศึกษาทฤษฎีถึงเขียนรายงาน และ (3) แผนสำรองสถาปัตยกรรม C2000 + GaN + LiFePO4 48 V พร้อมเกณฑ์การตัดสินใจเชิงปริมาณสำหรับการเปลี่ยนสถาปัตยกรรม ผลการดำเนินงานจริงและการทดลองในแต่ละระยะจะถูกนำเสนอในบทที่ 4 ต่อไป</w:t>
-      </w:r>
-    </w:p>
-    <w:bookmarkEnd w:id="22"/>
+        <w:t xml:space="preserve">บทที่ 3 นี้ได้กำหนดจุดออกแบบที่ล็อกแล้ว (Option A: 40 V / 100 W / ESP32 + DRV8302 /</w:t>
+      </w:r>
+      <w:r>
+        <w:t xml:space="preserve"> </w:t>
+      </w:r>
+      <m:oMath>
+        <m:sSub>
+          <m:e>
+            <m:r>
+              <m:t>L</m:t>
+            </m:r>
+          </m:e>
+          <m:sub>
+            <m:r>
+              <m:t>f</m:t>
+            </m:r>
+          </m:sub>
+        </m:sSub>
+      </m:oMath>
+      <w:r>
+        <w:t xml:space="preserve"> </w:t>
+      </w:r>
+      <w:r>
+        <w:t xml:space="preserve">1.2 mH,</w:t>
+      </w:r>
+      <w:r>
+        <w:t xml:space="preserve"> </w:t>
+      </w:r>
+      <m:oMath>
+        <m:sSub>
+          <m:e>
+            <m:r>
+              <m:t>C</m:t>
+            </m:r>
+          </m:e>
+          <m:sub>
+            <m:r>
+              <m:t>f</m:t>
+            </m:r>
+          </m:sub>
+        </m:sSub>
+      </m:oMath>
+      <w:r>
+        <w:t xml:space="preserve"> </w:t>
+      </w:r>
+      <w:r>
+        <w:t xml:space="preserve">10 µF,</w:t>
+      </w:r>
+      <w:r>
+        <w:t xml:space="preserve"> </w:t>
+      </w:r>
+      <m:oMath>
+        <m:sSub>
+          <m:e>
+            <m:r>
+              <m:t>R</m:t>
+            </m:r>
+          </m:e>
+          <m:sub>
+            <m:r>
+              <m:t>d</m:t>
+            </m:r>
+          </m:sub>
+        </m:sSub>
+      </m:oMath>
+      <w:r>
+        <w:t xml:space="preserve"> </w:t>
+      </w:r>
+      <w:r>
+        <w:t xml:space="preserve">1 Ω) ซึ่งทุกค่าสอดคล้องกับแบบจำลอง Stage 5c ที่ตรวจสอบในบทที่ 4 และเฟิร์มแวร์</w:t>
+      </w:r>
+      <w:r>
+        <w:t xml:space="preserve"> </w:t>
+      </w:r>
+      <w:r>
+        <w:rPr>
+          <w:rStyle w:val="VerbatimChar"/>
+        </w:rPr>
+        <w:t xml:space="preserve">vsg_controller.ino</w:t>
+      </w:r>
+      <w:r>
+        <w:t xml:space="preserve"> </w:t>
+      </w:r>
+      <w:r>
+        <w:t xml:space="preserve">พร้อมรายการวัสดุ ขั้นตอนการดำเนินงาน 6 ระยะ สรุปโครงสร้างควบคุมที่ port จากแบบจำลอง และแผนทางเลือกประสิทธิภาพสูงสำหรับงานต่อยอด รายละเอียดการออกแบบฮาร์ดแวร์เชิงลึกและระบบป้องกันนำเสนอในบทที่ 5 และผลการทดสอบจริงเทียบแบบจำลองในบทที่ 6</w:t>
+      </w:r>
+    </w:p>
     <w:bookmarkEnd w:id="23"/>
+    <w:bookmarkEnd w:id="24"/>
     <w:sectPr>
       <w:footnotePr>
         <w:numRestart w:val="eachSect"/>
@@ -1970,109 +3795,6 @@
       <w:pPr>
         <w:ind w:left="6480" w:hanging="360"/>
       </w:pPr>
-    </w:lvl>
-  </w:abstractNum>
-  <w:abstractNum w:abstractNumId="991">
-    <w:nsid w:val="0000A991"/>
-    <w:multiLevelType w:val="multilevel"/>
-    <w:lvl w:ilvl="0">
-      <w:numFmt w:val="bullet"/>
-      <w:lvlText w:val=""/>
-      <w:lvlJc w:val="left"/>
-      <w:pPr>
-        <w:ind w:left="720" w:hanging="360"/>
-      </w:pPr>
-      <w:rPr>
-        <w:rFonts w:ascii="Symbol" w:hAnsi="Symbol" w:cs="Symbol" w:hint="default"/>
-      </w:rPr>
-    </w:lvl>
-    <w:lvl w:ilvl="1">
-      <w:numFmt w:val="bullet"/>
-      <w:lvlText w:val="o"/>
-      <w:lvlJc w:val="left"/>
-      <w:pPr>
-        <w:ind w:left="1440" w:hanging="360"/>
-      </w:pPr>
-      <w:rPr>
-        <w:rFonts w:ascii="Courier New" w:hAnsi="Courier New" w:cs="Courier New" w:hint="default"/>
-      </w:rPr>
-    </w:lvl>
-    <w:lvl w:ilvl="2">
-      <w:numFmt w:val="bullet"/>
-      <w:lvlText w:val=""/>
-      <w:lvlJc w:val="left"/>
-      <w:pPr>
-        <w:ind w:left="2160" w:hanging="360"/>
-      </w:pPr>
-      <w:rPr>
-        <w:rFonts w:ascii="Wingdings" w:hAnsi="Wingdings" w:cs="Wingdings" w:hint="default"/>
-      </w:rPr>
-    </w:lvl>
-    <w:lvl w:ilvl="3">
-      <w:numFmt w:val="bullet"/>
-      <w:lvlText w:val=""/>
-      <w:lvlJc w:val="left"/>
-      <w:pPr>
-        <w:ind w:left="2880" w:hanging="360"/>
-      </w:pPr>
-      <w:rPr>
-        <w:rFonts w:ascii="Symbol" w:hAnsi="Symbol" w:cs="Symbol" w:hint="default"/>
-      </w:rPr>
-    </w:lvl>
-    <w:lvl w:ilvl="4">
-      <w:numFmt w:val="bullet"/>
-      <w:lvlText w:val="o"/>
-      <w:lvlJc w:val="left"/>
-      <w:pPr>
-        <w:ind w:left="3600" w:hanging="360"/>
-      </w:pPr>
-      <w:rPr>
-        <w:rFonts w:ascii="Courier New" w:hAnsi="Courier New" w:cs="Courier New" w:hint="default"/>
-      </w:rPr>
-    </w:lvl>
-    <w:lvl w:ilvl="5">
-      <w:numFmt w:val="bullet"/>
-      <w:lvlText w:val=""/>
-      <w:lvlJc w:val="left"/>
-      <w:pPr>
-        <w:ind w:left="4320" w:hanging="360"/>
-      </w:pPr>
-      <w:rPr>
-        <w:rFonts w:ascii="Wingdings" w:hAnsi="Wingdings" w:cs="Wingdings" w:hint="default"/>
-      </w:rPr>
-    </w:lvl>
-    <w:lvl w:ilvl="6">
-      <w:numFmt w:val="bullet"/>
-      <w:lvlText w:val=""/>
-      <w:lvlJc w:val="left"/>
-      <w:pPr>
-        <w:ind w:left="5040" w:hanging="360"/>
-      </w:pPr>
-      <w:rPr>
-        <w:rFonts w:ascii="Symbol" w:hAnsi="Symbol" w:cs="Symbol" w:hint="default"/>
-      </w:rPr>
-    </w:lvl>
-    <w:lvl w:ilvl="7">
-      <w:numFmt w:val="bullet"/>
-      <w:lvlText w:val="o"/>
-      <w:lvlJc w:val="left"/>
-      <w:pPr>
-        <w:ind w:left="5760" w:hanging="360"/>
-      </w:pPr>
-      <w:rPr>
-        <w:rFonts w:ascii="Courier New" w:hAnsi="Courier New" w:cs="Courier New" w:hint="default"/>
-      </w:rPr>
-    </w:lvl>
-    <w:lvl w:ilvl="8">
-      <w:numFmt w:val="bullet"/>
-      <w:lvlText w:val=""/>
-      <w:lvlJc w:val="left"/>
-      <w:pPr>
-        <w:ind w:left="6480" w:hanging="360"/>
-      </w:pPr>
-      <w:rPr>
-        <w:rFonts w:ascii="Wingdings" w:hAnsi="Wingdings" w:cs="Wingdings" w:hint="default"/>
-      </w:rPr>
     </w:lvl>
   </w:abstractNum>
   <w:num w:numId="1000">
@@ -2107,39 +3829,6 @@
     <w:lvlOverride w:ilvl="8">
       <w:startOverride w:val="1"/>
     </w:lvlOverride>
-  </w:num>
-  <w:num w:numId="1002">
-    <w:abstractNumId w:val="99411"/>
-    <w:lvlOverride w:ilvl="0">
-      <w:startOverride w:val="1"/>
-    </w:lvlOverride>
-    <w:lvlOverride w:ilvl="1">
-      <w:startOverride w:val="1"/>
-    </w:lvlOverride>
-    <w:lvlOverride w:ilvl="2">
-      <w:startOverride w:val="1"/>
-    </w:lvlOverride>
-    <w:lvlOverride w:ilvl="3">
-      <w:startOverride w:val="1"/>
-    </w:lvlOverride>
-    <w:lvlOverride w:ilvl="4">
-      <w:startOverride w:val="1"/>
-    </w:lvlOverride>
-    <w:lvlOverride w:ilvl="5">
-      <w:startOverride w:val="1"/>
-    </w:lvlOverride>
-    <w:lvlOverride w:ilvl="6">
-      <w:startOverride w:val="1"/>
-    </w:lvlOverride>
-    <w:lvlOverride w:ilvl="7">
-      <w:startOverride w:val="1"/>
-    </w:lvlOverride>
-    <w:lvlOverride w:ilvl="8">
-      <w:startOverride w:val="1"/>
-    </w:lvlOverride>
-  </w:num>
-  <w:num w:numId="1003">
-    <w:abstractNumId w:val="991"/>
   </w:num>
 </w:numbering>
 </file>

</xml_diff>

<commit_message>
feat: budget-fit BoM (7200 THB) + discrete IR2104 power stage
Budget constraint: 7,200 THB total, student pays for blow-ups.
Lab provides DC supply + scope + tools (free).

Power stage: DRV8302 shield -> discrete 6x IRF540N + 3x IR2104.
Rationale: blow-up recovery ~20 THB/MOSFET vs ~1200 THB/shield;
IR2104 gives internal ~520ns dead-time (anti shoot-through).

firmware: DRV8302 EN/nFAULT/nOCTW -> IR2104 common SD/enable +
LM393 OCP comparator on FAULT pin. Control core unchanged.
Ch.3: costed THB BoM (~5,420, ~1,780 blow-up reserve), phased
build (no-battery phase 1), DRV8302/UCC21520 as alternatives.
Ch.5 §5.3: budget note (discrete primary, shield = upgrade).

Co-Authored-By: Claude Opus 4.8 <noreply@anthropic.com>
</commit_message>
<xml_diff>
--- a/docs/thesis/chapter3_methodology.docx
+++ b/docs/thesis/chapter3_methodology.docx
@@ -120,7 +120,7 @@
         <w:t xml:space="preserve"> </w:t>
       </w:r>
       <w:r>
-        <w:t xml:space="preserve">DC bus 40 V, ESP32 + DRV8302 shield, 100 W,</w:t>
+        <w:t xml:space="preserve">DC bus 40 V, ESP32 + ภาคกำลังดิสครีต (IRF540N + IR2104), 100 W,</w:t>
       </w:r>
       <w:r>
         <w:t xml:space="preserve"> </w:t>
@@ -235,6 +235,22 @@
       <w:r>
         <w:t xml:space="preserve">ทุกค่า</w:t>
       </w:r>
+      <w:r>
+        <w:t xml:space="preserve"> </w:t>
+      </w:r>
+      <w:r>
+        <w:rPr>
+          <w:b/>
+          <w:bCs/>
+        </w:rPr>
+        <w:t xml:space="preserve">งบประมาณ:</w:t>
+      </w:r>
+      <w:r>
+        <w:t xml:space="preserve"> </w:t>
+      </w:r>
+      <w:r>
+        <w:t xml:space="preserve">7,200 บาท (ใช้ DC supply + สโคป + เครื่องมือจากแล็บ SUT)</w:t>
+      </w:r>
     </w:p>
     <w:p>
       <w:r>
@@ -448,7 +464,7 @@
               <w:pStyle w:val="Compact"/>
             </w:pPr>
             <w:r>
-              <w:t xml:space="preserve">DRV8302 พิกัดสูงสุด 60 V → derate 67% ปลอดภัย</w:t>
+              <w:t xml:space="preserve">IRF540N 100 V → 40 V ใช้แค่ 40% ปลอดภัยมาก + กัน overmodulation</w:t>
             </w:r>
           </w:p>
         </w:tc>
@@ -1379,13 +1395,44 @@
           <w:b/>
           <w:bCs/>
         </w:rPr>
+        <w:t xml:space="preserve">งบประมาณโครงงาน: 7,200 บาท</w:t>
+      </w:r>
+      <w:r>
+        <w:t xml:space="preserve"> </w:t>
+      </w:r>
+      <w:r>
+        <w:t xml:space="preserve">(รวมทุกอย่างที่ต้องจัดซื้อ; อุปกรณ์แล็บ SUT ที่ยืมได้ไม่นับงบ) ภาคกำลังเลือกแบบ</w:t>
+      </w:r>
+      <w:r>
+        <w:rPr>
+          <w:b/>
+          <w:bCs/>
+        </w:rPr>
+        <w:t xml:space="preserve">ดิสครีต</w:t>
+      </w:r>
+      <w:r>
+        <w:t xml:space="preserve"> </w:t>
+      </w:r>
+      <w:r>
+        <w:t xml:space="preserve">(IRF540N + IR2104) แทนบอร์ดสำเร็จ DRV8302 เพื่อให้ฟื้นจากความเสียหายได้ด้วยต้นทุนต่ำ (เปลี่ยน MOSFET ตัวละ ~20 ฿ แทนการเสียทั้งบอร์ด)</w:t>
+      </w:r>
+    </w:p>
+    <w:p>
+      <w:pPr>
+        <w:pStyle w:val="BodyText"/>
+      </w:pPr>
+      <w:r>
+        <w:rPr>
+          <w:b/>
+          <w:bCs/>
+        </w:rPr>
         <w:t xml:space="preserve">ตารางที่ 3.2</w:t>
       </w:r>
       <w:r>
         <w:t xml:space="preserve"> </w:t>
       </w:r>
       <w:r>
-        <w:t xml:space="preserve">รายการวัสดุและอุปกรณ์สำหรับระบบ VSG islanded (ESP32 + DRV8302, 40 V / 100 W)</w:t>
+        <w:t xml:space="preserve">รายการวัสดุที่ต้องจัดซื้อ (Option A, 40 V / 100 W, ภาคกำลังดิสครีต) — ราคาประมาณการตลาดไทย (Shopee/Lazada/ร้านอิเล็กทรอนิกส์)</w:t>
       </w:r>
     </w:p>
     <w:tbl>
@@ -1424,29 +1471,18 @@
               <w:pStyle w:val="Compact"/>
             </w:pPr>
             <w:r>
-              <w:t xml:space="preserve">รายการอุปกรณ์</w:t>
-            </w:r>
-          </w:p>
-        </w:tc>
-        <w:tc>
-          <w:tcPr/>
-          <w:p>
-            <w:pPr>
-              <w:pStyle w:val="Compact"/>
-            </w:pPr>
-            <w:r>
-              <w:t xml:space="preserve">รหัส / ข้อมูลจำเพาะ</w:t>
-            </w:r>
-          </w:p>
-        </w:tc>
-        <w:tc>
-          <w:tcPr/>
-          <w:p>
-            <w:pPr>
-              <w:pStyle w:val="Compact"/>
-            </w:pPr>
-            <w:r>
-              <w:t xml:space="preserve">หน้าที่</w:t>
+              <w:t xml:space="preserve">รายการ</w:t>
+            </w:r>
+          </w:p>
+        </w:tc>
+        <w:tc>
+          <w:tcPr/>
+          <w:p>
+            <w:pPr>
+              <w:pStyle w:val="Compact"/>
+            </w:pPr>
+            <w:r>
+              <w:t xml:space="preserve">สเปก / หน้าที่</w:t>
             </w:r>
           </w:p>
         </w:tc>
@@ -1458,6 +1494,17 @@
             </w:pPr>
             <w:r>
               <w:t xml:space="preserve">จำนวน</w:t>
+            </w:r>
+          </w:p>
+        </w:tc>
+        <w:tc>
+          <w:tcPr/>
+          <w:p>
+            <w:pPr>
+              <w:pStyle w:val="Compact"/>
+            </w:pPr>
+            <w:r>
+              <w:t xml:space="preserve">ราคา (฿)</w:t>
             </w:r>
           </w:p>
         </w:tc>
@@ -1481,40 +1528,40 @@
               <w:pStyle w:val="Compact"/>
             </w:pPr>
             <w:r>
-              <w:t xml:space="preserve">บอร์ดประมวลผลหลัก</w:t>
-            </w:r>
-          </w:p>
-        </w:tc>
-        <w:tc>
-          <w:tcPr/>
-          <w:p>
-            <w:pPr>
-              <w:pStyle w:val="Compact"/>
-            </w:pPr>
-            <w:r>
-              <w:t xml:space="preserve">ESP32-WROOM-32D</w:t>
-            </w:r>
-          </w:p>
-        </w:tc>
-        <w:tc>
-          <w:tcPr/>
-          <w:p>
-            <w:pPr>
-              <w:pStyle w:val="Compact"/>
-            </w:pPr>
-            <w:r>
-              <w:t xml:space="preserve">รันอัลกอริทึม VSG + สร้าง 3-phase PWM ที่ 10 kHz</w:t>
-            </w:r>
-          </w:p>
-        </w:tc>
-        <w:tc>
-          <w:tcPr/>
-          <w:p>
-            <w:pPr>
-              <w:pStyle w:val="Compact"/>
-            </w:pPr>
-            <w:r>
-              <w:t xml:space="preserve">1</w:t>
+              <w:t xml:space="preserve">ESP32-WROOM-32 (+สำรอง 1)</w:t>
+            </w:r>
+          </w:p>
+        </w:tc>
+        <w:tc>
+          <w:tcPr/>
+          <w:p>
+            <w:pPr>
+              <w:pStyle w:val="Compact"/>
+            </w:pPr>
+            <w:r>
+              <w:t xml:space="preserve">บอร์ดประมวลผลหลัก รัน VSG + 3-phase PWM 10 kHz</w:t>
+            </w:r>
+          </w:p>
+        </w:tc>
+        <w:tc>
+          <w:tcPr/>
+          <w:p>
+            <w:pPr>
+              <w:pStyle w:val="Compact"/>
+            </w:pPr>
+            <w:r>
+              <w:t xml:space="preserve">2</w:t>
+            </w:r>
+          </w:p>
+        </w:tc>
+        <w:tc>
+          <w:tcPr/>
+          <w:p>
+            <w:pPr>
+              <w:pStyle w:val="Compact"/>
+            </w:pPr>
+            <w:r>
+              <w:t xml:space="preserve">300</w:t>
             </w:r>
           </w:p>
         </w:tc>
@@ -1538,40 +1585,40 @@
               <w:pStyle w:val="Compact"/>
             </w:pPr>
             <w:r>
-              <w:t xml:space="preserve">บอร์ดกำลังอินเวอร์เตอร์ 3 เฟส</w:t>
-            </w:r>
-          </w:p>
-        </w:tc>
-        <w:tc>
-          <w:tcPr/>
-          <w:p>
-            <w:pPr>
-              <w:pStyle w:val="Compact"/>
-            </w:pPr>
-            <w:r>
-              <w:t xml:space="preserve">DRV8302 MOSFET Shield (8–60 V, 30 A peak)</w:t>
-            </w:r>
-          </w:p>
-        </w:tc>
-        <w:tc>
-          <w:tcPr/>
-          <w:p>
-            <w:pPr>
-              <w:pStyle w:val="Compact"/>
-            </w:pPr>
-            <w:r>
-              <w:t xml:space="preserve">สวิตชิ่งกำลัง DC→AC, มี buck + current-sense + ป้องกันในตัว</w:t>
-            </w:r>
-          </w:p>
-        </w:tc>
-        <w:tc>
-          <w:tcPr/>
-          <w:p>
-            <w:pPr>
-              <w:pStyle w:val="Compact"/>
-            </w:pPr>
-            <w:r>
-              <w:t xml:space="preserve">1</w:t>
+              <w:t xml:space="preserve">MOSFET IRF540N (+สำรอง 6)</w:t>
+            </w:r>
+          </w:p>
+        </w:tc>
+        <w:tc>
+          <w:tcPr/>
+          <w:p>
+            <w:pPr>
+              <w:pStyle w:val="Compact"/>
+            </w:pPr>
+            <w:r>
+              <w:t xml:space="preserve">100 V, 33 A — สะพาน 3 เฟส 2-ระดับ</w:t>
+            </w:r>
+          </w:p>
+        </w:tc>
+        <w:tc>
+          <w:tcPr/>
+          <w:p>
+            <w:pPr>
+              <w:pStyle w:val="Compact"/>
+            </w:pPr>
+            <w:r>
+              <w:t xml:space="preserve">12</w:t>
+            </w:r>
+          </w:p>
+        </w:tc>
+        <w:tc>
+          <w:tcPr/>
+          <w:p>
+            <w:pPr>
+              <w:pStyle w:val="Compact"/>
+            </w:pPr>
+            <w:r>
+              <w:t xml:space="preserve">250</w:t>
             </w:r>
           </w:p>
         </w:tc>
@@ -1595,40 +1642,40 @@
               <w:pStyle w:val="Compact"/>
             </w:pPr>
             <w:r>
-              <w:t xml:space="preserve">บอร์ดแปลงสัญญาณอนาล็อก</w:t>
-            </w:r>
-          </w:p>
-        </w:tc>
-        <w:tc>
-          <w:tcPr/>
-          <w:p>
-            <w:pPr>
-              <w:pStyle w:val="Compact"/>
-            </w:pPr>
-            <w:r>
-              <w:t xml:space="preserve">AD7606 (16-bit, 8-ch simultaneous, 200 kSPS)</w:t>
-            </w:r>
-          </w:p>
-        </w:tc>
-        <w:tc>
-          <w:tcPr/>
-          <w:p>
-            <w:pPr>
-              <w:pStyle w:val="Compact"/>
-            </w:pPr>
-            <w:r>
-              <w:t xml:space="preserve">แปลงสัญญาณ V/I พร้อมกัน ขจัด phase skew</w:t>
-            </w:r>
-          </w:p>
-        </w:tc>
-        <w:tc>
-          <w:tcPr/>
-          <w:p>
-            <w:pPr>
-              <w:pStyle w:val="Compact"/>
-            </w:pPr>
-            <w:r>
-              <w:t xml:space="preserve">1</w:t>
+              <w:t xml:space="preserve">เกตไดรเวอร์ IR2104 (+สำรอง 1)</w:t>
+            </w:r>
+          </w:p>
+        </w:tc>
+        <w:tc>
+          <w:tcPr/>
+          <w:p>
+            <w:pPr>
+              <w:pStyle w:val="Compact"/>
+            </w:pPr>
+            <w:r>
+              <w:t xml:space="preserve">half-bridge, dead-time ~520 ns ในตัว (กัน shoot-through)</w:t>
+            </w:r>
+          </w:p>
+        </w:tc>
+        <w:tc>
+          <w:tcPr/>
+          <w:p>
+            <w:pPr>
+              <w:pStyle w:val="Compact"/>
+            </w:pPr>
+            <w:r>
+              <w:t xml:space="preserve">4</w:t>
+            </w:r>
+          </w:p>
+        </w:tc>
+        <w:tc>
+          <w:tcPr/>
+          <w:p>
+            <w:pPr>
+              <w:pStyle w:val="Compact"/>
+            </w:pPr>
+            <w:r>
+              <w:t xml:space="preserve">150</w:t>
             </w:r>
           </w:p>
         </w:tc>
@@ -1652,44 +1699,40 @@
               <w:pStyle w:val="Compact"/>
             </w:pPr>
             <w:r>
-              <w:t xml:space="preserve">เซ็นเซอร์กระแสรายเฟส</w:t>
-            </w:r>
-          </w:p>
-        </w:tc>
-        <w:tc>
-          <w:tcPr/>
-          <w:p>
-            <w:pPr>
-              <w:pStyle w:val="Compact"/>
-            </w:pPr>
-            <w:r>
-              <w:rPr>
-                <w:b/>
-                <w:bCs/>
-              </w:rPr>
-              <w:t xml:space="preserve">ACS712-20A (±20 A, 100 mV/A)</w:t>
-            </w:r>
-          </w:p>
-        </w:tc>
-        <w:tc>
-          <w:tcPr/>
-          <w:p>
-            <w:pPr>
-              <w:pStyle w:val="Compact"/>
-            </w:pPr>
-            <w:r>
-              <w:t xml:space="preserve">วัดกระแสเอาต์พุต (พีคโหลด ~6.5 A → ต้องใช้ย่าน ±20 A)</w:t>
-            </w:r>
-          </w:p>
-        </w:tc>
-        <w:tc>
-          <w:tcPr/>
-          <w:p>
-            <w:pPr>
-              <w:pStyle w:val="Compact"/>
-            </w:pPr>
-            <w:r>
-              <w:t xml:space="preserve">3</w:t>
+              <w:t xml:space="preserve">bootstrap diode + cap + gate R 22 Ω</w:t>
+            </w:r>
+          </w:p>
+        </w:tc>
+        <w:tc>
+          <w:tcPr/>
+          <w:p>
+            <w:pPr>
+              <w:pStyle w:val="Compact"/>
+            </w:pPr>
+            <w:r>
+              <w:t xml:space="preserve">UF4007 ฯลฯ — วงจรขับเกต</w:t>
+            </w:r>
+          </w:p>
+        </w:tc>
+        <w:tc>
+          <w:tcPr/>
+          <w:p>
+            <w:pPr>
+              <w:pStyle w:val="Compact"/>
+            </w:pPr>
+            <w:r>
+              <w:t xml:space="preserve">1 ชุด</w:t>
+            </w:r>
+          </w:p>
+        </w:tc>
+        <w:tc>
+          <w:tcPr/>
+          <w:p>
+            <w:pPr>
+              <w:pStyle w:val="Compact"/>
+            </w:pPr>
+            <w:r>
+              <w:t xml:space="preserve">100</w:t>
             </w:r>
           </w:p>
         </w:tc>
@@ -1713,29 +1756,121 @@
               <w:pStyle w:val="Compact"/>
             </w:pPr>
             <w:r>
-              <w:t xml:space="preserve">ตัวเหนี่ยวนำฟิลเตอร์</w:t>
-            </w:r>
-          </w:p>
-        </w:tc>
-        <w:tc>
-          <w:tcPr/>
-          <w:p>
-            <w:pPr>
-              <w:pStyle w:val="Compact"/>
-            </w:pPr>
-            <w:r>
-              <w:t xml:space="preserve">1.2 mH, ทนกระแส ≥ 10 A, แกน Sendust</w:t>
-            </w:r>
-          </w:p>
-        </w:tc>
-        <w:tc>
-          <w:tcPr/>
-          <w:p>
-            <w:pPr>
-              <w:pStyle w:val="Compact"/>
-            </w:pPr>
-            <w:r>
-              <w:t xml:space="preserve">ตัวกรองฮาร์มอนิก</w:t>
+              <w:t xml:space="preserve">ADC AD7606 module</w:t>
+            </w:r>
+          </w:p>
+        </w:tc>
+        <w:tc>
+          <w:tcPr/>
+          <w:p>
+            <w:pPr>
+              <w:pStyle w:val="Compact"/>
+            </w:pPr>
+            <w:r>
+              <w:t xml:space="preserve">16-bit, 8-ch simultaneous, 200 kSPS — ขจัด phase skew</w:t>
+            </w:r>
+          </w:p>
+        </w:tc>
+        <w:tc>
+          <w:tcPr/>
+          <w:p>
+            <w:pPr>
+              <w:pStyle w:val="Compact"/>
+            </w:pPr>
+            <w:r>
+              <w:t xml:space="preserve">1</w:t>
+            </w:r>
+          </w:p>
+        </w:tc>
+        <w:tc>
+          <w:tcPr/>
+          <w:p>
+            <w:pPr>
+              <w:pStyle w:val="Compact"/>
+            </w:pPr>
+            <w:r>
+              <w:t xml:space="preserve">1,500</w:t>
+            </w:r>
+          </w:p>
+        </w:tc>
+      </w:tr>
+      <w:tr>
+        <w:tc>
+          <w:tcPr/>
+          <w:p>
+            <w:pPr>
+              <w:pStyle w:val="Compact"/>
+            </w:pPr>
+            <w:r>
+              <w:t xml:space="preserve">6</w:t>
+            </w:r>
+          </w:p>
+        </w:tc>
+        <w:tc>
+          <w:tcPr/>
+          <w:p>
+            <w:pPr>
+              <w:pStyle w:val="Compact"/>
+            </w:pPr>
+            <w:r>
+              <w:t xml:space="preserve">เซ็นเซอร์กระแส ACS712-20A</w:t>
+            </w:r>
+          </w:p>
+        </w:tc>
+        <w:tc>
+          <w:tcPr/>
+          <w:p>
+            <w:pPr>
+              <w:pStyle w:val="Compact"/>
+            </w:pPr>
+            <w:r>
+              <w:t xml:space="preserve">±20 A, 100 mV/A (พีคโหลด ~6.5 A)</w:t>
+            </w:r>
+          </w:p>
+        </w:tc>
+        <w:tc>
+          <w:tcPr/>
+          <w:p>
+            <w:pPr>
+              <w:pStyle w:val="Compact"/>
+            </w:pPr>
+            <w:r>
+              <w:t xml:space="preserve">3</w:t>
+            </w:r>
+          </w:p>
+        </w:tc>
+        <w:tc>
+          <w:tcPr/>
+          <w:p>
+            <w:pPr>
+              <w:pStyle w:val="Compact"/>
+            </w:pPr>
+            <w:r>
+              <w:t xml:space="preserve">180</w:t>
+            </w:r>
+          </w:p>
+        </w:tc>
+      </w:tr>
+      <w:tr>
+        <w:tc>
+          <w:tcPr/>
+          <w:p>
+            <w:pPr>
+              <w:pStyle w:val="Compact"/>
+            </w:pPr>
+            <w:r>
+              <w:t xml:space="preserve">7</w:t>
+            </w:r>
+          </w:p>
+        </w:tc>
+        <w:tc>
+          <w:tcPr/>
+          <w:p>
+            <w:pPr>
+              <w:pStyle w:val="Compact"/>
+            </w:pPr>
+            <w:r>
+              <w:t xml:space="preserve">ตัวเหนี่ยวนำ</w:t>
             </w:r>
             <w:r>
               <w:t xml:space="preserve"> </w:t>
@@ -1758,7 +1893,18 @@
               <w:t xml:space="preserve"> </w:t>
             </w:r>
             <w:r>
-              <w:t xml:space="preserve">(ห้ามใช้แกนเฟอร์ไรต์)</w:t>
+              <w:t xml:space="preserve">1.2 mH ≥10 A</w:t>
+            </w:r>
+          </w:p>
+        </w:tc>
+        <w:tc>
+          <w:tcPr/>
+          <w:p>
+            <w:pPr>
+              <w:pStyle w:val="Compact"/>
+            </w:pPr>
+            <w:r>
+              <w:t xml:space="preserve">แกน Sendust (พันเองได้) — ห้ามใช้เฟอร์ไรต์</w:t>
             </w:r>
           </w:p>
         </w:tc>
@@ -1770,6 +1916,17 @@
             </w:pPr>
             <w:r>
               <w:t xml:space="preserve">3</w:t>
+            </w:r>
+          </w:p>
+        </w:tc>
+        <w:tc>
+          <w:tcPr/>
+          <w:p>
+            <w:pPr>
+              <w:pStyle w:val="Compact"/>
+            </w:pPr>
+            <w:r>
+              <w:t xml:space="preserve">450</w:t>
             </w:r>
           </w:p>
         </w:tc>
@@ -1782,40 +1939,18 @@
               <w:pStyle w:val="Compact"/>
             </w:pPr>
             <w:r>
-              <w:t xml:space="preserve">6</w:t>
-            </w:r>
-          </w:p>
-        </w:tc>
-        <w:tc>
-          <w:tcPr/>
-          <w:p>
-            <w:pPr>
-              <w:pStyle w:val="Compact"/>
-            </w:pPr>
-            <w:r>
-              <w:t xml:space="preserve">ตัวเก็บประจุฟิลเตอร์</w:t>
-            </w:r>
-          </w:p>
-        </w:tc>
-        <w:tc>
-          <w:tcPr/>
-          <w:p>
-            <w:pPr>
-              <w:pStyle w:val="Compact"/>
-            </w:pPr>
-            <w:r>
-              <w:t xml:space="preserve">10 µF, 100 V AC, โพลิโพรพิลีนฟิล์ม</w:t>
-            </w:r>
-          </w:p>
-        </w:tc>
-        <w:tc>
-          <w:tcPr/>
-          <w:p>
-            <w:pPr>
-              <w:pStyle w:val="Compact"/>
-            </w:pPr>
-            <w:r>
-              <w:t xml:space="preserve">ตัวกรองฮาร์มอนิก</w:t>
+              <w:t xml:space="preserve">8</w:t>
+            </w:r>
+          </w:p>
+        </w:tc>
+        <w:tc>
+          <w:tcPr/>
+          <w:p>
+            <w:pPr>
+              <w:pStyle w:val="Compact"/>
+            </w:pPr>
+            <w:r>
+              <w:t xml:space="preserve">ตัวเก็บประจุ</w:t>
             </w:r>
             <w:r>
               <w:t xml:space="preserve"> </w:t>
@@ -1838,18 +1973,40 @@
               <w:t xml:space="preserve"> </w:t>
             </w:r>
             <w:r>
-              <w:t xml:space="preserve">(ห้ามใช้เซรามิก/อิเล็กโทรไลต์)</w:t>
-            </w:r>
-          </w:p>
-        </w:tc>
-        <w:tc>
-          <w:tcPr/>
-          <w:p>
-            <w:pPr>
-              <w:pStyle w:val="Compact"/>
-            </w:pPr>
-            <w:r>
-              <w:t xml:space="preserve">3</w:t>
+              <w:t xml:space="preserve">10 µF 100 VAC film (+สำรอง)</w:t>
+            </w:r>
+          </w:p>
+        </w:tc>
+        <w:tc>
+          <w:tcPr/>
+          <w:p>
+            <w:pPr>
+              <w:pStyle w:val="Compact"/>
+            </w:pPr>
+            <w:r>
+              <w:t xml:space="preserve">CBB/MKP — ห้ามใช้เซรามิก/อิเล็กโทรไลต์</w:t>
+            </w:r>
+          </w:p>
+        </w:tc>
+        <w:tc>
+          <w:tcPr/>
+          <w:p>
+            <w:pPr>
+              <w:pStyle w:val="Compact"/>
+            </w:pPr>
+            <w:r>
+              <w:t xml:space="preserve">4</w:t>
+            </w:r>
+          </w:p>
+        </w:tc>
+        <w:tc>
+          <w:tcPr/>
+          <w:p>
+            <w:pPr>
+              <w:pStyle w:val="Compact"/>
+            </w:pPr>
+            <w:r>
+              <w:t xml:space="preserve">250</w:t>
             </w:r>
           </w:p>
         </w:tc>
@@ -1862,7 +2019,7 @@
               <w:pStyle w:val="Compact"/>
             </w:pPr>
             <w:r>
-              <w:t xml:space="preserve">7</w:t>
+              <w:t xml:space="preserve">9</w:t>
             </w:r>
           </w:p>
         </w:tc>
@@ -1874,28 +2031,6 @@
             </w:pPr>
             <w:r>
               <w:t xml:space="preserve">ตัวต้านทานหน่วง</w:t>
-            </w:r>
-          </w:p>
-        </w:tc>
-        <w:tc>
-          <w:tcPr/>
-          <w:p>
-            <w:pPr>
-              <w:pStyle w:val="Compact"/>
-            </w:pPr>
-            <w:r>
-              <w:t xml:space="preserve">1 Ω, 25 W ตัวถังอลูมิเนียม</w:t>
-            </w:r>
-          </w:p>
-        </w:tc>
-        <w:tc>
-          <w:tcPr/>
-          <w:p>
-            <w:pPr>
-              <w:pStyle w:val="Compact"/>
-            </w:pPr>
-            <w:r>
-              <w:t xml:space="preserve">หน่วงเรโซแนนซ์ฟิลเตอร์</w:t>
             </w:r>
             <w:r>
               <w:t xml:space="preserve"> </w:t>
@@ -1918,25 +2053,19 @@
               <w:t xml:space="preserve"> </w:t>
             </w:r>
             <w:r>
-              <w:t xml:space="preserve">อนุกรมกับ</w:t>
-            </w:r>
-            <w:r>
-              <w:t xml:space="preserve"> </w:t>
-            </w:r>
-            <m:oMath>
-              <m:sSub>
-                <m:e>
-                  <m:r>
-                    <m:t>C</m:t>
-                  </m:r>
-                </m:e>
-                <m:sub>
-                  <m:r>
-                    <m:t>f</m:t>
-                  </m:r>
-                </m:sub>
-              </m:sSub>
-            </m:oMath>
+              <w:t xml:space="preserve">1 Ω 25 W</w:t>
+            </w:r>
+          </w:p>
+        </w:tc>
+        <w:tc>
+          <w:tcPr/>
+          <w:p>
+            <w:pPr>
+              <w:pStyle w:val="Compact"/>
+            </w:pPr>
+            <w:r>
+              <w:t xml:space="preserve">aluminium — หน่วงเรโซแนนซ์ฟิลเตอร์</w:t>
+            </w:r>
           </w:p>
         </w:tc>
         <w:tc>
@@ -1947,6 +2076,17 @@
             </w:pPr>
             <w:r>
               <w:t xml:space="preserve">3</w:t>
+            </w:r>
+          </w:p>
+        </w:tc>
+        <w:tc>
+          <w:tcPr/>
+          <w:p>
+            <w:pPr>
+              <w:pStyle w:val="Compact"/>
+            </w:pPr>
+            <w:r>
+              <w:t xml:space="preserve">100</w:t>
             </w:r>
           </w:p>
         </w:tc>
@@ -1959,40 +2099,29 @@
               <w:pStyle w:val="Compact"/>
             </w:pPr>
             <w:r>
-              <w:t xml:space="preserve">8</w:t>
-            </w:r>
-          </w:p>
-        </w:tc>
-        <w:tc>
-          <w:tcPr/>
-          <w:p>
-            <w:pPr>
-              <w:pStyle w:val="Compact"/>
-            </w:pPr>
-            <w:r>
-              <w:t xml:space="preserve">ชุดแบ่งแรงดัน</w:t>
-            </w:r>
-          </w:p>
-        </w:tc>
-        <w:tc>
-          <w:tcPr/>
-          <w:p>
-            <w:pPr>
-              <w:pStyle w:val="Compact"/>
-            </w:pPr>
-            <w:r>
-              <w:t xml:space="preserve">ตัวต้านทานฟิล์มโลหะ 0.1% (15 kΩ / 5 kΩ) + 2.2 nF</w:t>
-            </w:r>
-          </w:p>
-        </w:tc>
-        <w:tc>
-          <w:tcPr/>
-          <w:p>
-            <w:pPr>
-              <w:pStyle w:val="Compact"/>
-            </w:pPr>
-            <w:r>
-              <w:t xml:space="preserve">ลดทอนแรงดัน AC ก่อนเข้า AD7606 (อัตราส่วน 4)</w:t>
+              <w:t xml:space="preserve">10</w:t>
+            </w:r>
+          </w:p>
+        </w:tc>
+        <w:tc>
+          <w:tcPr/>
+          <w:p>
+            <w:pPr>
+              <w:pStyle w:val="Compact"/>
+            </w:pPr>
+            <w:r>
+              <w:t xml:space="preserve">OCP: LM393 + shunt + passives</w:t>
+            </w:r>
+          </w:p>
+        </w:tc>
+        <w:tc>
+          <w:tcPr/>
+          <w:p>
+            <w:pPr>
+              <w:pStyle w:val="Compact"/>
+            </w:pPr>
+            <w:r>
+              <w:t xml:space="preserve">ป้องกันกระแสเกินฮาร์ดแวร์ → MCPWM FAULT</w:t>
             </w:r>
           </w:p>
         </w:tc>
@@ -2004,6 +2133,17 @@
             </w:pPr>
             <w:r>
               <w:t xml:space="preserve">1 ชุด</w:t>
+            </w:r>
+          </w:p>
+        </w:tc>
+        <w:tc>
+          <w:tcPr/>
+          <w:p>
+            <w:pPr>
+              <w:pStyle w:val="Compact"/>
+            </w:pPr>
+            <w:r>
+              <w:t xml:space="preserve">80</w:t>
             </w:r>
           </w:p>
         </w:tc>
@@ -2016,19 +2156,290 @@
               <w:pStyle w:val="Compact"/>
             </w:pPr>
             <w:r>
-              <w:t xml:space="preserve">9</w:t>
-            </w:r>
-          </w:p>
-        </w:tc>
-        <w:tc>
-          <w:tcPr/>
-          <w:p>
-            <w:pPr>
-              <w:pStyle w:val="Compact"/>
-            </w:pPr>
-            <w:r>
-              <w:t xml:space="preserve">ชุดแบตเตอรี่บัสตรง</w:t>
-            </w:r>
+              <w:t xml:space="preserve">11</w:t>
+            </w:r>
+          </w:p>
+        </w:tc>
+        <w:tc>
+          <w:tcPr/>
+          <w:p>
+            <w:pPr>
+              <w:pStyle w:val="Compact"/>
+            </w:pPr>
+            <w:r>
+              <w:t xml:space="preserve">ตัวแบ่งแรงดัน 0.1% (15k/5k) + 2.2 nF</w:t>
+            </w:r>
+          </w:p>
+        </w:tc>
+        <w:tc>
+          <w:tcPr/>
+          <w:p>
+            <w:pPr>
+              <w:pStyle w:val="Compact"/>
+            </w:pPr>
+            <w:r>
+              <w:t xml:space="preserve">ลดทอน AC ก่อนเข้า AD7606</w:t>
+            </w:r>
+          </w:p>
+        </w:tc>
+        <w:tc>
+          <w:tcPr/>
+          <w:p>
+            <w:pPr>
+              <w:pStyle w:val="Compact"/>
+            </w:pPr>
+            <w:r>
+              <w:t xml:space="preserve">1 ชุด</w:t>
+            </w:r>
+          </w:p>
+        </w:tc>
+        <w:tc>
+          <w:tcPr/>
+          <w:p>
+            <w:pPr>
+              <w:pStyle w:val="Compact"/>
+            </w:pPr>
+            <w:r>
+              <w:t xml:space="preserve">120</w:t>
+            </w:r>
+          </w:p>
+        </w:tc>
+      </w:tr>
+      <w:tr>
+        <w:tc>
+          <w:tcPr/>
+          <w:p>
+            <w:pPr>
+              <w:pStyle w:val="Compact"/>
+            </w:pPr>
+            <w:r>
+              <w:t xml:space="preserve">12</w:t>
+            </w:r>
+          </w:p>
+        </w:tc>
+        <w:tc>
+          <w:tcPr/>
+          <w:p>
+            <w:pPr>
+              <w:pStyle w:val="Compact"/>
+            </w:pPr>
+            <w:r>
+              <w:t xml:space="preserve">TVS P6KE60A + pre-charge R 10 Ω 50 W</w:t>
+            </w:r>
+          </w:p>
+        </w:tc>
+        <w:tc>
+          <w:tcPr/>
+          <w:p>
+            <w:pPr>
+              <w:pStyle w:val="Compact"/>
+            </w:pPr>
+            <w:r>
+              <w:t xml:space="preserve">clamp transient + จำกัด inrush</w:t>
+            </w:r>
+          </w:p>
+        </w:tc>
+        <w:tc>
+          <w:tcPr/>
+          <w:p>
+            <w:pPr>
+              <w:pStyle w:val="Compact"/>
+            </w:pPr>
+            <w:r>
+              <w:t xml:space="preserve">1 ชุด</w:t>
+            </w:r>
+          </w:p>
+        </w:tc>
+        <w:tc>
+          <w:tcPr/>
+          <w:p>
+            <w:pPr>
+              <w:pStyle w:val="Compact"/>
+            </w:pPr>
+            <w:r>
+              <w:t xml:space="preserve">90</w:t>
+            </w:r>
+          </w:p>
+        </w:tc>
+      </w:tr>
+      <w:tr>
+        <w:tc>
+          <w:tcPr/>
+          <w:p>
+            <w:pPr>
+              <w:pStyle w:val="Compact"/>
+            </w:pPr>
+            <w:r>
+              <w:t xml:space="preserve">13</w:t>
+            </w:r>
+          </w:p>
+        </w:tc>
+        <w:tc>
+          <w:tcPr/>
+          <w:p>
+            <w:pPr>
+              <w:pStyle w:val="Compact"/>
+            </w:pPr>
+            <w:r>
+              <w:t xml:space="preserve">โหลด power resistor / rheostat</w:t>
+            </w:r>
+          </w:p>
+        </w:tc>
+        <w:tc>
+          <w:tcPr/>
+          <w:p>
+            <w:pPr>
+              <w:pStyle w:val="Compact"/>
+            </w:pPr>
+            <w:r>
+              <w:t xml:space="preserve">~0–100 Ω, 200 W ต่อสตาร์สมดุล</w:t>
+            </w:r>
+          </w:p>
+        </w:tc>
+        <w:tc>
+          <w:tcPr/>
+          <w:p>
+            <w:pPr>
+              <w:pStyle w:val="Compact"/>
+            </w:pPr>
+            <w:r>
+              <w:t xml:space="preserve">3</w:t>
+            </w:r>
+          </w:p>
+        </w:tc>
+        <w:tc>
+          <w:tcPr/>
+          <w:p>
+            <w:pPr>
+              <w:pStyle w:val="Compact"/>
+            </w:pPr>
+            <w:r>
+              <w:t xml:space="preserve">400</w:t>
+            </w:r>
+          </w:p>
+        </w:tc>
+      </w:tr>
+      <w:tr>
+        <w:tc>
+          <w:tcPr/>
+          <w:p>
+            <w:pPr>
+              <w:pStyle w:val="Compact"/>
+            </w:pPr>
+            <w:r>
+              <w:t xml:space="preserve">14</w:t>
+            </w:r>
+          </w:p>
+        </w:tc>
+        <w:tc>
+          <w:tcPr/>
+          <w:p>
+            <w:pPr>
+              <w:pStyle w:val="Compact"/>
+            </w:pPr>
+            <w:r>
+              <w:t xml:space="preserve">มัลติมิเตอร์ (ถ้ายังไม่มี)</w:t>
+            </w:r>
+          </w:p>
+        </w:tc>
+        <w:tc>
+          <w:tcPr/>
+          <w:p>
+            <w:pPr>
+              <w:pStyle w:val="Compact"/>
+            </w:pPr>
+            <w:r>
+              <w:t xml:space="preserve">วัดทั่วไป</w:t>
+            </w:r>
+          </w:p>
+        </w:tc>
+        <w:tc>
+          <w:tcPr/>
+          <w:p>
+            <w:pPr>
+              <w:pStyle w:val="Compact"/>
+            </w:pPr>
+            <w:r>
+              <w:t xml:space="preserve">1</w:t>
+            </w:r>
+          </w:p>
+        </w:tc>
+        <w:tc>
+          <w:tcPr/>
+          <w:p>
+            <w:pPr>
+              <w:pStyle w:val="Compact"/>
+            </w:pPr>
+            <w:r>
+              <w:t xml:space="preserve">200</w:t>
+            </w:r>
+          </w:p>
+        </w:tc>
+      </w:tr>
+      <w:tr>
+        <w:tc>
+          <w:tcPr/>
+          <w:p>
+            <w:pPr>
+              <w:pStyle w:val="Compact"/>
+            </w:pPr>
+            <w:r>
+              <w:t xml:space="preserve">15</w:t>
+            </w:r>
+          </w:p>
+        </w:tc>
+        <w:tc>
+          <w:tcPr/>
+          <w:p>
+            <w:pPr>
+              <w:pStyle w:val="Compact"/>
+            </w:pPr>
+            <w:r>
+              <w:t xml:space="preserve">PCB/protoboard + heatsink + คอนเนกเตอร์ + สาย</w:t>
+            </w:r>
+          </w:p>
+        </w:tc>
+        <w:tc>
+          <w:tcPr/>
+          <w:p>
+            <w:pPr>
+              <w:pStyle w:val="Compact"/>
+            </w:pPr>
+            <w:r>
+              <w:t xml:space="preserve">ประกอบวงจร</w:t>
+            </w:r>
+          </w:p>
+        </w:tc>
+        <w:tc>
+          <w:tcPr/>
+          <w:p>
+            <w:pPr>
+              <w:pStyle w:val="Compact"/>
+            </w:pPr>
+            <w:r>
+              <w:t xml:space="preserve">1 ชุด</w:t>
+            </w:r>
+          </w:p>
+        </w:tc>
+        <w:tc>
+          <w:tcPr/>
+          <w:p>
+            <w:pPr>
+              <w:pStyle w:val="Compact"/>
+            </w:pPr>
+            <w:r>
+              <w:t xml:space="preserve">500</w:t>
+            </w:r>
+          </w:p>
+        </w:tc>
+      </w:tr>
+      <w:tr>
+        <w:tc>
+          <w:tcPr/>
+          <w:p>
+            <w:pPr>
+              <w:pStyle w:val="Compact"/>
+            </w:pPr>
           </w:p>
         </w:tc>
         <w:tc>
@@ -2042,29 +2453,38 @@
                 <w:b/>
                 <w:bCs/>
               </w:rPr>
-              <w:t xml:space="preserve">LiFePO4 12S ≈ 38.4 V, 10–20 Ah + BMS</w:t>
-            </w:r>
-          </w:p>
-        </w:tc>
-        <w:tc>
-          <w:tcPr/>
-          <w:p>
-            <w:pPr>
-              <w:pStyle w:val="Compact"/>
-            </w:pPr>
-            <w:r>
-              <w:t xml:space="preserve">บัฟเฟอร์ดูดซับกำลังไหลย้อนกลับ (regenerative)</w:t>
-            </w:r>
-          </w:p>
-        </w:tc>
-        <w:tc>
-          <w:tcPr/>
-          <w:p>
-            <w:pPr>
-              <w:pStyle w:val="Compact"/>
-            </w:pPr>
-            <w:r>
-              <w:t xml:space="preserve">1</w:t>
+              <w:t xml:space="preserve">รวมเฟส 1 (จำเป็นต่อการเริ่มทดสอบ)</w:t>
+            </w:r>
+          </w:p>
+        </w:tc>
+        <w:tc>
+          <w:tcPr/>
+          <w:p>
+            <w:pPr>
+              <w:pStyle w:val="Compact"/>
+            </w:pPr>
+          </w:p>
+        </w:tc>
+        <w:tc>
+          <w:tcPr/>
+          <w:p>
+            <w:pPr>
+              <w:pStyle w:val="Compact"/>
+            </w:pPr>
+          </w:p>
+        </w:tc>
+        <w:tc>
+          <w:tcPr/>
+          <w:p>
+            <w:pPr>
+              <w:pStyle w:val="Compact"/>
+            </w:pPr>
+            <w:r>
+              <w:rPr>
+                <w:b/>
+                <w:bCs/>
+              </w:rPr>
+              <w:t xml:space="preserve">≈ 4,670</w:t>
             </w:r>
           </w:p>
         </w:tc>
@@ -2077,51 +2497,51 @@
               <w:pStyle w:val="Compact"/>
             </w:pPr>
             <w:r>
-              <w:t xml:space="preserve">10</w:t>
-            </w:r>
-          </w:p>
-        </w:tc>
-        <w:tc>
-          <w:tcPr/>
-          <w:p>
-            <w:pPr>
-              <w:pStyle w:val="Compact"/>
-            </w:pPr>
-            <w:r>
-              <w:t xml:space="preserve">แหล่งจ่ายกำลังกระแสตรง</w:t>
-            </w:r>
-          </w:p>
-        </w:tc>
-        <w:tc>
-          <w:tcPr/>
-          <w:p>
-            <w:pPr>
-              <w:pStyle w:val="Compact"/>
-            </w:pPr>
-            <w:r>
-              <w:t xml:space="preserve">DC Power Supply 0–60 V, 5 A (ตั้งที่ 40 V)</w:t>
-            </w:r>
-          </w:p>
-        </w:tc>
-        <w:tc>
-          <w:tcPr/>
-          <w:p>
-            <w:pPr>
-              <w:pStyle w:val="Compact"/>
-            </w:pPr>
-            <w:r>
-              <w:t xml:space="preserve">แหล่งจ่ายหลักฝั่งบัส DC</w:t>
-            </w:r>
-          </w:p>
-        </w:tc>
-        <w:tc>
-          <w:tcPr/>
-          <w:p>
-            <w:pPr>
-              <w:pStyle w:val="Compact"/>
-            </w:pPr>
-            <w:r>
-              <w:t xml:space="preserve">1</w:t>
+              <w:t xml:space="preserve">16</w:t>
+            </w:r>
+          </w:p>
+        </w:tc>
+        <w:tc>
+          <w:tcPr/>
+          <w:p>
+            <w:pPr>
+              <w:pStyle w:val="Compact"/>
+            </w:pPr>
+            <w:r>
+              <w:t xml:space="preserve">แบต buffer 3× SLA 12 V 7 Ah อนุกรม ≈ 40 V (เฟส 2)</w:t>
+            </w:r>
+          </w:p>
+        </w:tc>
+        <w:tc>
+          <w:tcPr/>
+          <w:p>
+            <w:pPr>
+              <w:pStyle w:val="Compact"/>
+            </w:pPr>
+            <w:r>
+              <w:t xml:space="preserve">ดูดซับกำลังไหลย้อนกลับ (regen)</w:t>
+            </w:r>
+          </w:p>
+        </w:tc>
+        <w:tc>
+          <w:tcPr/>
+          <w:p>
+            <w:pPr>
+              <w:pStyle w:val="Compact"/>
+            </w:pPr>
+            <w:r>
+              <w:t xml:space="preserve">3</w:t>
+            </w:r>
+          </w:p>
+        </w:tc>
+        <w:tc>
+          <w:tcPr/>
+          <w:p>
+            <w:pPr>
+              <w:pStyle w:val="Compact"/>
+            </w:pPr>
+            <w:r>
+              <w:t xml:space="preserve">750</w:t>
             </w:r>
           </w:p>
         </w:tc>
@@ -2133,166 +2553,51 @@
             <w:pPr>
               <w:pStyle w:val="Compact"/>
             </w:pPr>
-            <w:r>
-              <w:t xml:space="preserve">11</w:t>
-            </w:r>
-          </w:p>
-        </w:tc>
-        <w:tc>
-          <w:tcPr/>
-          <w:p>
-            <w:pPr>
-              <w:pStyle w:val="Compact"/>
-            </w:pPr>
-            <w:r>
-              <w:t xml:space="preserve">TVS ป้องกันแรงดันเกินบัส</w:t>
-            </w:r>
-          </w:p>
-        </w:tc>
-        <w:tc>
-          <w:tcPr/>
-          <w:p>
-            <w:pPr>
-              <w:pStyle w:val="Compact"/>
-            </w:pPr>
-            <w:r>
-              <w:t xml:space="preserve">P6KE60A (60 V)</w:t>
-            </w:r>
-          </w:p>
-        </w:tc>
-        <w:tc>
-          <w:tcPr/>
-          <w:p>
-            <w:pPr>
-              <w:pStyle w:val="Compact"/>
-            </w:pPr>
-            <w:r>
-              <w:t xml:space="preserve">clamp ทรานเซียนต์สวิตชิ่งคร่อมขั้วบัส</w:t>
-            </w:r>
-          </w:p>
-        </w:tc>
-        <w:tc>
-          <w:tcPr/>
-          <w:p>
-            <w:pPr>
-              <w:pStyle w:val="Compact"/>
-            </w:pPr>
-            <w:r>
-              <w:t xml:space="preserve">1</w:t>
-            </w:r>
-          </w:p>
-        </w:tc>
-      </w:tr>
-      <w:tr>
-        <w:tc>
-          <w:tcPr/>
-          <w:p>
-            <w:pPr>
-              <w:pStyle w:val="Compact"/>
-            </w:pPr>
-            <w:r>
-              <w:t xml:space="preserve">12</w:t>
-            </w:r>
-          </w:p>
-        </w:tc>
-        <w:tc>
-          <w:tcPr/>
-          <w:p>
-            <w:pPr>
-              <w:pStyle w:val="Compact"/>
-            </w:pPr>
-            <w:r>
-              <w:t xml:space="preserve">ตัวต้านทาน pre-charge</w:t>
-            </w:r>
-          </w:p>
-        </w:tc>
-        <w:tc>
-          <w:tcPr/>
-          <w:p>
-            <w:pPr>
-              <w:pStyle w:val="Compact"/>
-            </w:pPr>
-            <w:r>
-              <w:t xml:space="preserve">10 Ω, 50 W</w:t>
-            </w:r>
-          </w:p>
-        </w:tc>
-        <w:tc>
-          <w:tcPr/>
-          <w:p>
-            <w:pPr>
-              <w:pStyle w:val="Compact"/>
-            </w:pPr>
-            <w:r>
-              <w:t xml:space="preserve">จำกัดกระแสกระชากตอนต่อบัส</w:t>
-            </w:r>
-          </w:p>
-        </w:tc>
-        <w:tc>
-          <w:tcPr/>
-          <w:p>
-            <w:pPr>
-              <w:pStyle w:val="Compact"/>
-            </w:pPr>
-            <w:r>
-              <w:t xml:space="preserve">1</w:t>
-            </w:r>
-          </w:p>
-        </w:tc>
-      </w:tr>
-      <w:tr>
-        <w:tc>
-          <w:tcPr/>
-          <w:p>
-            <w:pPr>
-              <w:pStyle w:val="Compact"/>
-            </w:pPr>
-            <w:r>
-              <w:t xml:space="preserve">13</w:t>
-            </w:r>
-          </w:p>
-        </w:tc>
-        <w:tc>
-          <w:tcPr/>
-          <w:p>
-            <w:pPr>
-              <w:pStyle w:val="Compact"/>
-            </w:pPr>
-            <w:r>
-              <w:t xml:space="preserve">โหลดไฟฟ้ากระแสสลับ</w:t>
-            </w:r>
-          </w:p>
-        </w:tc>
-        <w:tc>
-          <w:tcPr/>
-          <w:p>
-            <w:pPr>
-              <w:pStyle w:val="Compact"/>
-            </w:pPr>
-            <w:r>
-              <w:t xml:space="preserve">Slide Rheostat 0–100 Ω, 200 W</w:t>
-            </w:r>
-          </w:p>
-        </w:tc>
-        <w:tc>
-          <w:tcPr/>
-          <w:p>
-            <w:pPr>
-              <w:pStyle w:val="Compact"/>
-            </w:pPr>
-            <w:r>
-              <w:t xml:space="preserve">โหลดต้านทานปรับค่าได้ ต่อแบบสตาร์สมดุล</w:t>
-            </w:r>
-          </w:p>
-        </w:tc>
-        <w:tc>
-          <w:tcPr/>
-          <w:p>
-            <w:pPr>
-              <w:pStyle w:val="Compact"/>
-            </w:pPr>
-            <w:r>
-              <w:t xml:space="preserve">3</w:t>
+          </w:p>
+        </w:tc>
+        <w:tc>
+          <w:tcPr/>
+          <w:p>
+            <w:pPr>
+              <w:pStyle w:val="Compact"/>
+            </w:pPr>
+            <w:r>
+              <w:rPr>
+                <w:b/>
+                <w:bCs/>
+              </w:rPr>
+              <w:t xml:space="preserve">รวมทั้งหมด</w:t>
+            </w:r>
+          </w:p>
+        </w:tc>
+        <w:tc>
+          <w:tcPr/>
+          <w:p>
+            <w:pPr>
+              <w:pStyle w:val="Compact"/>
+            </w:pPr>
+          </w:p>
+        </w:tc>
+        <w:tc>
+          <w:tcPr/>
+          <w:p>
+            <w:pPr>
+              <w:pStyle w:val="Compact"/>
+            </w:pPr>
+          </w:p>
+        </w:tc>
+        <w:tc>
+          <w:tcPr/>
+          <w:p>
+            <w:pPr>
+              <w:pStyle w:val="Compact"/>
+            </w:pPr>
+            <w:r>
+              <w:rPr>
+                <w:b/>
+                <w:bCs/>
+              </w:rPr>
+              <w:t xml:space="preserve">≈ 5,420</w:t>
             </w:r>
           </w:p>
         </w:tc>
@@ -2300,61 +2605,138 @@
     </w:tbl>
     <w:p>
       <w:pPr>
-        <w:pStyle w:val="BlockText"/>
+        <w:pStyle w:val="BodyText"/>
       </w:pPr>
       <w:r>
         <w:rPr>
           <w:b/>
           <w:bCs/>
         </w:rPr>
-        <w:t xml:space="preserve">หมายเหตุการเปลี่ยนแปลงจาก v1 (24 V):</w:t>
-      </w:r>
-      <w:r>
-        <w:t xml:space="preserve"> </w:t>
-      </w:r>
-      <w:r>
-        <w:t xml:space="preserve">(ก) เซ็นเซอร์กระแสเปลี่ยน 05B→20A เพราะกระแสพีค Option A สูงขึ้น (~6.5 A) (ข)</w:t>
-      </w:r>
-      <w:r>
-        <w:t xml:space="preserve"> </w:t>
-      </w:r>
-      <m:oMath>
-        <m:sSub>
-          <m:e>
-            <m:r>
-              <m:t>L</m:t>
-            </m:r>
-          </m:e>
-          <m:sub>
-            <m:r>
-              <m:t>f</m:t>
-            </m:r>
-          </m:sub>
-        </m:sSub>
-        <m:r>
-          <m:rPr>
-            <m:sty m:val="p"/>
-          </m:rPr>
-          <m:t>/</m:t>
-        </m:r>
-        <m:sSub>
-          <m:e>
-            <m:r>
-              <m:t>C</m:t>
-            </m:r>
-          </m:e>
-          <m:sub>
-            <m:r>
-              <m:t>f</m:t>
-            </m:r>
-          </m:sub>
-        </m:sSub>
-      </m:oMath>
-      <w:r>
-        <w:t xml:space="preserve"> </w:t>
-      </w:r>
-      <w:r>
-        <w:t xml:space="preserve">เปลี่ยนเป็น 1.2 mH/10 µF ให้ตรงแบบจำลอง (ค) แบตเตอรี่เป็น 12S (~38.4 V) ให้ใกล้บัส 40 V (ง) เพิ่ม TVS P6KE60A อย่างชัดเจน</w:t>
+        <w:t xml:space="preserve">อุปกรณ์ที่ยืมจากแล็บ SUT (ไม่นับงบ):</w:t>
+      </w:r>
+      <w:r>
+        <w:t xml:space="preserve"> </w:t>
+      </w:r>
+      <w:r>
+        <w:t xml:space="preserve">DC power supply 0–60 V (มี current limit), ออสซิลโลสโคป, หัวแร้งบัดกรี + เครื่องมือช่าง</w:t>
+      </w:r>
+    </w:p>
+    <w:p>
+      <w:pPr>
+        <w:pStyle w:val="BodyText"/>
+      </w:pPr>
+      <w:r>
+        <w:rPr>
+          <w:b/>
+          <w:bCs/>
+        </w:rPr>
+        <w:t xml:space="preserve">งบคงเหลือเป็น</w:t>
+      </w:r>
+      <w:r>
+        <w:rPr>
+          <w:b/>
+          <w:bCs/>
+        </w:rPr>
+        <w:t xml:space="preserve"> </w:t>
+      </w:r>
+      <w:r>
+        <w:rPr>
+          <w:b/>
+          <w:bCs/>
+        </w:rPr>
+        <w:t xml:space="preserve">“กันชนความเสียหาย”</w:t>
+      </w:r>
+      <w:r>
+        <w:rPr>
+          <w:b/>
+          <w:bCs/>
+        </w:rPr>
+        <w:t xml:space="preserve"> </w:t>
+      </w:r>
+      <w:r>
+        <w:rPr>
+          <w:b/>
+          <w:bCs/>
+        </w:rPr>
+        <w:t xml:space="preserve">≈ 1,780 บาท</w:t>
+      </w:r>
+      <w:r>
+        <w:t xml:space="preserve"> </w:t>
+      </w:r>
+      <w:r>
+        <w:t xml:space="preserve">— สำรองไว้เปลี่ยน MOSFET/ไดรเวอร์ที่อาจไหม้ระหว่างทดสอบ (เนื่องจากผู้ดำเนินโครงงานรับผิดชอบค่าเสียหายเอง)</w:t>
+      </w:r>
+    </w:p>
+    <w:p>
+      <w:pPr>
+        <w:pStyle w:val="BlockText"/>
+      </w:pPr>
+      <w:r>
+        <w:rPr>
+          <w:b/>
+          <w:bCs/>
+        </w:rPr>
+        <w:t xml:space="preserve">เหตุผลและกลยุทธ์ลดความเสี่ยง:</w:t>
+      </w:r>
+      <w:r>
+        <w:t xml:space="preserve"> </w:t>
+      </w:r>
+      <w:r>
+        <w:t xml:space="preserve">-</w:t>
+      </w:r>
+      <w:r>
+        <w:t xml:space="preserve"> </w:t>
+      </w:r>
+      <w:r>
+        <w:rPr>
+          <w:b/>
+          <w:bCs/>
+        </w:rPr>
+        <w:t xml:space="preserve">ภาคกำลังดิสครีต</w:t>
+      </w:r>
+      <w:r>
+        <w:t xml:space="preserve"> </w:t>
+      </w:r>
+      <w:r>
+        <w:t xml:space="preserve">ฟื้นจากการระเบิดถูกกว่าบอร์ด DRV8302 มาก และ IR2104 ให้ dead-time ฮาร์ดแวร์กัน shoot-through โดยไม่พึ่งซอฟต์แวร์</w:t>
+      </w:r>
+      <w:r>
+        <w:t xml:space="preserve"> </w:t>
+      </w:r>
+      <w:r>
+        <w:t xml:space="preserve">-</w:t>
+      </w:r>
+      <w:r>
+        <w:t xml:space="preserve"> </w:t>
+      </w:r>
+      <w:r>
+        <w:rPr>
+          <w:b/>
+          <w:bCs/>
+        </w:rPr>
+        <w:t xml:space="preserve">เริ่มเฟส 1 แบบไม่มีแบต</w:t>
+      </w:r>
+      <w:r>
+        <w:t xml:space="preserve">: supply ตั้ง current-limit ~3–4 A + cap bank + TVS + โหลดต้านทาน, soft-start duty ต่ำ ค่อย ๆ เพิ่ม — สังเกตแรงดันบัสบนสโคป; เติมแบต SLA เฉพาะตอนทดสอบ step โหลดแรง (เฟส 2)</w:t>
+      </w:r>
+      <w:r>
+        <w:t xml:space="preserve"> </w:t>
+      </w:r>
+      <w:r>
+        <w:t xml:space="preserve">-</w:t>
+      </w:r>
+      <w:r>
+        <w:t xml:space="preserve"> </w:t>
+      </w:r>
+      <w:r>
+        <w:rPr>
+          <w:b/>
+          <w:bCs/>
+        </w:rPr>
+        <w:t xml:space="preserve">5 ชั้นกันพังที่ฟรี/ถูก</w:t>
+      </w:r>
+      <w:r>
+        <w:t xml:space="preserve">: current-limit ที่ supply, IR2104 dead-time, OCP comparator → FAULT (&lt;1 µs), soft-start ramp, และ MOSFET/ไดรเวอร์สำรอง</w:t>
       </w:r>
     </w:p>
     <w:p>
@@ -2494,7 +2876,7 @@
         <w:t xml:space="preserve"> </w:t>
       </w:r>
       <w:r>
-        <w:t xml:space="preserve">— ประกอบบอร์ด DRV8302 + ESP32 + AD7606, สร้างวงจรแบ่งแรงดัน, เซ็นเซอร์ ACS712-20A, ฟิลเตอร์ LC +</w:t>
+        <w:t xml:space="preserve">— ประกอบภาคกำลังดิสครีต (IRF540N ×6 + IR2104 ×3) + ESP32 + AD7606, สร้างวงจรแบ่งแรงดัน, เซ็นเซอร์ ACS712-20A, ฟิลเตอร์ LC +</w:t>
       </w:r>
       <w:r>
         <w:t xml:space="preserve"> </w:t>
@@ -2514,7 +2896,7 @@
         </m:sSub>
       </m:oMath>
       <w:r>
-        <w:t xml:space="preserve">, วงจร pre-charge และ TVS (รายละเอียดการออกแบบในบทที่ 5)</w:t>
+        <w:t xml:space="preserve">, วงจร OCP comparator, pre-charge และ TVS (รายละเอียดการออกแบบในบทที่ 5)</w:t>
       </w:r>
     </w:p>
     <w:p>
@@ -3405,13 +3787,13 @@
       </w:r>
     </w:p>
     <w:bookmarkEnd w:id="19"/>
-    <w:bookmarkStart w:id="20" w:name="Xc2d29aca2db3d5f3829bdf2a3d56609b7335897"/>
+    <w:bookmarkStart w:id="20" w:name="ภาคกำลงทางเลอก-alternative-power-stages"/>
     <w:p>
       <w:pPr>
         <w:pStyle w:val="Heading3"/>
       </w:pPr>
       <w:r>
-        <w:t xml:space="preserve">3.5.1 ภาคกำลังแบบดิสครีตแรงดันสูง (Discrete Power Stage @ 48 V)</w:t>
+        <w:t xml:space="preserve">3.5.1 ภาคกำลังทางเลือก (Alternative Power Stages)</w:t>
       </w:r>
     </w:p>
     <w:p>
@@ -3419,23 +3801,67 @@
         <w:pStyle w:val="FirstParagraph"/>
       </w:pPr>
       <w:r>
-        <w:t xml:space="preserve">หากต้องการขอบเขตแรงดันที่กว้างขึ้น สามารถเปลี่ยนจากบอร์ด DRV8302 (สูงสุด 60 V) ไปใช้ภาคกำลังดิสครีต:</w:t>
-      </w:r>
-      <w:r>
-        <w:t xml:space="preserve"> </w:t>
-      </w:r>
+        <w:t xml:space="preserve">ระบบหลักใช้ภาคกำลังดิสครีต IRF540N + IR2104 @ 40 V (ตาม §3.2 — เลือกเพราะต้นทุนต่ำและฟื้นจากความเสียหายได้ถูก) โดยมีทางเลือก 2 ระดับสำหรับการต่อยอด:</w:t>
+      </w:r>
+    </w:p>
+    <w:p>
+      <w:pPr>
+        <w:pStyle w:val="Compact"/>
+        <w:numPr>
+          <w:ilvl w:val="0"/>
+          <w:numId w:val="1002"/>
+        </w:numPr>
+      </w:pPr>
       <w:r>
         <w:rPr>
           <w:b/>
           <w:bCs/>
         </w:rPr>
-        <w:t xml:space="preserve">MOSFET คลาส 100 V (IRF540N) ×6 + เกตไดรเวอร์แยกกราวด์ TI UCC21520 ×3 + คอมพาเรเตอร์ OCP (LM393)</w:t>
-      </w:r>
-      <w:r>
-        <w:t xml:space="preserve"> </w:t>
-      </w:r>
-      <w:r>
-        <w:t xml:space="preserve">ทำงานที่บัส 48 V ได้อย่างปลอดภัย (derating 80% ตาม Vishay AN861) ข้อดีคือ headroom แรงดันสูงและได้เรียนรู้การออกแบบ PCB power electronics แต่ต้องออกแบบ PCB เอง</w:t>
+        <w:t xml:space="preserve">(ก) บอร์ดสำเร็จ TI DRV8302 @ 40 V</w:t>
+      </w:r>
+      <w:r>
+        <w:t xml:space="preserve"> </w:t>
+      </w:r>
+      <w:r>
+        <w:t xml:space="preserve">— หากมีงบเพิ่ม (~1,000–1,500 ฿) และต้องการความสะดวก/ป้องกันในตัว (OCP, UVLO, dead-time, current-sense, buck) ลดความเสี่ยงต่อข้อผิดพลาดในการเดินสาย แต่หากบอร์ดเสียหายต้องเปลี่ยนทั้งบอร์ด เฟิร์มแวร์รองรับทั้งสองแบบ (ขับ 3 PWM A-channel เหมือนกัน)</w:t>
+      </w:r>
+    </w:p>
+    <w:p>
+      <w:pPr>
+        <w:pStyle w:val="Compact"/>
+        <w:numPr>
+          <w:ilvl w:val="0"/>
+          <w:numId w:val="1002"/>
+        </w:numPr>
+      </w:pPr>
+      <w:r>
+        <w:rPr>
+          <w:b/>
+          <w:bCs/>
+        </w:rPr>
+        <w:t xml:space="preserve">(ข) ดิสครีตแรงดันสูง @ 48 V</w:t>
+      </w:r>
+      <w:r>
+        <w:t xml:space="preserve"> </w:t>
+      </w:r>
+      <w:r>
+        <w:t xml:space="preserve">—</w:t>
+      </w:r>
+      <w:r>
+        <w:t xml:space="preserve"> </w:t>
+      </w:r>
+      <w:r>
+        <w:rPr>
+          <w:b/>
+          <w:bCs/>
+        </w:rPr>
+        <w:t xml:space="preserve">MOSFET คลาส 100 V (IRF540N) ×6 + เกตไดรเวอร์แยกกราวด์ TI UCC21520 ×3 + OCP (LM393)</w:t>
+      </w:r>
+      <w:r>
+        <w:t xml:space="preserve"> </w:t>
+      </w:r>
+      <w:r>
+        <w:t xml:space="preserve">ทำงานที่บัส 48 V ได้อย่างปลอดภัย (derating 80% ตาม Vishay AN861) ให้ headroom แรงดันสูงและการแยกกราวด์ (isolation) ที่ดีกว่า เหมาะกับการขยายกำลัง แต่ต้องออกแบบ PCB เอง</w:t>
       </w:r>
     </w:p>
     <w:bookmarkEnd w:id="20"/>
@@ -3795,6 +4221,109 @@
       <w:pPr>
         <w:ind w:left="6480" w:hanging="360"/>
       </w:pPr>
+    </w:lvl>
+  </w:abstractNum>
+  <w:abstractNum w:abstractNumId="991">
+    <w:nsid w:val="0000A991"/>
+    <w:multiLevelType w:val="multilevel"/>
+    <w:lvl w:ilvl="0">
+      <w:numFmt w:val="bullet"/>
+      <w:lvlText w:val=""/>
+      <w:lvlJc w:val="left"/>
+      <w:pPr>
+        <w:ind w:left="720" w:hanging="360"/>
+      </w:pPr>
+      <w:rPr>
+        <w:rFonts w:ascii="Symbol" w:hAnsi="Symbol" w:cs="Symbol" w:hint="default"/>
+      </w:rPr>
+    </w:lvl>
+    <w:lvl w:ilvl="1">
+      <w:numFmt w:val="bullet"/>
+      <w:lvlText w:val="o"/>
+      <w:lvlJc w:val="left"/>
+      <w:pPr>
+        <w:ind w:left="1440" w:hanging="360"/>
+      </w:pPr>
+      <w:rPr>
+        <w:rFonts w:ascii="Courier New" w:hAnsi="Courier New" w:cs="Courier New" w:hint="default"/>
+      </w:rPr>
+    </w:lvl>
+    <w:lvl w:ilvl="2">
+      <w:numFmt w:val="bullet"/>
+      <w:lvlText w:val=""/>
+      <w:lvlJc w:val="left"/>
+      <w:pPr>
+        <w:ind w:left="2160" w:hanging="360"/>
+      </w:pPr>
+      <w:rPr>
+        <w:rFonts w:ascii="Wingdings" w:hAnsi="Wingdings" w:cs="Wingdings" w:hint="default"/>
+      </w:rPr>
+    </w:lvl>
+    <w:lvl w:ilvl="3">
+      <w:numFmt w:val="bullet"/>
+      <w:lvlText w:val=""/>
+      <w:lvlJc w:val="left"/>
+      <w:pPr>
+        <w:ind w:left="2880" w:hanging="360"/>
+      </w:pPr>
+      <w:rPr>
+        <w:rFonts w:ascii="Symbol" w:hAnsi="Symbol" w:cs="Symbol" w:hint="default"/>
+      </w:rPr>
+    </w:lvl>
+    <w:lvl w:ilvl="4">
+      <w:numFmt w:val="bullet"/>
+      <w:lvlText w:val="o"/>
+      <w:lvlJc w:val="left"/>
+      <w:pPr>
+        <w:ind w:left="3600" w:hanging="360"/>
+      </w:pPr>
+      <w:rPr>
+        <w:rFonts w:ascii="Courier New" w:hAnsi="Courier New" w:cs="Courier New" w:hint="default"/>
+      </w:rPr>
+    </w:lvl>
+    <w:lvl w:ilvl="5">
+      <w:numFmt w:val="bullet"/>
+      <w:lvlText w:val=""/>
+      <w:lvlJc w:val="left"/>
+      <w:pPr>
+        <w:ind w:left="4320" w:hanging="360"/>
+      </w:pPr>
+      <w:rPr>
+        <w:rFonts w:ascii="Wingdings" w:hAnsi="Wingdings" w:cs="Wingdings" w:hint="default"/>
+      </w:rPr>
+    </w:lvl>
+    <w:lvl w:ilvl="6">
+      <w:numFmt w:val="bullet"/>
+      <w:lvlText w:val=""/>
+      <w:lvlJc w:val="left"/>
+      <w:pPr>
+        <w:ind w:left="5040" w:hanging="360"/>
+      </w:pPr>
+      <w:rPr>
+        <w:rFonts w:ascii="Symbol" w:hAnsi="Symbol" w:cs="Symbol" w:hint="default"/>
+      </w:rPr>
+    </w:lvl>
+    <w:lvl w:ilvl="7">
+      <w:numFmt w:val="bullet"/>
+      <w:lvlText w:val="o"/>
+      <w:lvlJc w:val="left"/>
+      <w:pPr>
+        <w:ind w:left="5760" w:hanging="360"/>
+      </w:pPr>
+      <w:rPr>
+        <w:rFonts w:ascii="Courier New" w:hAnsi="Courier New" w:cs="Courier New" w:hint="default"/>
+      </w:rPr>
+    </w:lvl>
+    <w:lvl w:ilvl="8">
+      <w:numFmt w:val="bullet"/>
+      <w:lvlText w:val=""/>
+      <w:lvlJc w:val="left"/>
+      <w:pPr>
+        <w:ind w:left="6480" w:hanging="360"/>
+      </w:pPr>
+      <w:rPr>
+        <w:rFonts w:ascii="Wingdings" w:hAnsi="Wingdings" w:cs="Wingdings" w:hint="default"/>
+      </w:rPr>
     </w:lvl>
   </w:abstractNum>
   <w:num w:numId="1000">
@@ -3829,6 +4358,9 @@
     <w:lvlOverride w:ilvl="8">
       <w:startOverride w:val="1"/>
     </w:lvlOverride>
+  </w:num>
+  <w:num w:numId="1002">
+    <w:abstractNumId w:val="991"/>
   </w:num>
 </w:numbering>
 </file>

</xml_diff>

<commit_message>
feat: document both power stages (IR2104 discrete + DRV8302 shield)
- docs/notes/power_stage_options.md: full side-by-side guide
  (architecture, BoM/THB, protection, ESP32 pins, pros/cons, when to pick)
- firmware: #define POWER_STAGE switch (IR2104 default | DRV8302) —
  one codebase, conditional nOCTW pin; control core unchanged
- Ch.3 §3.2.1: 2-approach comparison table + which BoM rows to swap

Co-Authored-By: Claude Opus 4.8 <noreply@anthropic.com>
</commit_message>
<xml_diff>
--- a/docs/thesis/chapter3_methodology.docx
+++ b/docs/thesis/chapter3_methodology.docx
@@ -38,7 +38,7 @@
       </w:r>
     </w:p>
     <w:bookmarkEnd w:id="9"/>
-    <w:bookmarkStart w:id="24" w:name="methodology-system-design"/>
+    <w:bookmarkStart w:id="25" w:name="methodology-system-design"/>
     <w:p>
       <w:pPr>
         <w:pStyle w:val="Heading1"/>
@@ -1368,7 +1368,7 @@
     </w:p>
     <w:bookmarkEnd w:id="10"/>
     <w:bookmarkEnd w:id="11"/>
-    <w:bookmarkStart w:id="13" w:name="รายการวสดและอปกรณ"/>
+    <w:bookmarkStart w:id="14" w:name="รายการวสดและอปกรณ"/>
     <w:p>
       <w:pPr>
         <w:pStyle w:val="Heading2"/>
@@ -2739,6 +2739,385 @@
         <w:t xml:space="preserve">: current-limit ที่ supply, IR2104 dead-time, OCP comparator → FAULT (&lt;1 µs), soft-start ramp, และ MOSFET/ไดรเวอร์สำรอง</w:t>
       </w:r>
     </w:p>
+    <w:bookmarkEnd w:id="12"/>
+    <w:bookmarkStart w:id="13" w:name="ภาคกำลง-2-แนวทาง-รองรบคกน"/>
+    <w:p>
+      <w:pPr>
+        <w:pStyle w:val="Heading3"/>
+      </w:pPr>
+      <w:r>
+        <w:t xml:space="preserve">3.2.1 ภาคกำลัง 2 แนวทาง (รองรับคู่กัน)</w:t>
+      </w:r>
+    </w:p>
+    <w:p>
+      <w:pPr>
+        <w:pStyle w:val="FirstParagraph"/>
+      </w:pPr>
+      <w:r>
+        <w:t xml:space="preserve">โครงงานนี้เตรียมภาคกำลังไว้</w:t>
+      </w:r>
+      <w:r>
+        <w:t xml:space="preserve"> </w:t>
+      </w:r>
+      <w:r>
+        <w:rPr>
+          <w:b/>
+          <w:bCs/>
+        </w:rPr>
+        <w:t xml:space="preserve">2 แนวทาง</w:t>
+      </w:r>
+      <w:r>
+        <w:t xml:space="preserve"> </w:t>
+      </w:r>
+      <w:r>
+        <w:t xml:space="preserve">ที่ใช้ control core, เฟิร์มแวร์, ฟิลเตอร์ และระบบวัดชุดเดียวกัน (ต่างแค่ภาค MOSFET + วงจรขับเกต) เฟิร์มแวร์สลับด้วย</w:t>
+      </w:r>
+      <w:r>
+        <w:t xml:space="preserve"> </w:t>
+      </w:r>
+      <w:r>
+        <w:rPr>
+          <w:rStyle w:val="VerbatimChar"/>
+        </w:rPr>
+        <w:t xml:space="preserve">#define POWER_STAGE</w:t>
+      </w:r>
+      <w:r>
+        <w:t xml:space="preserve"> </w:t>
+      </w:r>
+      <w:r>
+        <w:t xml:space="preserve">รายละเอียดเต็มใน</w:t>
+      </w:r>
+      <w:r>
+        <w:t xml:space="preserve"> </w:t>
+      </w:r>
+      <w:r>
+        <w:rPr>
+          <w:rStyle w:val="VerbatimChar"/>
+        </w:rPr>
+        <w:t xml:space="preserve">docs/notes/power_stage_options.md</w:t>
+      </w:r>
+    </w:p>
+    <w:p>
+      <w:pPr>
+        <w:pStyle w:val="BodyText"/>
+      </w:pPr>
+      <w:r>
+        <w:rPr>
+          <w:b/>
+          <w:bCs/>
+        </w:rPr>
+        <w:t xml:space="preserve">ตารางที่ 3.3</w:t>
+      </w:r>
+      <w:r>
+        <w:t xml:space="preserve"> </w:t>
+      </w:r>
+      <w:r>
+        <w:t xml:space="preserve">เปรียบเทียบภาคกำลัง 2 แนวทาง</w:t>
+      </w:r>
+    </w:p>
+    <w:tbl>
+      <w:tblPr>
+        <w:tblStyle w:val="Table"/>
+        <w:tblW w:type="auto" w:w="0"/>
+        <w:tblLook w:firstRow="1" w:lastRow="0" w:firstColumn="0" w:lastColumn="0" w:noHBand="0" w:noVBand="0" w:val="0020"/>
+      </w:tblPr>
+      <w:tblGrid>
+        <w:gridCol w:w="2640"/>
+        <w:gridCol w:w="2640"/>
+        <w:gridCol w:w="2640"/>
+      </w:tblGrid>
+      <w:tr>
+        <w:trPr>
+          <w:tblHeader w:val="on"/>
+        </w:trPr>
+        <w:tc>
+          <w:tcPr/>
+          <w:p>
+            <w:pPr>
+              <w:pStyle w:val="Compact"/>
+            </w:pPr>
+            <w:r>
+              <w:t xml:space="preserve">มิติ</w:t>
+            </w:r>
+          </w:p>
+        </w:tc>
+        <w:tc>
+          <w:tcPr/>
+          <w:p>
+            <w:pPr>
+              <w:pStyle w:val="Compact"/>
+            </w:pPr>
+            <w:r>
+              <w:t xml:space="preserve">A: ดิสครีต IRF540N + IR2104 (หลัก)</w:t>
+            </w:r>
+          </w:p>
+        </w:tc>
+        <w:tc>
+          <w:tcPr/>
+          <w:p>
+            <w:pPr>
+              <w:pStyle w:val="Compact"/>
+            </w:pPr>
+            <w:r>
+              <w:t xml:space="preserve">B: DRV8302 shield (ทางเลือก)</w:t>
+            </w:r>
+          </w:p>
+        </w:tc>
+      </w:tr>
+      <w:tr>
+        <w:tc>
+          <w:tcPr/>
+          <w:p>
+            <w:pPr>
+              <w:pStyle w:val="Compact"/>
+            </w:pPr>
+            <w:r>
+              <w:t xml:space="preserve">ต้นทุน</w:t>
+            </w:r>
+          </w:p>
+        </w:tc>
+        <w:tc>
+          <w:tcPr/>
+          <w:p>
+            <w:pPr>
+              <w:pStyle w:val="Compact"/>
+            </w:pPr>
+            <w:r>
+              <w:t xml:space="preserve">~540 ฿ (+สำรอง)</w:t>
+            </w:r>
+          </w:p>
+        </w:tc>
+        <w:tc>
+          <w:tcPr/>
+          <w:p>
+            <w:pPr>
+              <w:pStyle w:val="Compact"/>
+            </w:pPr>
+            <w:r>
+              <w:t xml:space="preserve">~1,000–1,500 ฿</w:t>
+            </w:r>
+          </w:p>
+        </w:tc>
+      </w:tr>
+      <w:tr>
+        <w:tc>
+          <w:tcPr/>
+          <w:p>
+            <w:pPr>
+              <w:pStyle w:val="Compact"/>
+            </w:pPr>
+            <w:r>
+              <w:t xml:space="preserve">พังแล้วฟื้น</w:t>
+            </w:r>
+          </w:p>
+        </w:tc>
+        <w:tc>
+          <w:tcPr/>
+          <w:p>
+            <w:pPr>
+              <w:pStyle w:val="Compact"/>
+            </w:pPr>
+            <w:r>
+              <w:t xml:space="preserve">เปลี่ยน MOSFET ~20 ฿</w:t>
+            </w:r>
+          </w:p>
+        </w:tc>
+        <w:tc>
+          <w:tcPr/>
+          <w:p>
+            <w:pPr>
+              <w:pStyle w:val="Compact"/>
+            </w:pPr>
+            <w:r>
+              <w:t xml:space="preserve">เสียทั้งบอร์ด ~1,200 ฿</w:t>
+            </w:r>
+          </w:p>
+        </w:tc>
+      </w:tr>
+      <w:tr>
+        <w:tc>
+          <w:tcPr/>
+          <w:p>
+            <w:pPr>
+              <w:pStyle w:val="Compact"/>
+            </w:pPr>
+            <w:r>
+              <w:t xml:space="preserve">โอกาสพัง</w:t>
+            </w:r>
+          </w:p>
+        </w:tc>
+        <w:tc>
+          <w:tcPr/>
+          <w:p>
+            <w:pPr>
+              <w:pStyle w:val="Compact"/>
+            </w:pPr>
+            <w:r>
+              <w:t xml:space="preserve">สูงกว่า (เดินสายเอง)</w:t>
+            </w:r>
+          </w:p>
+        </w:tc>
+        <w:tc>
+          <w:tcPr/>
+          <w:p>
+            <w:pPr>
+              <w:pStyle w:val="Compact"/>
+            </w:pPr>
+            <w:r>
+              <w:t xml:space="preserve">ต่ำกว่า (ป้องกันในตัว)</w:t>
+            </w:r>
+          </w:p>
+        </w:tc>
+      </w:tr>
+      <w:tr>
+        <w:tc>
+          <w:tcPr/>
+          <w:p>
+            <w:pPr>
+              <w:pStyle w:val="Compact"/>
+            </w:pPr>
+            <w:r>
+              <w:t xml:space="preserve">เวลาสร้าง</w:t>
+            </w:r>
+          </w:p>
+        </w:tc>
+        <w:tc>
+          <w:tcPr/>
+          <w:p>
+            <w:pPr>
+              <w:pStyle w:val="Compact"/>
+            </w:pPr>
+            <w:r>
+              <w:t xml:space="preserve">นานกว่า</w:t>
+            </w:r>
+          </w:p>
+        </w:tc>
+        <w:tc>
+          <w:tcPr/>
+          <w:p>
+            <w:pPr>
+              <w:pStyle w:val="Compact"/>
+            </w:pPr>
+            <w:r>
+              <w:t xml:space="preserve">เร็ว (เสียบใช้)</w:t>
+            </w:r>
+          </w:p>
+        </w:tc>
+      </w:tr>
+      <w:tr>
+        <w:tc>
+          <w:tcPr/>
+          <w:p>
+            <w:pPr>
+              <w:pStyle w:val="Compact"/>
+            </w:pPr>
+            <w:r>
+              <w:t xml:space="preserve">dead-time</w:t>
+            </w:r>
+          </w:p>
+        </w:tc>
+        <w:tc>
+          <w:tcPr/>
+          <w:p>
+            <w:pPr>
+              <w:pStyle w:val="Compact"/>
+            </w:pPr>
+            <w:r>
+              <w:t xml:space="preserve">IR2104 ~520 ns</w:t>
+            </w:r>
+          </w:p>
+        </w:tc>
+        <w:tc>
+          <w:tcPr/>
+          <w:p>
+            <w:pPr>
+              <w:pStyle w:val="Compact"/>
+            </w:pPr>
+            <w:r>
+              <w:t xml:space="preserve">DTC → ~350 ns</w:t>
+            </w:r>
+          </w:p>
+        </w:tc>
+      </w:tr>
+      <w:tr>
+        <w:tc>
+          <w:tcPr/>
+          <w:p>
+            <w:pPr>
+              <w:pStyle w:val="Compact"/>
+            </w:pPr>
+            <w:r>
+              <w:t xml:space="preserve">OCP</w:t>
+            </w:r>
+          </w:p>
+        </w:tc>
+        <w:tc>
+          <w:tcPr/>
+          <w:p>
+            <w:pPr>
+              <w:pStyle w:val="Compact"/>
+            </w:pPr>
+            <w:r>
+              <w:t xml:space="preserve">LM393 + shunt (สร้างเอง)</w:t>
+            </w:r>
+          </w:p>
+        </w:tc>
+        <w:tc>
+          <w:tcPr/>
+          <w:p>
+            <w:pPr>
+              <w:pStyle w:val="Compact"/>
+            </w:pPr>
+            <w:r>
+              <w:t xml:space="preserve">ในตัว (VDS sense)</w:t>
+            </w:r>
+          </w:p>
+        </w:tc>
+      </w:tr>
+      <w:tr>
+        <w:tc>
+          <w:tcPr/>
+          <w:p>
+            <w:pPr>
+              <w:pStyle w:val="Compact"/>
+            </w:pPr>
+            <w:r>
+              <w:t xml:space="preserve">เหมาะกับ</w:t>
+            </w:r>
+          </w:p>
+        </w:tc>
+        <w:tc>
+          <w:tcPr/>
+          <w:p>
+            <w:pPr>
+              <w:pStyle w:val="Compact"/>
+            </w:pPr>
+            <w:r>
+              <w:t xml:space="preserve">งบจำกัด + พังออกเอง</w:t>
+            </w:r>
+          </w:p>
+        </w:tc>
+        <w:tc>
+          <w:tcPr/>
+          <w:p>
+            <w:pPr>
+              <w:pStyle w:val="Compact"/>
+            </w:pPr>
+            <w:r>
+              <w:t xml:space="preserve">เน้นเร็ว/เสี่ยงต่ำ + มีงบ</w:t>
+            </w:r>
+          </w:p>
+        </w:tc>
+      </w:tr>
+    </w:tbl>
+    <w:p>
+      <w:pPr>
+        <w:pStyle w:val="BodyText"/>
+      </w:pPr>
+      <w:r>
+        <w:t xml:space="preserve">BoM ในตารางที่ 3.2 ใช้แนวทาง A เป็นค่าตั้งต้น หากเลือกแนวทาง B ให้แทนรายการที่ 2–4 และ 10 ด้วยบอร์ด DRV8302 + R_DTC 100 kΩ + R_OC (ส่วนที่เหลือเหมือนกัน)</w:t>
+      </w:r>
+    </w:p>
     <w:p>
       <w:r>
         <w:pict>
@@ -2746,9 +3125,9 @@
         </w:pict>
       </w:r>
     </w:p>
-    <w:bookmarkEnd w:id="12"/>
     <w:bookmarkEnd w:id="13"/>
-    <w:bookmarkStart w:id="16" w:name="ขนตอนการดำเนนงานวจย"/>
+    <w:bookmarkEnd w:id="14"/>
+    <w:bookmarkStart w:id="17" w:name="ขนตอนการดำเนนงานวจย"/>
     <w:p>
       <w:pPr>
         <w:pStyle w:val="Heading2"/>
@@ -2757,7 +3136,7 @@
         <w:t xml:space="preserve">3.3 ขั้นตอนการดำเนินงานวิจัย</w:t>
       </w:r>
     </w:p>
-    <w:bookmarkStart w:id="14" w:name="research-methodology-workflow"/>
+    <w:bookmarkStart w:id="15" w:name="research-methodology-workflow"/>
     <w:p>
       <w:pPr>
         <w:pStyle w:val="Heading3"/>
@@ -2796,8 +3175,8 @@
         <w:t xml:space="preserve">(สร้างด้วย draw.io แล้ว insert)</w:t>
       </w:r>
     </w:p>
-    <w:bookmarkEnd w:id="14"/>
-    <w:bookmarkStart w:id="15" w:name="รายละเอยดขนตอน"/>
+    <w:bookmarkEnd w:id="15"/>
+    <w:bookmarkStart w:id="16" w:name="รายละเอยดขนตอน"/>
     <w:p>
       <w:pPr>
         <w:pStyle w:val="Heading3"/>
@@ -3021,9 +3400,9 @@
         </w:pict>
       </w:r>
     </w:p>
-    <w:bookmarkEnd w:id="15"/>
     <w:bookmarkEnd w:id="16"/>
-    <w:bookmarkStart w:id="18" w:name="สรปการออกแบบระบบควบคม-เชอมโยงแบบจำลอง"/>
+    <w:bookmarkEnd w:id="17"/>
+    <w:bookmarkStart w:id="19" w:name="สรปการออกแบบระบบควบคม-เชอมโยงแบบจำลอง"/>
     <w:p>
       <w:pPr>
         <w:pStyle w:val="Heading2"/>
@@ -3032,7 +3411,7 @@
         <w:t xml:space="preserve">3.4 สรุปการออกแบบระบบควบคุม (เชื่อมโยงแบบจำลอง)</w:t>
       </w:r>
     </w:p>
-    <w:bookmarkStart w:id="17" w:name="X9a15f1c33dc94ee900cfbb2c689f1ba52fef369"/>
+    <w:bookmarkStart w:id="18" w:name="X9a15f1c33dc94ee900cfbb2c689f1ba52fef369"/>
     <w:p>
       <w:pPr>
         <w:pStyle w:val="Heading3"/>
@@ -3758,9 +4137,9 @@
         </w:pict>
       </w:r>
     </w:p>
-    <w:bookmarkEnd w:id="17"/>
     <w:bookmarkEnd w:id="18"/>
-    <w:bookmarkStart w:id="22" w:name="แผนทางเลอกประสทธภาพสง-งานตอยอด"/>
+    <w:bookmarkEnd w:id="19"/>
+    <w:bookmarkStart w:id="23" w:name="แผนทางเลอกประสทธภาพสง-งานตอยอด"/>
     <w:p>
       <w:pPr>
         <w:pStyle w:val="Heading2"/>
@@ -3769,7 +4148,7 @@
         <w:t xml:space="preserve">3.5 แผนทางเลือกประสิทธิภาพสูง (งานต่อยอด)</w:t>
       </w:r>
     </w:p>
-    <w:bookmarkStart w:id="19" w:name="high-performance-alternative-future-work"/>
+    <w:bookmarkStart w:id="20" w:name="high-performance-alternative-future-work"/>
     <w:p>
       <w:pPr>
         <w:pStyle w:val="Heading3"/>
@@ -3786,8 +4165,8 @@
         <w:t xml:space="preserve">นอกเหนือจากระบบหลัก (ESP32 + DRV8302 @ 40 V) ผู้ดำเนินโครงงานได้ออกแบบแผนทางเลือกไว้ 2 ระดับสำหรับการต่อยอด:</w:t>
       </w:r>
     </w:p>
-    <w:bookmarkEnd w:id="19"/>
-    <w:bookmarkStart w:id="20" w:name="ภาคกำลงทางเลอก-alternative-power-stages"/>
+    <w:bookmarkEnd w:id="20"/>
+    <w:bookmarkStart w:id="21" w:name="ภาคกำลงทางเลอก-alternative-power-stages"/>
     <w:p>
       <w:pPr>
         <w:pStyle w:val="Heading3"/>
@@ -3864,8 +4243,8 @@
         <w:t xml:space="preserve">ทำงานที่บัส 48 V ได้อย่างปลอดภัย (derating 80% ตาม Vishay AN861) ให้ headroom แรงดันสูงและการแยกกราวด์ (isolation) ที่ดีกว่า เหมาะกับการขยายกำลัง แต่ต้องออกแบบ PCB เอง</w:t>
       </w:r>
     </w:p>
-    <w:bookmarkEnd w:id="20"/>
-    <w:bookmarkStart w:id="21" w:name="ตวควบคมระดบอตสาหกรรม-controller-upgrade"/>
+    <w:bookmarkEnd w:id="21"/>
+    <w:bookmarkStart w:id="22" w:name="ตวควบคมระดบอตสาหกรรม-controller-upgrade"/>
     <w:p>
       <w:pPr>
         <w:pStyle w:val="Heading3"/>
@@ -3923,9 +4302,9 @@
         </w:pict>
       </w:r>
     </w:p>
-    <w:bookmarkEnd w:id="21"/>
     <w:bookmarkEnd w:id="22"/>
-    <w:bookmarkStart w:id="23" w:name="สรปทายบท"/>
+    <w:bookmarkEnd w:id="23"/>
+    <w:bookmarkStart w:id="24" w:name="สรปทายบท"/>
     <w:p>
       <w:pPr>
         <w:pStyle w:val="Heading2"/>
@@ -4026,8 +4405,8 @@
         <w:t xml:space="preserve">พร้อมรายการวัสดุ ขั้นตอนการดำเนินงาน 6 ระยะ สรุปโครงสร้างควบคุมที่ port จากแบบจำลอง และแผนทางเลือกประสิทธิภาพสูงสำหรับงานต่อยอด รายละเอียดการออกแบบฮาร์ดแวร์เชิงลึกและระบบป้องกันนำเสนอในบทที่ 5 และผลการทดสอบจริงเทียบแบบจำลองในบทที่ 6</w:t>
       </w:r>
     </w:p>
-    <w:bookmarkEnd w:id="23"/>
     <w:bookmarkEnd w:id="24"/>
+    <w:bookmarkEnd w:id="25"/>
     <w:sectPr>
       <w:footnotePr>
         <w:numRestart w:val="eachSect"/>

</xml_diff>